<commit_message>
Memoria: vista frontal, validaciones manuales y análisis completo de Aaron
Resumen, resultados, discusión, conclusiones y anexos al día con el código
actual; figuras del nadador sintético regeneradas; la clasificación de estilo
queda descrita como no implementada.

Co-Authored-By: Claude Opus 5.5 <noreply@anthropic.com>
Claude-Session: https://claude.ai/code/session_01DiSvbFm8ugCvoNLrXeNJkq
</commit_message>
<xml_diff>
--- a/memoria/TFM_StrokeLab_borrador.docx
+++ b/memoria/TFM_StrokeLab_borrador.docx
@@ -600,7 +600,7 @@
         <w:jc w:val="both"/>
       </w:pPr>
       <w:r>
-        <w:t>StrokeLab es un sistema que, a partir de un vídeo convencional de nado, responde a tres preguntas del entrenador: qué tan eficiente es la brazada, en qué momento aparece la fatiga técnica y por qué. El sistema se organiza en dos verticales de inteligencia artificial. La vertical de visión estima la pose 2D del nadador (17 articulaciones) con YOLOv8n-Pose en la CPU de un portátil, elegido tras una comparativa con otras variantes de YOLO, MoveNet y MediaPipe, y la eleva a 3D con MotionBERT para las vistas no laterales. La vertical tabular cuenta las brazadas, calcula por ciclo indicadores de eficiencia y medidas de codos, hombros, caderas, rodillas y pies, y modela con Isolation Forest el estado fresco del propio nadador. La desviación sostenida respecto a ese estado marca el inicio de la fatiga y SHAP la explica variable a variable en un lenguaje que el entrenador entiende. El modelo hidrodinámico se presenta como conocimiento previo del dominio, no como componente de IA. Con un nadador sintético, el sistema localiza la fatiga introducida y SHAP señala las variables alteradas. Con vídeo real de un nadador de crol, la frecuencia de ciclo estimada difiere un 6,5 % de la cuenta manual y el sistema funciona por completo en CPU. La determinación del momento de fatiga en vídeo real requiere grabaciones más largas, que se analizan en la fase final del trabajo.</w:t>
+        <w:t>StrokeLab es un sistema que, a partir de un vídeo convencional de nado, responde a tres preguntas del entrenador: qué tan eficiente es la brazada, en qué momento aparece la fatiga técnica y por qué. Se organiza en dos verticales de inteligencia artificial. La vertical de visión estima la pose 2D del nadador con YOLOv8n-Pose en la CPU de un portátil, elegido tras una comparativa con otros modelos, y la eleva a 3D con MotionBERT. La vertical tabular cuenta las brazadas, con una señal propia para la vista lateral y otra para la frontal, calcula por ciclo medidas de codos, hombros, caderas, rodillas y pies, y modela con Isolation Forest el estado fresco del propio nadador. La desviación sostenida respecto a ese estado marca el inicio de la fatiga y SHAP la explica variable a variable. El modelo hidrodinámico se presenta como conocimiento previo, no como IA. Con un nadador sintético, el sistema localiza la fatiga introducida y SHAP señala las variables alteradas. Con vídeo real de un nadador de crol, la frecuencia de ciclo se aleja entre un 6,5 % y un 8,2 % de la cuenta manual en tres clips, en vista lateral y frontal. En los cinco clips disponibles de ese nadador no se detecta fatiga, un resultado coherente con pasadas cortas; localizarla en vídeo real exige grabar nado continuo.</w:t>
       </w:r>
     </w:p>
     <w:p>
@@ -645,7 +645,7 @@
         <w:jc w:val="both"/>
       </w:pPr>
       <w:r>
-        <w:t>StrokeLab is a system that, from an ordinary swimming video, answers three coaching questions: how efficient the stroke is, when technical fatigue begins, and why. It is organised in two artificial intelligence verticals. The vision vertical estimates the swimmer’s 2D pose (17 joints) with YOLOv8n-Pose on a laptop CPU, chosen after a comparison with other YOLO variants, MoveNet and MediaPipe, and lifts it to 3D with MotionBERT for non-lateral views. The tabular vertical counts strokes, computes per-cycle efficiency indicators and elbow, shoulder, hip, knee and foot measures, and models the swimmer’s own fresh state with an Isolation Forest. A sustained deviation from that state marks the onset of fatigue, and SHAP explains it feature by feature in terms a coach can act on. The hydrodynamic model is presented as domain knowledge, not as an AI component. On a synthetic swimmer the system locates the injected fatigue and SHAP points to the altered variables. On real video of a front-crawl swimmer, the estimated stroke rate is within 6.5 % of a manual count and the whole pipeline runs on a CPU. Locating fatigue in real video requires longer recordings, which are analysed in the final phase of the project.</w:t>
+        <w:t>StrokeLab is a system that, from an ordinary swimming video, answers three coaching questions: how efficient the stroke is, when technical fatigue begins, and why. It is organised in two artificial intelligence verticals. The vision vertical estimates the swimmer’s 2D pose with YOLOv8n-Pose on a laptop CPU, chosen after comparing several models, and lifts it to 3D with MotionBERT. The tabular vertical counts strokes, with one signal for side views and another for front views, computes per-cycle elbow, shoulder, hip, knee and foot measures, and models the swimmer’s own fresh state with an Isolation Forest. A sustained deviation from that state marks the onset of fatigue, and SHAP explains it feature by feature. The hydrodynamic model is presented as domain knowledge, not as AI. On a synthetic swimmer the system locates the injected fatigue and SHAP points to the altered variables. On real video of a front-crawl swimmer, the stroke rate is within 6.5 % to 8.2 % of a manual count in three clips, in side and front views. No fatigue is detected in the five available clips of that swimmer, which is consistent with short passes; locating it in real video requires continuous swimming.</w:t>
       </w:r>
     </w:p>
     <w:p>
@@ -4153,13 +4153,22 @@
       </w:pPr>
       <w:pPr/>
       <w:r>
-        <w:t>Sistema completo y ejecutable en la CPU de un portátil con un único programa (</w:t>
+        <w:t>Sistema completo ejecutable en la CPU de un portátil, para un vídeo (</w:t>
       </w:r>
       <w:r>
         <w:rPr>
           <w:rFonts w:ascii="Consolas" w:hAnsi="Consolas"/>
         </w:rPr>
         <w:t>analizar.py</w:t>
+      </w:r>
+      <w:r>
+        <w:t>) o una carpeta entera (</w:t>
+      </w:r>
+      <w:r>
+        <w:rPr>
+          <w:rFonts w:ascii="Consolas" w:hAnsi="Consolas"/>
+        </w:rPr>
+        <w:t>lote.py</w:t>
       </w:r>
       <w:r>
         <w:t>), con pruebas automáticas.</w:t>
@@ -4190,7 +4199,7 @@
       </w:pPr>
       <w:pPr/>
       <w:r>
-        <w:t>Conteo de brazadas validado frente a una cuenta manual: 50,5 frente a 54 ciclos/min (error del 6,5 %).</w:t>
+        <w:t>Conteo de brazadas en vista lateral y frontal, validado con la cuenta manual en tres clips reales: error del 6,5 %, 7,6 % y 8,2 %.</w:t>
       </w:r>
     </w:p>
     <w:p>
@@ -4204,7 +4213,7 @@
       </w:pPr>
       <w:pPr/>
       <w:r>
-        <w:t>Detección de la fatiga y explicación SHAP validadas con un nadador sintético: la fatiga se localiza en la transición introducida y SHAP señala las variables alteradas.</w:t>
+        <w:t>Detección de la fatiga y explicación SHAP validadas con un nadador sintético, de lado y de frente.</w:t>
       </w:r>
     </w:p>
     <w:p>
@@ -4218,7 +4227,7 @@
       </w:pPr>
       <w:pPr/>
       <w:r>
-        <w:t>Validación del 3D (MotionBERT) frente al 2D: fiable en codo y cadera, no en la rodilla de un nadador horizontal.</w:t>
+        <w:t>Análisis completo de un nadador real (Aaron, crol, 5 clips): medidas por ciclo y ausencia de fatiga en pasadas cortas.</w:t>
       </w:r>
     </w:p>
     <w:p>
@@ -4232,7 +4241,7 @@
       </w:pPr>
       <w:pPr/>
       <w:r>
-        <w:t>Vídeo anotado para el entrenador centrado en el estado de fatiga.</w:t>
+        <w:t>Validación del 3D (MotionBERT) frente al 2D: fiable en codo y cadera, no en la rodilla de un nadador horizontal.</w:t>
       </w:r>
     </w:p>
     <w:p>
@@ -4246,11 +4255,25 @@
       </w:pPr>
       <w:pPr/>
       <w:r>
+        <w:t>Vídeo anotado para el entrenador centrado en el estado de fatiga.</w:t>
+      </w:r>
+    </w:p>
+    <w:p>
+      <w:pPr>
+        <w:pStyle w:val="Prrafodelista"/>
+        <w:numPr>
+          <w:ilvl w:val="0"/>
+          <w:numId w:val="27"/>
+        </w:numPr>
+        <w:spacing w:before="0" w:after="0"/>
+      </w:pPr>
+      <w:pPr/>
+      <w:r>
         <w:rPr>
           <w:b/>
           <w:color w:val="C00000"/>
         </w:rPr>
-        <w:t>[PENDIENTE: resultado de fatiga en vídeo real largo (GX010664 y nuevos vídeos) y extensión a los 8 nadadores.]</w:t>
+        <w:t>[PENDIENTE: fatiga en un vídeo de nado continuo y extensión a los 8 nadadores.]</w:t>
       </w:r>
     </w:p>
     <w:p>
@@ -5383,7 +5406,7 @@
               <w:rPr>
                 <w:sz w:val="18"/>
               </w:rPr>
-              <w:t>Fatiga por ciclo con Isolation Forest y SHAP, comparativa en CPU, paso a ejecución local, validación con Aaron</w:t>
+              <w:t>Fatiga por ciclo con Isolation Forest y SHAP, comparativa en CPU, paso a ejecución local, vista frontal, análisis por lotes, validación con Aaron</w:t>
             </w:r>
           </w:p>
         </w:tc>
@@ -6407,7 +6430,7 @@
         <w:t>profundidad de la mano más profunda</w:t>
       </w:r>
       <w:r>
-        <w:t xml:space="preserve"> respecto al eje del cuerpo, en 2D y en longitudes de tronco (Figura 2). Esta elección surgió del vídeo real: en vista lateral, el modelo copia el brazo visible en el oculto, así que no se puede confiar en distinguir el brazo izquierdo del derecho. El ritmo típico es la mediana de los intervalos entre brazadas dentro del rango fisiológico (0,35-1,0 s). Un ciclo son dos brazadas; si se pierde una, el intervalo doble se reconoce y se cuenta.</w:t>
+        <w:t xml:space="preserve"> respecto al eje del cuerpo, en 2D y en longitudes de tronco (Figura 2). Esta elección surgió del vídeo real: en vista lateral, el modelo copia el brazo visible en el oculto, así que no se puede confiar en distinguir el brazo izquierdo del derecho. El ritmo típico es la mediana de los intervalos entre brazadas dentro del rango fisiológico (0,35-1,0 s en crol). Un ciclo son dos brazadas; si se pierde una, el intervalo doble se reconoce y se cuenta.</w:t>
       </w:r>
     </w:p>
     <w:p>
@@ -6482,10 +6505,39 @@
     </w:p>
     <w:p>
       <w:pPr>
-        <w:pStyle w:val="Ttulo3"/>
-      </w:pPr>
-      <w:r>
-        <w:t>Vertical tabular: variables por ciclo</w:t>
+        <w:jc w:val="both"/>
+      </w:pPr>
+      <w:r>
+        <w:rPr>
+          <w:b/>
+        </w:rPr>
+        <w:t>Vista frontal.</w:t>
+      </w:r>
+      <w:r>
+        <w:t xml:space="preserve"> Cuando el nadador viene hacia la cámara o se le graba desde el borde, la profundidad de la mano respecto al cuerpo no se ve. En esa vista (</w:t>
+      </w:r>
+      <w:r>
+        <w:rPr>
+          <w:rFonts w:ascii="Consolas" w:hAnsi="Consolas"/>
+        </w:rPr>
+        <w:t>--vista frontal</w:t>
+      </w:r>
+      <w:r>
+        <w:t>) la señal es el recorrido de cada muñeca respecto al centro de los hombros, en la dirección en que más se mueve (componente principal, con cada brazo centrado) y dividido por el ancho de hombros, que de frente es más estable que el tronco. De frente sí se distinguen los dos brazos, así que la asimetría es más fiable que de lado. En esta vista no se calculan la inclinación del tronco ni la velocidad, y los ángulos se toman del 3D.</w:t>
+      </w:r>
+    </w:p>
+    <w:p>
+      <w:pPr>
+        <w:jc w:val="both"/>
+      </w:pPr>
+      <w:r>
+        <w:rPr>
+          <w:b/>
+        </w:rPr>
+        <w:t>Estilo.</w:t>
+      </w:r>
+      <w:r>
+        <w:t xml:space="preserve"> El estilo fija cuántas brazadas forman un ciclo y el ritmo plausible (Tabla 4).</w:t>
       </w:r>
     </w:p>
     <w:p>
@@ -6515,7 +6567,7 @@
         <w:t xml:space="preserve">. </w:t>
       </w:r>
       <w:r>
-        <w:t>Variables calculadas por ciclo de brazada.</w:t>
+        <w:t>Definición del ciclo según el estilo. Validado con vídeo real solo en crol; el resto, con datos sintéticos.</w:t>
       </w:r>
     </w:p>
     <w:tbl>
@@ -6532,6 +6584,317 @@
       <w:tr>
         <w:tc>
           <w:tcPr>
+            <w:tcW w:type="dxa" w:w="2268"/>
+            <w:shd w:val="clear" w:color="auto" w:fill="D9E2F3"/>
+          </w:tcPr>
+          <w:p>
+            <w:pPr>
+              <w:spacing w:before="20" w:after="20"/>
+            </w:pPr>
+            <w:r>
+              <w:rPr>
+                <w:b/>
+                <w:sz w:val="18"/>
+              </w:rPr>
+              <w:t>Estilo</w:t>
+            </w:r>
+          </w:p>
+        </w:tc>
+        <w:tc>
+          <w:tcPr>
+            <w:tcW w:type="dxa" w:w="2835"/>
+            <w:shd w:val="clear" w:color="auto" w:fill="D9E2F3"/>
+          </w:tcPr>
+          <w:p>
+            <w:pPr>
+              <w:spacing w:before="20" w:after="20"/>
+            </w:pPr>
+            <w:r>
+              <w:rPr>
+                <w:b/>
+                <w:sz w:val="18"/>
+              </w:rPr>
+              <w:t>Brazadas por ciclo</w:t>
+            </w:r>
+          </w:p>
+        </w:tc>
+        <w:tc>
+          <w:tcPr>
+            <w:tcW w:type="dxa" w:w="2835"/>
+            <w:shd w:val="clear" w:color="auto" w:fill="D9E2F3"/>
+          </w:tcPr>
+          <w:p>
+            <w:pPr>
+              <w:spacing w:before="20" w:after="20"/>
+            </w:pPr>
+            <w:r>
+              <w:rPr>
+                <w:b/>
+                <w:sz w:val="18"/>
+              </w:rPr>
+              <w:t>Tiempo entre brazadas</w:t>
+            </w:r>
+          </w:p>
+        </w:tc>
+      </w:tr>
+      <w:tr>
+        <w:tc>
+          <w:tcPr>
+            <w:tcW w:type="dxa" w:w="2268"/>
+          </w:tcPr>
+          <w:p>
+            <w:pPr>
+              <w:spacing w:before="20" w:after="20"/>
+            </w:pPr>
+            <w:r>
+              <w:rPr>
+                <w:sz w:val="18"/>
+              </w:rPr>
+              <w:t>Crol</w:t>
+            </w:r>
+          </w:p>
+        </w:tc>
+        <w:tc>
+          <w:tcPr>
+            <w:tcW w:type="dxa" w:w="2835"/>
+          </w:tcPr>
+          <w:p>
+            <w:pPr>
+              <w:spacing w:before="20" w:after="20"/>
+            </w:pPr>
+            <w:r>
+              <w:rPr>
+                <w:sz w:val="18"/>
+              </w:rPr>
+              <w:t>2 (brazos alternos)</w:t>
+            </w:r>
+          </w:p>
+        </w:tc>
+        <w:tc>
+          <w:tcPr>
+            <w:tcW w:type="dxa" w:w="2835"/>
+          </w:tcPr>
+          <w:p>
+            <w:pPr>
+              <w:spacing w:before="20" w:after="20"/>
+            </w:pPr>
+            <w:r>
+              <w:rPr>
+                <w:sz w:val="18"/>
+              </w:rPr>
+              <w:t>0,35-1,0 s</w:t>
+            </w:r>
+          </w:p>
+        </w:tc>
+      </w:tr>
+      <w:tr>
+        <w:tc>
+          <w:tcPr>
+            <w:tcW w:type="dxa" w:w="2268"/>
+          </w:tcPr>
+          <w:p>
+            <w:pPr>
+              <w:spacing w:before="20" w:after="20"/>
+            </w:pPr>
+            <w:r>
+              <w:rPr>
+                <w:sz w:val="18"/>
+              </w:rPr>
+              <w:t>Espalda</w:t>
+            </w:r>
+          </w:p>
+        </w:tc>
+        <w:tc>
+          <w:tcPr>
+            <w:tcW w:type="dxa" w:w="2835"/>
+          </w:tcPr>
+          <w:p>
+            <w:pPr>
+              <w:spacing w:before="20" w:after="20"/>
+            </w:pPr>
+            <w:r>
+              <w:rPr>
+                <w:sz w:val="18"/>
+              </w:rPr>
+              <w:t>2 (brazos alternos)</w:t>
+            </w:r>
+          </w:p>
+        </w:tc>
+        <w:tc>
+          <w:tcPr>
+            <w:tcW w:type="dxa" w:w="2835"/>
+          </w:tcPr>
+          <w:p>
+            <w:pPr>
+              <w:spacing w:before="20" w:after="20"/>
+            </w:pPr>
+            <w:r>
+              <w:rPr>
+                <w:sz w:val="18"/>
+              </w:rPr>
+              <w:t>0,35-1,2 s</w:t>
+            </w:r>
+          </w:p>
+        </w:tc>
+      </w:tr>
+      <w:tr>
+        <w:tc>
+          <w:tcPr>
+            <w:tcW w:type="dxa" w:w="2268"/>
+          </w:tcPr>
+          <w:p>
+            <w:pPr>
+              <w:spacing w:before="20" w:after="20"/>
+            </w:pPr>
+            <w:r>
+              <w:rPr>
+                <w:sz w:val="18"/>
+              </w:rPr>
+              <w:t>Mariposa</w:t>
+            </w:r>
+          </w:p>
+        </w:tc>
+        <w:tc>
+          <w:tcPr>
+            <w:tcW w:type="dxa" w:w="2835"/>
+          </w:tcPr>
+          <w:p>
+            <w:pPr>
+              <w:spacing w:before="20" w:after="20"/>
+            </w:pPr>
+            <w:r>
+              <w:rPr>
+                <w:sz w:val="18"/>
+              </w:rPr>
+              <w:t>1 (brazos a la vez)</w:t>
+            </w:r>
+          </w:p>
+        </w:tc>
+        <w:tc>
+          <w:tcPr>
+            <w:tcW w:type="dxa" w:w="2835"/>
+          </w:tcPr>
+          <w:p>
+            <w:pPr>
+              <w:spacing w:before="20" w:after="20"/>
+            </w:pPr>
+            <w:r>
+              <w:rPr>
+                <w:sz w:val="18"/>
+              </w:rPr>
+              <w:t>0,7-2,0 s</w:t>
+            </w:r>
+          </w:p>
+        </w:tc>
+      </w:tr>
+      <w:tr>
+        <w:tc>
+          <w:tcPr>
+            <w:tcW w:type="dxa" w:w="2268"/>
+          </w:tcPr>
+          <w:p>
+            <w:pPr>
+              <w:spacing w:before="20" w:after="20"/>
+            </w:pPr>
+            <w:r>
+              <w:rPr>
+                <w:sz w:val="18"/>
+              </w:rPr>
+              <w:t>Braza</w:t>
+            </w:r>
+          </w:p>
+        </w:tc>
+        <w:tc>
+          <w:tcPr>
+            <w:tcW w:type="dxa" w:w="2835"/>
+          </w:tcPr>
+          <w:p>
+            <w:pPr>
+              <w:spacing w:before="20" w:after="20"/>
+            </w:pPr>
+            <w:r>
+              <w:rPr>
+                <w:sz w:val="18"/>
+              </w:rPr>
+              <w:t>1 (brazos a la vez)</w:t>
+            </w:r>
+          </w:p>
+        </w:tc>
+        <w:tc>
+          <w:tcPr>
+            <w:tcW w:type="dxa" w:w="2835"/>
+          </w:tcPr>
+          <w:p>
+            <w:pPr>
+              <w:spacing w:before="20" w:after="20"/>
+            </w:pPr>
+            <w:r>
+              <w:rPr>
+                <w:sz w:val="18"/>
+              </w:rPr>
+              <w:t>0,7-2,4 s</w:t>
+            </w:r>
+          </w:p>
+        </w:tc>
+      </w:tr>
+    </w:tbl>
+    <w:p>
+      <w:pPr>
+        <w:jc w:val="both"/>
+      </w:pPr>
+    </w:p>
+    <w:p>
+      <w:pPr>
+        <w:pStyle w:val="Ttulo3"/>
+      </w:pPr>
+      <w:r>
+        <w:t>Vertical tabular: variables por ciclo</w:t>
+      </w:r>
+    </w:p>
+    <w:p>
+      <w:pPr>
+        <w:pStyle w:val="Caption"/>
+        <w:jc w:val="center"/>
+      </w:pPr>
+      <w:r>
+        <w:t xml:space="preserve">Tabla </w:t>
+      </w:r>
+      <w:r>
+        <w:fldChar w:fldCharType="begin"/>
+      </w:r>
+      <w:r>
+        <w:instrText xml:space="preserve"> SEQ Tabla \* ARABIC </w:instrText>
+      </w:r>
+      <w:r>
+        <w:fldChar w:fldCharType="separate"/>
+      </w:r>
+      <w:r>
+        <w:t>1</w:t>
+      </w:r>
+      <w:r>
+        <w:fldChar w:fldCharType="end"/>
+      </w:r>
+      <w:r>
+        <w:t xml:space="preserve">. </w:t>
+      </w:r>
+      <w:r>
+        <w:t>Variables calculadas por ciclo de brazada.</w:t>
+      </w:r>
+    </w:p>
+    <w:tbl>
+      <w:tblPr>
+        <w:tblStyle w:val="Tablaconcuadrcula"/>
+        <w:tblW w:type="auto" w:w="0"/>
+        <w:tblLook w:firstColumn="1" w:firstRow="1" w:lastColumn="0" w:lastRow="0" w:noHBand="0" w:noVBand="1" w:val="04A0"/>
+      </w:tblPr>
+      <w:tblGrid>
+        <w:gridCol w:w="2835"/>
+        <w:gridCol w:w="2835"/>
+        <w:gridCol w:w="2835"/>
+      </w:tblGrid>
+      <w:tr>
+        <w:tc>
+          <w:tcPr>
             <w:tcW w:type="dxa" w:w="2721"/>
             <w:shd w:val="clear" w:color="auto" w:fill="D9E2F3"/>
           </w:tcPr>
@@ -6714,7 +7077,7 @@
               <w:rPr>
                 <w:sz w:val="18"/>
               </w:rPr>
-              <w:t>Ángulo mínimo hombro-codo-muñeca</w:t>
+              <w:t>Percentil 10 del ángulo hombro-codo-muñeca</w:t>
             </w:r>
           </w:p>
         </w:tc>
@@ -6764,7 +7127,7 @@
               <w:rPr>
                 <w:sz w:val="18"/>
               </w:rPr>
-              <w:t>Ángulo máximo codo-hombro-cadera</w:t>
+              <w:t>Percentil 90 del ángulo codo-hombro-cadera</w:t>
             </w:r>
           </w:p>
         </w:tc>
@@ -6864,7 +7227,7 @@
               <w:rPr>
                 <w:sz w:val="18"/>
               </w:rPr>
-              <w:t>Ángulo mínimo cadera-rodilla-tobillo</w:t>
+              <w:t>Percentil 10 del ángulo cadera-rodilla-tobillo</w:t>
             </w:r>
           </w:p>
         </w:tc>
@@ -7096,7 +7459,7 @@
         <w:jc w:val="both"/>
       </w:pPr>
       <w:r>
-        <w:t>Los ángulos y las distancias relativas al tronco no necesitan calibración. La velocidad, la DPS y el SI solo se calculan si la cámara es fija y se conoce la anchura en metros del encuadre (</w:t>
+        <w:t>Los mínimos y máximos de cada ciclo se toman como percentiles 10 y 90: con el mínimo puro, un solo fotograma mal detectado fijaba el valor del ciclo (en GX011614 daba rodillas de 12°). Los ángulos y las distancias relativas al tronco no necesitan calibración. La velocidad, la DPS y el SI solo se calculan si la cámara es fija y se conoce la anchura en metros del encuadre (</w:t>
       </w:r>
       <w:r>
         <w:rPr>
@@ -7229,7 +7592,7 @@
         <w:pStyle w:val="Ttulo3"/>
       </w:pPr>
       <w:r>
-        <w:t>Análisis por sesión, clasificación del estilo y vídeo anotado</w:t>
+        <w:t>Análisis por sesión, por lotes y vídeo anotado</w:t>
       </w:r>
     </w:p>
     <w:p>
@@ -7246,16 +7609,49 @@
         <w:t>sesion.py</w:t>
       </w:r>
       <w:r>
-        <w:t xml:space="preserve"> une los ciclos de varias pasadas de un mismo nadador en orden de grabación y aplica el mismo modelo; indica en qué pasada y en qué segundo del clip aparece la fatiga. El estilo se clasifica con XGBoost (Chen y Guestrin, 2016) sobre las variables por ciclo, con validación GroupKFold por vídeo: el 99,99 % de precisión de una versión anterior se debía a fuga de datos entre fotogramas de un mismo vídeo. El vídeo anotado (Figura 3) muestra el estado FRESCO o FATIGA, el ciclo, la frecuencia y una barra temporal con la anomalía de cada ciclo, el umbral y el inicio de la fatiga. Los ángulos quedan en las tablas (</w:t>
+        <w:t xml:space="preserve"> une los ciclos de varias pasadas de un mismo nadador en orden de grabación y aplica el mismo modelo; indica en qué pasada y en qué segundo del clip aparece la fatiga. </w:t>
       </w:r>
       <w:r>
         <w:rPr>
           <w:rFonts w:ascii="Consolas" w:hAnsi="Consolas"/>
         </w:rPr>
+        <w:t>lote.py</w:t>
+      </w:r>
+      <w:r>
+        <w:t xml:space="preserve"> analiza todos los vídeos de una carpeta a partir de una lista editable (nadador, estilo, vista y sesión), une las sesiones y se puede interrumpir y reanudar; cada resultado guarda la versión del análisis y se rehace si el código cambia. </w:t>
+      </w:r>
+      <w:r>
+        <w:rPr>
+          <w:rFonts w:ascii="Consolas" w:hAnsi="Consolas"/>
+        </w:rPr>
+        <w:t>informe_nadador.py</w:t>
+      </w:r>
+      <w:r>
+        <w:t xml:space="preserve"> resume un nadador y un estilo: tiempo analizable y ciclos por clip y medidas por ciclo. El vídeo anotado (Figura 3) muestra el estado FRESCO o FATIGA, el ciclo, la frecuencia y una barra temporal con la anomalía de cada ciclo, el umbral y el inicio de la fatiga. Los ángulos quedan en las tablas (</w:t>
+      </w:r>
+      <w:r>
+        <w:rPr>
+          <w:rFonts w:ascii="Consolas" w:hAnsi="Consolas"/>
+        </w:rPr>
         <w:t>--panel completo</w:t>
       </w:r>
       <w:r>
         <w:t xml:space="preserve"> los muestra en el vídeo).</w:t>
+      </w:r>
+    </w:p>
+    <w:p>
+      <w:pPr>
+        <w:jc w:val="both"/>
+      </w:pPr>
+      <w:r>
+        <w:t xml:space="preserve">La clasificación del estilo con XGBoost (Chen y Guestrin, 2016) y validación GroupKFold por vídeo queda planteada pero no implementada en la versión local: el 99,99 % de precisión de una versión anterior se debía a fuga de datos entre fotogramas de un mismo vídeo, y con los vídeos disponibles hay muy pocos por estilo. </w:t>
+      </w:r>
+      <w:r>
+        <w:rPr>
+          <w:b/>
+          <w:color w:val="C00000"/>
+        </w:rPr>
+        <w:t>[PENDIENTE: implementar y evaluar si da tiempo.]</w:t>
       </w:r>
     </w:p>
     <w:p>
@@ -7325,7 +7721,7 @@
         <w:t xml:space="preserve">. </w:t>
       </w:r>
       <w:r>
-        <w:t>Panel del vídeo anotado (nadador sintético, t = 70 s).</w:t>
+        <w:t>Panel del vídeo anotado (nadador sintético, t = 70 s; la fatiga empieza en 51,9 s).</w:t>
       </w:r>
     </w:p>
     <w:p>
@@ -7333,7 +7729,7 @@
         <w:jc w:val="both"/>
       </w:pPr>
       <w:r>
-        <w:t>Herramientas: Python 3, Ultralytics (YOLO), PyTorch (MotionBERT), OpenCV, NumPy, pandas, scikit-learn, shap, XGBoost, Matplotlib y Git. El código incluye pruebas automáticas que se ejecutan antes de cada cambio (Anexo C).</w:t>
+        <w:t>Herramientas: Python 3, Ultralytics (YOLO), PyTorch (MotionBERT), OpenCV, NumPy, pandas, scikit-learn, shap, Matplotlib y Git. El código incluye pruebas automáticas que se ejecutan antes de cada cambio (Anexo C).</w:t>
       </w:r>
     </w:p>
     <w:p>
@@ -7998,10 +8394,10 @@
         <w:rPr>
           <w:b/>
         </w:rPr>
-        <w:t>inicio de la fatiga en el ciclo 40 (t = 58,0 s)</w:t>
-      </w:r>
-      <w:r>
-        <w:t>, dentro de la transición introducida; PELT sitúa el cambio en el ciclo 33 (t = 49,4 s), al principio de la subida; la correlación de comprobación del signo de SHAP es 0,999 (Figuras 4 a 6).</w:t>
+        <w:t>inicio de la fatiga en el ciclo 35 (t = 51,9 s)</w:t>
+      </w:r>
+      <w:r>
+        <w:t>, dentro de la transición introducida; PELT sitúa el cambio en el ciclo 33 (t = 49,4 s); la correlación de comprobación del signo de SHAP es 0,999 (Figuras 4 a 6).</w:t>
       </w:r>
     </w:p>
     <w:p>
@@ -8079,7 +8475,7 @@
         <w:jc w:val="both"/>
       </w:pPr>
       <w:r>
-        <w:t>SHAP identifica como causas las variables que se alteraron: flexión del codo izquierdo (80° → 39°), alcance del brazo derecho (1,78 → 0,99 troncos) y asimetría de brazos (2 % → 24 %).</w:t>
+        <w:t>SHAP identifica como causas variables que se alteraron: alcance del brazo derecho (1,78 → 1,05 troncos), asimetría de brazos (2 % → 23 %) y amplitud de patada (0,31 → 0,21 troncos).</w:t>
       </w:r>
     </w:p>
     <w:p>
@@ -8160,7 +8556,7 @@
       <w:r>
         <w:drawing>
           <wp:inline xmlns:a="http://schemas.openxmlformats.org/drawingml/2006/main" xmlns:pic="http://schemas.openxmlformats.org/drawingml/2006/picture">
-            <wp:extent cx="4320000" cy="3321477"/>
+            <wp:extent cx="4320000" cy="3308201"/>
             <wp:docPr id="8" name="Picture 8"/>
             <wp:cNvGraphicFramePr>
               <a:graphicFrameLocks noChangeAspect="1"/>
@@ -8181,7 +8577,7 @@
                   <pic:spPr>
                     <a:xfrm>
                       <a:off x="0" y="0"/>
-                      <a:ext cx="4320000" cy="3321477"/>
+                      <a:ext cx="4320000" cy="3308201"/>
                     </a:xfrm>
                     <a:prstGeom prst="rect"/>
                   </pic:spPr>
@@ -8219,7 +8615,24 @@
         <w:t xml:space="preserve">. </w:t>
       </w:r>
       <w:r>
-        <w:t>SHAP local: por qué el ciclo 40 ya es fatiga.</w:t>
+        <w:t>SHAP local: por qué el ciclo 35 ya es fatiga.</w:t>
+      </w:r>
+    </w:p>
+    <w:p>
+      <w:pPr>
+        <w:jc w:val="both"/>
+      </w:pPr>
+      <w:r>
+        <w:t>Con un nadador sintético visto de frente (</w:t>
+      </w:r>
+      <w:r>
+        <w:rPr>
+          <w:rFonts w:ascii="Consolas" w:hAnsi="Consolas"/>
+        </w:rPr>
+        <w:t>tests/test_frontal.py</w:t>
+      </w:r>
+      <w:r>
+        <w:t>), la frecuencia estimada es 48,9 ciclos/min (valor real ≈ 50), el inicio de la fatiga se sitúa en t = 47,5 s y SHAP señala el alcance del brazo, la frecuencia y la asimetría, que son las variables alteradas.</w:t>
       </w:r>
     </w:p>
     <w:p>
@@ -8227,7 +8640,24 @@
         <w:pStyle w:val="Ttulo3"/>
       </w:pPr>
       <w:r>
-        <w:t>Vídeo real: Aaron, crol (GX011614)</w:t>
+        <w:t>Vídeo real: análisis completo de Aaron en crol</w:t>
+      </w:r>
+    </w:p>
+    <w:p>
+      <w:pPr>
+        <w:jc w:val="both"/>
+      </w:pPr>
+      <w:r>
+        <w:t xml:space="preserve">Se analizaron con </w:t>
+      </w:r>
+      <w:r>
+        <w:rPr>
+          <w:rFonts w:ascii="Consolas" w:hAnsi="Consolas"/>
+        </w:rPr>
+        <w:t>lote.py</w:t>
+      </w:r>
+      <w:r>
+        <w:t xml:space="preserve"> los cinco clips de Aaron en crol: tres de GoPro bajo el agua en vista lateral (5120 × 2880, 30 fps) y dos de móvil en vista frontal (1080 × 1920, 60 fps). La vista frontal se identificó en los datos: en los clips de móvil el tronco aparece casi vertical en la imagen (78-102°) y mide 60-100 píxeles, frente a 8-10° en la GoPro, donde Aaron cruza la imagen de lado a lado (Tabla 6 y Figura 7).</w:t>
       </w:r>
     </w:p>
     <w:p>
@@ -8257,7 +8687,7 @@
         <w:t xml:space="preserve">. </w:t>
       </w:r>
       <w:r>
-        <w:t>Ejecución con vídeo real de Aaron.</w:t>
+        <w:t>Clips de Aaron en crol: tiempo analizable y ciclos válidos.</w:t>
       </w:r>
     </w:p>
     <w:tbl>
@@ -8267,13 +8697,17 @@
         <w:tblLook w:firstColumn="1" w:firstRow="1" w:lastColumn="0" w:lastRow="0" w:noHBand="0" w:noVBand="1" w:val="04A0"/>
       </w:tblPr>
       <w:tblGrid>
-        <w:gridCol w:w="4252"/>
-        <w:gridCol w:w="4252"/>
+        <w:gridCol w:w="1417"/>
+        <w:gridCol w:w="1417"/>
+        <w:gridCol w:w="1417"/>
+        <w:gridCol w:w="1417"/>
+        <w:gridCol w:w="1417"/>
+        <w:gridCol w:w="1417"/>
       </w:tblGrid>
       <w:tr>
         <w:tc>
           <w:tcPr>
-            <w:tcW w:type="dxa" w:w="3402"/>
+            <w:tcW w:type="dxa" w:w="1587"/>
             <w:shd w:val="clear" w:color="auto" w:fill="D9E2F3"/>
           </w:tcPr>
           <w:p>
@@ -8285,13 +8719,13 @@
                 <w:b/>
                 <w:sz w:val="18"/>
               </w:rPr>
-              <w:t>Parámetro</w:t>
-            </w:r>
-          </w:p>
-        </w:tc>
-        <w:tc>
-          <w:tcPr>
-            <w:tcW w:type="dxa" w:w="5669"/>
+              <w:t>Clip</w:t>
+            </w:r>
+          </w:p>
+        </w:tc>
+        <w:tc>
+          <w:tcPr>
+            <w:tcW w:type="dxa" w:w="1247"/>
             <w:shd w:val="clear" w:color="auto" w:fill="D9E2F3"/>
           </w:tcPr>
           <w:p>
@@ -8303,7 +8737,79 @@
                 <w:b/>
                 <w:sz w:val="18"/>
               </w:rPr>
-              <w:t>Valor</w:t>
+              <w:t>Vista</w:t>
+            </w:r>
+          </w:p>
+        </w:tc>
+        <w:tc>
+          <w:tcPr>
+            <w:tcW w:type="dxa" w:w="1361"/>
+            <w:shd w:val="clear" w:color="auto" w:fill="D9E2F3"/>
+          </w:tcPr>
+          <w:p>
+            <w:pPr>
+              <w:spacing w:before="20" w:after="20"/>
+            </w:pPr>
+            <w:r>
+              <w:rPr>
+                <w:b/>
+                <w:sz w:val="18"/>
+              </w:rPr>
+              <w:t>Duración</w:t>
+            </w:r>
+          </w:p>
+        </w:tc>
+        <w:tc>
+          <w:tcPr>
+            <w:tcW w:type="dxa" w:w="1814"/>
+            <w:shd w:val="clear" w:color="auto" w:fill="D9E2F3"/>
+          </w:tcPr>
+          <w:p>
+            <w:pPr>
+              <w:spacing w:before="20" w:after="20"/>
+            </w:pPr>
+            <w:r>
+              <w:rPr>
+                <w:b/>
+                <w:sz w:val="18"/>
+              </w:rPr>
+              <w:t>Analizable</w:t>
+            </w:r>
+          </w:p>
+        </w:tc>
+        <w:tc>
+          <w:tcPr>
+            <w:tcW w:type="dxa" w:w="1134"/>
+            <w:shd w:val="clear" w:color="auto" w:fill="D9E2F3"/>
+          </w:tcPr>
+          <w:p>
+            <w:pPr>
+              <w:spacing w:before="20" w:after="20"/>
+            </w:pPr>
+            <w:r>
+              <w:rPr>
+                <w:b/>
+                <w:sz w:val="18"/>
+              </w:rPr>
+              <w:t>Ciclos</w:t>
+            </w:r>
+          </w:p>
+        </w:tc>
+        <w:tc>
+          <w:tcPr>
+            <w:tcW w:type="dxa" w:w="1928"/>
+            <w:shd w:val="clear" w:color="auto" w:fill="D9E2F3"/>
+          </w:tcPr>
+          <w:p>
+            <w:pPr>
+              <w:spacing w:before="20" w:after="20"/>
+            </w:pPr>
+            <w:r>
+              <w:rPr>
+                <w:b/>
+                <w:sz w:val="18"/>
+              </w:rPr>
+              <w:t>Ritmo (ciclos/min)</w:t>
             </w:r>
           </w:p>
         </w:tc>
@@ -8311,33 +8817,97 @@
       <w:tr>
         <w:tc>
           <w:tcPr>
-            <w:tcW w:type="dxa" w:w="3402"/>
-          </w:tcPr>
-          <w:p>
-            <w:pPr>
-              <w:spacing w:before="20" w:after="20"/>
-            </w:pPr>
-            <w:r>
-              <w:rPr>
-                <w:sz w:val="18"/>
-              </w:rPr>
-              <w:t>Vídeo</w:t>
-            </w:r>
-          </w:p>
-        </w:tc>
-        <w:tc>
-          <w:tcPr>
-            <w:tcW w:type="dxa" w:w="5669"/>
-          </w:tcPr>
-          <w:p>
-            <w:pPr>
-              <w:spacing w:before="20" w:after="20"/>
-            </w:pPr>
-            <w:r>
-              <w:rPr>
-                <w:sz w:val="18"/>
-              </w:rPr>
-              <w:t>GX011614 (GoPro), subacuático, vista lateral; 46,2 s, 29,97 fps, 5120 × 2880</w:t>
+            <w:tcW w:type="dxa" w:w="1587"/>
+          </w:tcPr>
+          <w:p>
+            <w:pPr>
+              <w:spacing w:before="20" w:after="20"/>
+            </w:pPr>
+            <w:r>
+              <w:rPr>
+                <w:sz w:val="18"/>
+              </w:rPr>
+              <w:t>GX011614</w:t>
+            </w:r>
+          </w:p>
+        </w:tc>
+        <w:tc>
+          <w:tcPr>
+            <w:tcW w:type="dxa" w:w="1247"/>
+          </w:tcPr>
+          <w:p>
+            <w:pPr>
+              <w:spacing w:before="20" w:after="20"/>
+            </w:pPr>
+            <w:r>
+              <w:rPr>
+                <w:sz w:val="18"/>
+              </w:rPr>
+              <w:t>lateral</w:t>
+            </w:r>
+          </w:p>
+        </w:tc>
+        <w:tc>
+          <w:tcPr>
+            <w:tcW w:type="dxa" w:w="1361"/>
+          </w:tcPr>
+          <w:p>
+            <w:pPr>
+              <w:spacing w:before="20" w:after="20"/>
+            </w:pPr>
+            <w:r>
+              <w:rPr>
+                <w:sz w:val="18"/>
+              </w:rPr>
+              <w:t>46,2 s</w:t>
+            </w:r>
+          </w:p>
+        </w:tc>
+        <w:tc>
+          <w:tcPr>
+            <w:tcW w:type="dxa" w:w="1814"/>
+          </w:tcPr>
+          <w:p>
+            <w:pPr>
+              <w:spacing w:before="20" w:after="20"/>
+            </w:pPr>
+            <w:r>
+              <w:rPr>
+                <w:sz w:val="18"/>
+              </w:rPr>
+              <w:t>12,7 s</w:t>
+            </w:r>
+          </w:p>
+        </w:tc>
+        <w:tc>
+          <w:tcPr>
+            <w:tcW w:type="dxa" w:w="1134"/>
+          </w:tcPr>
+          <w:p>
+            <w:pPr>
+              <w:spacing w:before="20" w:after="20"/>
+            </w:pPr>
+            <w:r>
+              <w:rPr>
+                <w:sz w:val="18"/>
+              </w:rPr>
+              <w:t>9</w:t>
+            </w:r>
+          </w:p>
+        </w:tc>
+        <w:tc>
+          <w:tcPr>
+            <w:tcW w:type="dxa" w:w="1928"/>
+          </w:tcPr>
+          <w:p>
+            <w:pPr>
+              <w:spacing w:before="20" w:after="20"/>
+            </w:pPr>
+            <w:r>
+              <w:rPr>
+                <w:sz w:val="18"/>
+              </w:rPr>
+              <w:t>50,5</w:t>
             </w:r>
           </w:p>
         </w:tc>
@@ -8345,33 +8915,97 @@
       <w:tr>
         <w:tc>
           <w:tcPr>
-            <w:tcW w:type="dxa" w:w="3402"/>
-          </w:tcPr>
-          <w:p>
-            <w:pPr>
-              <w:spacing w:before="20" w:after="20"/>
-            </w:pPr>
-            <w:r>
-              <w:rPr>
-                <w:sz w:val="18"/>
-              </w:rPr>
-              <w:t>Equipo y modelo</w:t>
-            </w:r>
-          </w:p>
-        </w:tc>
-        <w:tc>
-          <w:tcPr>
-            <w:tcW w:type="dxa" w:w="5669"/>
-          </w:tcPr>
-          <w:p>
-            <w:pPr>
-              <w:spacing w:before="20" w:after="20"/>
-            </w:pPr>
-            <w:r>
-              <w:rPr>
-                <w:sz w:val="18"/>
-              </w:rPr>
-              <w:t>Portátil, CPU de 4 hilos; YOLOv8n-Pose, 1 de cada 2 fotogramas</w:t>
+            <w:tcW w:type="dxa" w:w="1587"/>
+          </w:tcPr>
+          <w:p>
+            <w:pPr>
+              <w:spacing w:before="20" w:after="20"/>
+            </w:pPr>
+            <w:r>
+              <w:rPr>
+                <w:sz w:val="18"/>
+              </w:rPr>
+              <w:t>GX011617</w:t>
+            </w:r>
+          </w:p>
+        </w:tc>
+        <w:tc>
+          <w:tcPr>
+            <w:tcW w:type="dxa" w:w="1247"/>
+          </w:tcPr>
+          <w:p>
+            <w:pPr>
+              <w:spacing w:before="20" w:after="20"/>
+            </w:pPr>
+            <w:r>
+              <w:rPr>
+                <w:sz w:val="18"/>
+              </w:rPr>
+              <w:t>lateral</w:t>
+            </w:r>
+          </w:p>
+        </w:tc>
+        <w:tc>
+          <w:tcPr>
+            <w:tcW w:type="dxa" w:w="1361"/>
+          </w:tcPr>
+          <w:p>
+            <w:pPr>
+              <w:spacing w:before="20" w:after="20"/>
+            </w:pPr>
+            <w:r>
+              <w:rPr>
+                <w:sz w:val="18"/>
+              </w:rPr>
+              <w:t>29,0 s</w:t>
+            </w:r>
+          </w:p>
+        </w:tc>
+        <w:tc>
+          <w:tcPr>
+            <w:tcW w:type="dxa" w:w="1814"/>
+          </w:tcPr>
+          <w:p>
+            <w:pPr>
+              <w:spacing w:before="20" w:after="20"/>
+            </w:pPr>
+            <w:r>
+              <w:rPr>
+                <w:sz w:val="18"/>
+              </w:rPr>
+              <w:t>7,0 s</w:t>
+            </w:r>
+          </w:p>
+        </w:tc>
+        <w:tc>
+          <w:tcPr>
+            <w:tcW w:type="dxa" w:w="1134"/>
+          </w:tcPr>
+          <w:p>
+            <w:pPr>
+              <w:spacing w:before="20" w:after="20"/>
+            </w:pPr>
+            <w:r>
+              <w:rPr>
+                <w:sz w:val="18"/>
+              </w:rPr>
+              <w:t>0</w:t>
+            </w:r>
+          </w:p>
+        </w:tc>
+        <w:tc>
+          <w:tcPr>
+            <w:tcW w:type="dxa" w:w="1928"/>
+          </w:tcPr>
+          <w:p>
+            <w:pPr>
+              <w:spacing w:before="20" w:after="20"/>
+            </w:pPr>
+            <w:r>
+              <w:rPr>
+                <w:sz w:val="18"/>
+              </w:rPr>
+              <w:t>—</w:t>
             </w:r>
           </w:p>
         </w:tc>
@@ -8379,33 +9013,97 @@
       <w:tr>
         <w:tc>
           <w:tcPr>
-            <w:tcW w:type="dxa" w:w="3402"/>
-          </w:tcPr>
-          <w:p>
-            <w:pPr>
-              <w:spacing w:before="20" w:after="20"/>
-            </w:pPr>
-            <w:r>
-              <w:rPr>
-                <w:sz w:val="18"/>
-              </w:rPr>
-              <w:t>Tiempo de proceso</w:t>
-            </w:r>
-          </w:p>
-        </w:tc>
-        <w:tc>
-          <w:tcPr>
-            <w:tcW w:type="dxa" w:w="5669"/>
-          </w:tcPr>
-          <w:p>
-            <w:pPr>
-              <w:spacing w:before="20" w:after="20"/>
-            </w:pPr>
-            <w:r>
-              <w:rPr>
-                <w:sz w:val="18"/>
-              </w:rPr>
-              <w:t>Pose 288 s; MotionBERT 25 s; vídeo anotado unos 205 s</w:t>
+            <w:tcW w:type="dxa" w:w="1587"/>
+          </w:tcPr>
+          <w:p>
+            <w:pPr>
+              <w:spacing w:before="20" w:after="20"/>
+            </w:pPr>
+            <w:r>
+              <w:rPr>
+                <w:sz w:val="18"/>
+              </w:rPr>
+              <w:t>GX011618</w:t>
+            </w:r>
+          </w:p>
+        </w:tc>
+        <w:tc>
+          <w:tcPr>
+            <w:tcW w:type="dxa" w:w="1247"/>
+          </w:tcPr>
+          <w:p>
+            <w:pPr>
+              <w:spacing w:before="20" w:after="20"/>
+            </w:pPr>
+            <w:r>
+              <w:rPr>
+                <w:sz w:val="18"/>
+              </w:rPr>
+              <w:t>lateral</w:t>
+            </w:r>
+          </w:p>
+        </w:tc>
+        <w:tc>
+          <w:tcPr>
+            <w:tcW w:type="dxa" w:w="1361"/>
+          </w:tcPr>
+          <w:p>
+            <w:pPr>
+              <w:spacing w:before="20" w:after="20"/>
+            </w:pPr>
+            <w:r>
+              <w:rPr>
+                <w:sz w:val="18"/>
+              </w:rPr>
+              <w:t>28,2 s</w:t>
+            </w:r>
+          </w:p>
+        </w:tc>
+        <w:tc>
+          <w:tcPr>
+            <w:tcW w:type="dxa" w:w="1814"/>
+          </w:tcPr>
+          <w:p>
+            <w:pPr>
+              <w:spacing w:before="20" w:after="20"/>
+            </w:pPr>
+            <w:r>
+              <w:rPr>
+                <w:sz w:val="18"/>
+              </w:rPr>
+              <w:t>8,9 s</w:t>
+            </w:r>
+          </w:p>
+        </w:tc>
+        <w:tc>
+          <w:tcPr>
+            <w:tcW w:type="dxa" w:w="1134"/>
+          </w:tcPr>
+          <w:p>
+            <w:pPr>
+              <w:spacing w:before="20" w:after="20"/>
+            </w:pPr>
+            <w:r>
+              <w:rPr>
+                <w:sz w:val="18"/>
+              </w:rPr>
+              <w:t>1</w:t>
+            </w:r>
+          </w:p>
+        </w:tc>
+        <w:tc>
+          <w:tcPr>
+            <w:tcW w:type="dxa" w:w="1928"/>
+          </w:tcPr>
+          <w:p>
+            <w:pPr>
+              <w:spacing w:before="20" w:after="20"/>
+            </w:pPr>
+            <w:r>
+              <w:rPr>
+                <w:sz w:val="18"/>
+              </w:rPr>
+              <w:t>66,6</w:t>
             </w:r>
           </w:p>
         </w:tc>
@@ -8413,33 +9111,97 @@
       <w:tr>
         <w:tc>
           <w:tcPr>
-            <w:tcW w:type="dxa" w:w="3402"/>
-          </w:tcPr>
-          <w:p>
-            <w:pPr>
-              <w:spacing w:before="20" w:after="20"/>
-            </w:pPr>
-            <w:r>
-              <w:rPr>
-                <w:sz w:val="18"/>
-              </w:rPr>
-              <w:t>Nadador analizable</w:t>
-            </w:r>
-          </w:p>
-        </w:tc>
-        <w:tc>
-          <w:tcPr>
-            <w:tcW w:type="dxa" w:w="5669"/>
-          </w:tcPr>
-          <w:p>
-            <w:pPr>
-              <w:spacing w:before="20" w:after="20"/>
-            </w:pPr>
-            <w:r>
-              <w:rPr>
-                <w:sz w:val="18"/>
-              </w:rPr>
-              <w:t>12,7 s (una pasada por delante de la cámara)</w:t>
+            <w:tcW w:type="dxa" w:w="1587"/>
+          </w:tcPr>
+          <w:p>
+            <w:pPr>
+              <w:spacing w:before="20" w:after="20"/>
+            </w:pPr>
+            <w:r>
+              <w:rPr>
+                <w:sz w:val="18"/>
+              </w:rPr>
+              <w:t>IMG_7207</w:t>
+            </w:r>
+          </w:p>
+        </w:tc>
+        <w:tc>
+          <w:tcPr>
+            <w:tcW w:type="dxa" w:w="1247"/>
+          </w:tcPr>
+          <w:p>
+            <w:pPr>
+              <w:spacing w:before="20" w:after="20"/>
+            </w:pPr>
+            <w:r>
+              <w:rPr>
+                <w:sz w:val="18"/>
+              </w:rPr>
+              <w:t>frontal</w:t>
+            </w:r>
+          </w:p>
+        </w:tc>
+        <w:tc>
+          <w:tcPr>
+            <w:tcW w:type="dxa" w:w="1361"/>
+          </w:tcPr>
+          <w:p>
+            <w:pPr>
+              <w:spacing w:before="20" w:after="20"/>
+            </w:pPr>
+            <w:r>
+              <w:rPr>
+                <w:sz w:val="18"/>
+              </w:rPr>
+              <w:t>6,0 s</w:t>
+            </w:r>
+          </w:p>
+        </w:tc>
+        <w:tc>
+          <w:tcPr>
+            <w:tcW w:type="dxa" w:w="1814"/>
+          </w:tcPr>
+          <w:p>
+            <w:pPr>
+              <w:spacing w:before="20" w:after="20"/>
+            </w:pPr>
+            <w:r>
+              <w:rPr>
+                <w:sz w:val="18"/>
+              </w:rPr>
+              <w:t>5,1 s</w:t>
+            </w:r>
+          </w:p>
+        </w:tc>
+        <w:tc>
+          <w:tcPr>
+            <w:tcW w:type="dxa" w:w="1134"/>
+          </w:tcPr>
+          <w:p>
+            <w:pPr>
+              <w:spacing w:before="20" w:after="20"/>
+            </w:pPr>
+            <w:r>
+              <w:rPr>
+                <w:sz w:val="18"/>
+              </w:rPr>
+              <w:t>3</w:t>
+            </w:r>
+          </w:p>
+        </w:tc>
+        <w:tc>
+          <w:tcPr>
+            <w:tcW w:type="dxa" w:w="1928"/>
+          </w:tcPr>
+          <w:p>
+            <w:pPr>
+              <w:spacing w:before="20" w:after="20"/>
+            </w:pPr>
+            <w:r>
+              <w:rPr>
+                <w:sz w:val="18"/>
+              </w:rPr>
+              <w:t>73,9</w:t>
             </w:r>
           </w:p>
         </w:tc>
@@ -8447,33 +9209,97 @@
       <w:tr>
         <w:tc>
           <w:tcPr>
-            <w:tcW w:type="dxa" w:w="3402"/>
-          </w:tcPr>
-          <w:p>
-            <w:pPr>
-              <w:spacing w:before="20" w:after="20"/>
-            </w:pPr>
-            <w:r>
-              <w:rPr>
-                <w:sz w:val="18"/>
-              </w:rPr>
-              <w:t>Fotogramas con tronco girado (descartados)</w:t>
-            </w:r>
-          </w:p>
-        </w:tc>
-        <w:tc>
-          <w:tcPr>
-            <w:tcW w:type="dxa" w:w="5669"/>
-          </w:tcPr>
-          <w:p>
-            <w:pPr>
-              <w:spacing w:before="20" w:after="20"/>
-            </w:pPr>
-            <w:r>
-              <w:rPr>
-                <w:sz w:val="18"/>
-              </w:rPr>
-              <w:t>11,5 %</w:t>
+            <w:tcW w:type="dxa" w:w="1587"/>
+          </w:tcPr>
+          <w:p>
+            <w:pPr>
+              <w:spacing w:before="20" w:after="20"/>
+            </w:pPr>
+            <w:r>
+              <w:rPr>
+                <w:sz w:val="18"/>
+              </w:rPr>
+              <w:t>IMG_7215</w:t>
+            </w:r>
+          </w:p>
+        </w:tc>
+        <w:tc>
+          <w:tcPr>
+            <w:tcW w:type="dxa" w:w="1247"/>
+          </w:tcPr>
+          <w:p>
+            <w:pPr>
+              <w:spacing w:before="20" w:after="20"/>
+            </w:pPr>
+            <w:r>
+              <w:rPr>
+                <w:sz w:val="18"/>
+              </w:rPr>
+              <w:t>frontal</w:t>
+            </w:r>
+          </w:p>
+        </w:tc>
+        <w:tc>
+          <w:tcPr>
+            <w:tcW w:type="dxa" w:w="1361"/>
+          </w:tcPr>
+          <w:p>
+            <w:pPr>
+              <w:spacing w:before="20" w:after="20"/>
+            </w:pPr>
+            <w:r>
+              <w:rPr>
+                <w:sz w:val="18"/>
+              </w:rPr>
+              <w:t>9,4 s</w:t>
+            </w:r>
+          </w:p>
+        </w:tc>
+        <w:tc>
+          <w:tcPr>
+            <w:tcW w:type="dxa" w:w="1814"/>
+          </w:tcPr>
+          <w:p>
+            <w:pPr>
+              <w:spacing w:before="20" w:after="20"/>
+            </w:pPr>
+            <w:r>
+              <w:rPr>
+                <w:sz w:val="18"/>
+              </w:rPr>
+              <w:t>4,8 s</w:t>
+            </w:r>
+          </w:p>
+        </w:tc>
+        <w:tc>
+          <w:tcPr>
+            <w:tcW w:type="dxa" w:w="1134"/>
+          </w:tcPr>
+          <w:p>
+            <w:pPr>
+              <w:spacing w:before="20" w:after="20"/>
+            </w:pPr>
+            <w:r>
+              <w:rPr>
+                <w:sz w:val="18"/>
+              </w:rPr>
+              <w:t>4</w:t>
+            </w:r>
+          </w:p>
+        </w:tc>
+        <w:tc>
+          <w:tcPr>
+            <w:tcW w:type="dxa" w:w="1928"/>
+          </w:tcPr>
+          <w:p>
+            <w:pPr>
+              <w:spacing w:before="20" w:after="20"/>
+            </w:pPr>
+            <w:r>
+              <w:rPr>
+                <w:sz w:val="18"/>
+              </w:rPr>
+              <w:t>55,2</w:t>
             </w:r>
           </w:p>
         </w:tc>
@@ -8481,34 +9307,90 @@
       <w:tr>
         <w:tc>
           <w:tcPr>
-            <w:tcW w:type="dxa" w:w="3402"/>
-          </w:tcPr>
-          <w:p>
-            <w:pPr>
-              <w:spacing w:before="20" w:after="20"/>
-            </w:pPr>
-            <w:r>
-              <w:rPr>
-                <w:sz w:val="18"/>
-              </w:rPr>
-              <w:t>Ciclos válidos</w:t>
-            </w:r>
-          </w:p>
-        </w:tc>
-        <w:tc>
-          <w:tcPr>
-            <w:tcW w:type="dxa" w:w="5669"/>
-          </w:tcPr>
-          <w:p>
-            <w:pPr>
-              <w:spacing w:before="20" w:after="20"/>
-            </w:pPr>
-            <w:r>
-              <w:rPr>
-                <w:sz w:val="18"/>
-              </w:rPr>
-              <w:t>9</w:t>
-            </w:r>
+            <w:tcW w:type="dxa" w:w="1587"/>
+          </w:tcPr>
+          <w:p>
+            <w:pPr>
+              <w:spacing w:before="20" w:after="20"/>
+            </w:pPr>
+            <w:r>
+              <w:rPr>
+                <w:b/>
+                <w:sz w:val="18"/>
+              </w:rPr>
+              <w:t>Total</w:t>
+            </w:r>
+          </w:p>
+        </w:tc>
+        <w:tc>
+          <w:tcPr>
+            <w:tcW w:type="dxa" w:w="1247"/>
+          </w:tcPr>
+          <w:p>
+            <w:pPr>
+              <w:spacing w:before="20" w:after="20"/>
+            </w:pPr>
+          </w:p>
+        </w:tc>
+        <w:tc>
+          <w:tcPr>
+            <w:tcW w:type="dxa" w:w="1361"/>
+          </w:tcPr>
+          <w:p>
+            <w:pPr>
+              <w:spacing w:before="20" w:after="20"/>
+            </w:pPr>
+            <w:r>
+              <w:rPr>
+                <w:b/>
+                <w:sz w:val="18"/>
+              </w:rPr>
+              <w:t>118,8 s</w:t>
+            </w:r>
+          </w:p>
+        </w:tc>
+        <w:tc>
+          <w:tcPr>
+            <w:tcW w:type="dxa" w:w="1814"/>
+          </w:tcPr>
+          <w:p>
+            <w:pPr>
+              <w:spacing w:before="20" w:after="20"/>
+            </w:pPr>
+            <w:r>
+              <w:rPr>
+                <w:b/>
+                <w:sz w:val="18"/>
+              </w:rPr>
+              <w:t>38,5 s (32 %)</w:t>
+            </w:r>
+          </w:p>
+        </w:tc>
+        <w:tc>
+          <w:tcPr>
+            <w:tcW w:type="dxa" w:w="1134"/>
+          </w:tcPr>
+          <w:p>
+            <w:pPr>
+              <w:spacing w:before="20" w:after="20"/>
+            </w:pPr>
+            <w:r>
+              <w:rPr>
+                <w:b/>
+                <w:sz w:val="18"/>
+              </w:rPr>
+              <w:t>17</w:t>
+            </w:r>
+          </w:p>
+        </w:tc>
+        <w:tc>
+          <w:tcPr>
+            <w:tcW w:type="dxa" w:w="1928"/>
+          </w:tcPr>
+          <w:p>
+            <w:pPr>
+              <w:spacing w:before="20" w:after="20"/>
+            </w:pPr>
           </w:p>
         </w:tc>
       </w:tr>
@@ -8520,10 +9402,42 @@
     </w:p>
     <w:p>
       <w:pPr>
-        <w:jc w:val="both"/>
-      </w:pPr>
-      <w:r>
-        <w:t>El conteo de brazadas se validó con una cuenta manual entre los segundos 30 y 40 del vídeo (Tabla 6).</w:t>
+        <w:keepNext/>
+        <w:jc w:val="center"/>
+      </w:pPr>
+      <w:r>
+        <w:drawing>
+          <wp:inline xmlns:a="http://schemas.openxmlformats.org/drawingml/2006/main" xmlns:pic="http://schemas.openxmlformats.org/drawingml/2006/picture">
+            <wp:extent cx="5040000" cy="2486400"/>
+            <wp:docPr id="9" name="Picture 9"/>
+            <wp:cNvGraphicFramePr>
+              <a:graphicFrameLocks noChangeAspect="1"/>
+            </wp:cNvGraphicFramePr>
+            <a:graphic>
+              <a:graphicData uri="http://schemas.openxmlformats.org/drawingml/2006/picture">
+                <pic:pic>
+                  <pic:nvPicPr>
+                    <pic:cNvPr id="0" name="aaron_clips.png"/>
+                    <pic:cNvPicPr/>
+                  </pic:nvPicPr>
+                  <pic:blipFill>
+                    <a:blip r:embed="rId22"/>
+                    <a:stretch>
+                      <a:fillRect/>
+                    </a:stretch>
+                  </pic:blipFill>
+                  <pic:spPr>
+                    <a:xfrm>
+                      <a:off x="0" y="0"/>
+                      <a:ext cx="5040000" cy="2486400"/>
+                    </a:xfrm>
+                    <a:prstGeom prst="rect"/>
+                  </pic:spPr>
+                </pic:pic>
+              </a:graphicData>
+            </a:graphic>
+          </wp:inline>
+        </w:drawing>
       </w:r>
     </w:p>
     <w:p>
@@ -8532,6 +9446,77 @@
         <w:jc w:val="center"/>
       </w:pPr>
       <w:r>
+        <w:t xml:space="preserve">Figura </w:t>
+      </w:r>
+      <w:r>
+        <w:fldChar w:fldCharType="begin"/>
+      </w:r>
+      <w:r>
+        <w:instrText xml:space="preserve"> SEQ Figura \* ARABIC </w:instrText>
+      </w:r>
+      <w:r>
+        <w:fldChar w:fldCharType="separate"/>
+      </w:r>
+      <w:r>
+        <w:t>1</w:t>
+      </w:r>
+      <w:r>
+        <w:fldChar w:fldCharType="end"/>
+      </w:r>
+      <w:r>
+        <w:t xml:space="preserve">. </w:t>
+      </w:r>
+      <w:r>
+        <w:t>Aaron (crol): tiempo analizable y ciclos válidos por clip.</w:t>
+      </w:r>
+    </w:p>
+    <w:p>
+      <w:pPr>
+        <w:jc w:val="both"/>
+      </w:pPr>
+      <w:r>
+        <w:t xml:space="preserve">El factor limitante es la detección: en GX011617 Aaron está en cuadro unos 19 s, pero el modelo de pose lo detecta en unos 5 s, la señal de la mano queda fragmentada y no se forman ciclos. La opción </w:t>
+      </w:r>
+      <w:r>
+        <w:rPr>
+          <w:rFonts w:ascii="Consolas" w:hAnsi="Consolas"/>
+        </w:rPr>
+        <w:t>--imgsz 1280</w:t>
+      </w:r>
+      <w:r>
+        <w:t xml:space="preserve"> y el programa </w:t>
+      </w:r>
+      <w:r>
+        <w:rPr>
+          <w:rFonts w:ascii="Consolas" w:hAnsi="Consolas"/>
+        </w:rPr>
+        <w:t>probar_deteccion.py</w:t>
+      </w:r>
+      <w:r>
+        <w:t xml:space="preserve"> permiten comprobar si una entrada mayor de la red recupera fotogramas. </w:t>
+      </w:r>
+      <w:r>
+        <w:rPr>
+          <w:b/>
+          <w:color w:val="C00000"/>
+        </w:rPr>
+        <w:t>[PENDIENTE: resultado de probar_deteccion.py en GX011617 e IMG_7215.]</w:t>
+      </w:r>
+    </w:p>
+    <w:p>
+      <w:pPr>
+        <w:pStyle w:val="Ttulo3"/>
+      </w:pPr>
+      <w:r>
+        <w:t>Validación del conteo de brazadas frente a la cuenta manual</w:t>
+      </w:r>
+    </w:p>
+    <w:p>
+      <w:pPr>
+        <w:pStyle w:val="Caption"/>
+        <w:jc w:val="center"/>
+      </w:pPr>
+      <w:r>
         <w:t xml:space="preserve">Tabla </w:t>
       </w:r>
       <w:r>
@@ -8553,7 +9538,485 @@
         <w:t xml:space="preserve">. </w:t>
       </w:r>
       <w:r>
-        <w:t>Validación del conteo de brazadas frente a la cuenta manual. Versiones previas del método, que distinguían brazo izquierdo y derecho, daban 79 y 34 ciclos/min.</w:t>
+        <w:t>Validación frente a la cuenta manual de la autora. En GX011614, versiones previas del método, que distinguían brazo izquierdo y derecho, daban 79 y 34 ciclos/min.</w:t>
+      </w:r>
+    </w:p>
+    <w:tbl>
+      <w:tblPr>
+        <w:tblStyle w:val="Tablaconcuadrcula"/>
+        <w:tblW w:type="auto" w:w="0"/>
+        <w:tblLook w:firstColumn="1" w:firstRow="1" w:lastColumn="0" w:lastRow="0" w:noHBand="0" w:noVBand="1" w:val="04A0"/>
+      </w:tblPr>
+      <w:tblGrid>
+        <w:gridCol w:w="1417"/>
+        <w:gridCol w:w="1417"/>
+        <w:gridCol w:w="1417"/>
+        <w:gridCol w:w="1417"/>
+        <w:gridCol w:w="1417"/>
+        <w:gridCol w:w="1417"/>
+      </w:tblGrid>
+      <w:tr>
+        <w:tc>
+          <w:tcPr>
+            <w:tcW w:type="dxa" w:w="2041"/>
+            <w:shd w:val="clear" w:color="auto" w:fill="D9E2F3"/>
+          </w:tcPr>
+          <w:p>
+            <w:pPr>
+              <w:spacing w:before="20" w:after="20"/>
+            </w:pPr>
+            <w:r>
+              <w:rPr>
+                <w:b/>
+                <w:sz w:val="18"/>
+              </w:rPr>
+              <w:t>Clip</w:t>
+            </w:r>
+          </w:p>
+        </w:tc>
+        <w:tc>
+          <w:tcPr>
+            <w:tcW w:type="dxa" w:w="1077"/>
+            <w:shd w:val="clear" w:color="auto" w:fill="D9E2F3"/>
+          </w:tcPr>
+          <w:p>
+            <w:pPr>
+              <w:spacing w:before="20" w:after="20"/>
+            </w:pPr>
+            <w:r>
+              <w:rPr>
+                <w:b/>
+                <w:sz w:val="18"/>
+              </w:rPr>
+              <w:t>Vista</w:t>
+            </w:r>
+          </w:p>
+        </w:tc>
+        <w:tc>
+          <w:tcPr>
+            <w:tcW w:type="dxa" w:w="2268"/>
+            <w:shd w:val="clear" w:color="auto" w:fill="D9E2F3"/>
+          </w:tcPr>
+          <w:p>
+            <w:pPr>
+              <w:spacing w:before="20" w:after="20"/>
+            </w:pPr>
+            <w:r>
+              <w:rPr>
+                <w:b/>
+                <w:sz w:val="18"/>
+              </w:rPr>
+              <w:t>Cuenta manual</w:t>
+            </w:r>
+          </w:p>
+        </w:tc>
+        <w:tc>
+          <w:tcPr>
+            <w:tcW w:type="dxa" w:w="1531"/>
+            <w:shd w:val="clear" w:color="auto" w:fill="D9E2F3"/>
+          </w:tcPr>
+          <w:p>
+            <w:pPr>
+              <w:spacing w:before="20" w:after="20"/>
+            </w:pPr>
+            <w:r>
+              <w:rPr>
+                <w:b/>
+                <w:sz w:val="18"/>
+              </w:rPr>
+              <w:t>Sistema</w:t>
+            </w:r>
+          </w:p>
+        </w:tc>
+        <w:tc>
+          <w:tcPr>
+            <w:tcW w:type="dxa" w:w="907"/>
+            <w:shd w:val="clear" w:color="auto" w:fill="D9E2F3"/>
+          </w:tcPr>
+          <w:p>
+            <w:pPr>
+              <w:spacing w:before="20" w:after="20"/>
+            </w:pPr>
+            <w:r>
+              <w:rPr>
+                <w:b/>
+                <w:sz w:val="18"/>
+              </w:rPr>
+              <w:t>Error</w:t>
+            </w:r>
+          </w:p>
+        </w:tc>
+        <w:tc>
+          <w:tcPr>
+            <w:tcW w:type="dxa" w:w="1247"/>
+            <w:shd w:val="clear" w:color="auto" w:fill="D9E2F3"/>
+          </w:tcPr>
+          <w:p>
+            <w:pPr>
+              <w:spacing w:before="20" w:after="20"/>
+            </w:pPr>
+            <w:r>
+              <w:rPr>
+                <w:b/>
+                <w:sz w:val="18"/>
+              </w:rPr>
+              <w:t>Ciclos encontrados</w:t>
+            </w:r>
+          </w:p>
+        </w:tc>
+      </w:tr>
+      <w:tr>
+        <w:tc>
+          <w:tcPr>
+            <w:tcW w:type="dxa" w:w="2041"/>
+          </w:tcPr>
+          <w:p>
+            <w:pPr>
+              <w:spacing w:before="20" w:after="20"/>
+            </w:pPr>
+            <w:r>
+              <w:rPr>
+                <w:sz w:val="18"/>
+              </w:rPr>
+              <w:t>GX011614 (s 30-40)</w:t>
+            </w:r>
+          </w:p>
+        </w:tc>
+        <w:tc>
+          <w:tcPr>
+            <w:tcW w:type="dxa" w:w="1077"/>
+          </w:tcPr>
+          <w:p>
+            <w:pPr>
+              <w:spacing w:before="20" w:after="20"/>
+            </w:pPr>
+            <w:r>
+              <w:rPr>
+                <w:sz w:val="18"/>
+              </w:rPr>
+              <w:t>lateral</w:t>
+            </w:r>
+          </w:p>
+        </w:tc>
+        <w:tc>
+          <w:tcPr>
+            <w:tcW w:type="dxa" w:w="2268"/>
+          </w:tcPr>
+          <w:p>
+            <w:pPr>
+              <w:spacing w:before="20" w:after="20"/>
+            </w:pPr>
+            <w:r>
+              <w:rPr>
+                <w:sz w:val="18"/>
+              </w:rPr>
+              <w:t>54 ciclos/min (9 ciclos en 10 s)</w:t>
+            </w:r>
+          </w:p>
+        </w:tc>
+        <w:tc>
+          <w:tcPr>
+            <w:tcW w:type="dxa" w:w="1531"/>
+          </w:tcPr>
+          <w:p>
+            <w:pPr>
+              <w:spacing w:before="20" w:after="20"/>
+            </w:pPr>
+            <w:r>
+              <w:rPr>
+                <w:sz w:val="18"/>
+              </w:rPr>
+              <w:t>50,5 ciclos/min</w:t>
+            </w:r>
+          </w:p>
+        </w:tc>
+        <w:tc>
+          <w:tcPr>
+            <w:tcW w:type="dxa" w:w="907"/>
+          </w:tcPr>
+          <w:p>
+            <w:pPr>
+              <w:spacing w:before="20" w:after="20"/>
+            </w:pPr>
+            <w:r>
+              <w:rPr>
+                <w:sz w:val="18"/>
+              </w:rPr>
+              <w:t>−6,5 %</w:t>
+            </w:r>
+          </w:p>
+        </w:tc>
+        <w:tc>
+          <w:tcPr>
+            <w:tcW w:type="dxa" w:w="1247"/>
+          </w:tcPr>
+          <w:p>
+            <w:pPr>
+              <w:spacing w:before="20" w:after="20"/>
+            </w:pPr>
+            <w:r>
+              <w:rPr>
+                <w:sz w:val="18"/>
+              </w:rPr>
+              <w:t>—</w:t>
+            </w:r>
+          </w:p>
+        </w:tc>
+      </w:tr>
+      <w:tr>
+        <w:tc>
+          <w:tcPr>
+            <w:tcW w:type="dxa" w:w="2041"/>
+          </w:tcPr>
+          <w:p>
+            <w:pPr>
+              <w:spacing w:before="20" w:after="20"/>
+            </w:pPr>
+            <w:r>
+              <w:rPr>
+                <w:sz w:val="18"/>
+              </w:rPr>
+              <w:t>IMG_7207 (clip entero)</w:t>
+            </w:r>
+          </w:p>
+        </w:tc>
+        <w:tc>
+          <w:tcPr>
+            <w:tcW w:type="dxa" w:w="1077"/>
+          </w:tcPr>
+          <w:p>
+            <w:pPr>
+              <w:spacing w:before="20" w:after="20"/>
+            </w:pPr>
+            <w:r>
+              <w:rPr>
+                <w:sz w:val="18"/>
+              </w:rPr>
+              <w:t>frontal</w:t>
+            </w:r>
+          </w:p>
+        </w:tc>
+        <w:tc>
+          <w:tcPr>
+            <w:tcW w:type="dxa" w:w="2268"/>
+          </w:tcPr>
+          <w:p>
+            <w:pPr>
+              <w:spacing w:before="20" w:after="20"/>
+            </w:pPr>
+            <w:r>
+              <w:rPr>
+                <w:sz w:val="18"/>
+              </w:rPr>
+              <w:t>80 ciclos/min (8 en 6,0 s)</w:t>
+            </w:r>
+          </w:p>
+        </w:tc>
+        <w:tc>
+          <w:tcPr>
+            <w:tcW w:type="dxa" w:w="1531"/>
+          </w:tcPr>
+          <w:p>
+            <w:pPr>
+              <w:spacing w:before="20" w:after="20"/>
+            </w:pPr>
+            <w:r>
+              <w:rPr>
+                <w:sz w:val="18"/>
+              </w:rPr>
+              <w:t>73,9 ciclos/min</w:t>
+            </w:r>
+          </w:p>
+        </w:tc>
+        <w:tc>
+          <w:tcPr>
+            <w:tcW w:type="dxa" w:w="907"/>
+          </w:tcPr>
+          <w:p>
+            <w:pPr>
+              <w:spacing w:before="20" w:after="20"/>
+            </w:pPr>
+            <w:r>
+              <w:rPr>
+                <w:sz w:val="18"/>
+              </w:rPr>
+              <w:t>−7,6 %</w:t>
+            </w:r>
+          </w:p>
+        </w:tc>
+        <w:tc>
+          <w:tcPr>
+            <w:tcW w:type="dxa" w:w="1247"/>
+          </w:tcPr>
+          <w:p>
+            <w:pPr>
+              <w:spacing w:before="20" w:after="20"/>
+            </w:pPr>
+            <w:r>
+              <w:rPr>
+                <w:sz w:val="18"/>
+              </w:rPr>
+              <w:t>3 de 8</w:t>
+            </w:r>
+          </w:p>
+        </w:tc>
+      </w:tr>
+      <w:tr>
+        <w:tc>
+          <w:tcPr>
+            <w:tcW w:type="dxa" w:w="2041"/>
+          </w:tcPr>
+          <w:p>
+            <w:pPr>
+              <w:spacing w:before="20" w:after="20"/>
+            </w:pPr>
+            <w:r>
+              <w:rPr>
+                <w:sz w:val="18"/>
+              </w:rPr>
+              <w:t>IMG_7215 (clip entero)</w:t>
+            </w:r>
+          </w:p>
+        </w:tc>
+        <w:tc>
+          <w:tcPr>
+            <w:tcW w:type="dxa" w:w="1077"/>
+          </w:tcPr>
+          <w:p>
+            <w:pPr>
+              <w:spacing w:before="20" w:after="20"/>
+            </w:pPr>
+            <w:r>
+              <w:rPr>
+                <w:sz w:val="18"/>
+              </w:rPr>
+              <w:t>frontal</w:t>
+            </w:r>
+          </w:p>
+        </w:tc>
+        <w:tc>
+          <w:tcPr>
+            <w:tcW w:type="dxa" w:w="2268"/>
+          </w:tcPr>
+          <w:p>
+            <w:pPr>
+              <w:spacing w:before="20" w:after="20"/>
+            </w:pPr>
+            <w:r>
+              <w:rPr>
+                <w:sz w:val="18"/>
+              </w:rPr>
+              <w:t>51 ciclos/min (8 en 9,4 s)</w:t>
+            </w:r>
+          </w:p>
+        </w:tc>
+        <w:tc>
+          <w:tcPr>
+            <w:tcW w:type="dxa" w:w="1531"/>
+          </w:tcPr>
+          <w:p>
+            <w:pPr>
+              <w:spacing w:before="20" w:after="20"/>
+            </w:pPr>
+            <w:r>
+              <w:rPr>
+                <w:sz w:val="18"/>
+              </w:rPr>
+              <w:t>55,2 ciclos/min</w:t>
+            </w:r>
+          </w:p>
+        </w:tc>
+        <w:tc>
+          <w:tcPr>
+            <w:tcW w:type="dxa" w:w="907"/>
+          </w:tcPr>
+          <w:p>
+            <w:pPr>
+              <w:spacing w:before="20" w:after="20"/>
+            </w:pPr>
+            <w:r>
+              <w:rPr>
+                <w:sz w:val="18"/>
+              </w:rPr>
+              <w:t>+8,2 %</w:t>
+            </w:r>
+          </w:p>
+        </w:tc>
+        <w:tc>
+          <w:tcPr>
+            <w:tcW w:type="dxa" w:w="1247"/>
+          </w:tcPr>
+          <w:p>
+            <w:pPr>
+              <w:spacing w:before="20" w:after="20"/>
+            </w:pPr>
+            <w:r>
+              <w:rPr>
+                <w:sz w:val="18"/>
+              </w:rPr>
+              <w:t>4 de 8</w:t>
+            </w:r>
+          </w:p>
+        </w:tc>
+      </w:tr>
+    </w:tbl>
+    <w:p>
+      <w:pPr>
+        <w:jc w:val="both"/>
+      </w:pPr>
+    </w:p>
+    <w:p>
+      <w:pPr>
+        <w:jc w:val="both"/>
+      </w:pPr>
+      <w:r>
+        <w:t>El ritmo se mide con un error de entre el 6,5 % y el 8,2 % en las dos vistas, y el sistema distingue ritmos muy distintos del mismo nadador (80 y 51 ciclos/min). La cobertura es baja: de frente encuentra entre el 38 % y el 50 % de los ciclos, por la detección parcial. Las tres comparaciones quedan como pruebas automáticas del código.</w:t>
+      </w:r>
+    </w:p>
+    <w:p>
+      <w:pPr>
+        <w:pStyle w:val="Ttulo3"/>
+      </w:pPr>
+      <w:r>
+        <w:t>Medidas de la técnica de Aaron</w:t>
+      </w:r>
+    </w:p>
+    <w:p>
+      <w:pPr>
+        <w:jc w:val="both"/>
+      </w:pPr>
+      <w:r>
+        <w:t>Las medidas se resumen solo con los clips laterales, porque los ángulos 2D de vistas distintas no son comparables (Tabla 8 y Figura 8). Izquierda y derecha se promedian, porque en vista lateral el modelo copia el brazo visible en el oculto.</w:t>
+      </w:r>
+    </w:p>
+    <w:p>
+      <w:pPr>
+        <w:pStyle w:val="Caption"/>
+        <w:jc w:val="center"/>
+      </w:pPr>
+      <w:r>
+        <w:t xml:space="preserve">Tabla </w:t>
+      </w:r>
+      <w:r>
+        <w:fldChar w:fldCharType="begin"/>
+      </w:r>
+      <w:r>
+        <w:instrText xml:space="preserve"> SEQ Tabla \* ARABIC </w:instrText>
+      </w:r>
+      <w:r>
+        <w:fldChar w:fldCharType="separate"/>
+      </w:r>
+      <w:r>
+        <w:t>1</w:t>
+      </w:r>
+      <w:r>
+        <w:fldChar w:fldCharType="end"/>
+      </w:r>
+      <w:r>
+        <w:t xml:space="preserve">. </w:t>
+      </w:r>
+      <w:r>
+        <w:t>Medidas por ciclo de Aaron en crol (10 ciclos laterales de GoPro).</w:t>
       </w:r>
     </w:p>
     <w:tbl>
@@ -8571,7 +10034,7 @@
       <w:tr>
         <w:tc>
           <w:tcPr>
-            <w:tcW w:type="dxa" w:w="2268"/>
+            <w:tcW w:type="dxa" w:w="3118"/>
             <w:shd w:val="clear" w:color="auto" w:fill="D9E2F3"/>
           </w:tcPr>
           <w:p>
@@ -8584,24 +10047,6 @@
                 <w:sz w:val="18"/>
               </w:rPr>
               <w:t>Medida</w:t>
-            </w:r>
-          </w:p>
-        </w:tc>
-        <w:tc>
-          <w:tcPr>
-            <w:tcW w:type="dxa" w:w="2551"/>
-            <w:shd w:val="clear" w:color="auto" w:fill="D9E2F3"/>
-          </w:tcPr>
-          <w:p>
-            <w:pPr>
-              <w:spacing w:before="20" w:after="20"/>
-            </w:pPr>
-            <w:r>
-              <w:rPr>
-                <w:b/>
-                <w:sz w:val="18"/>
-              </w:rPr>
-              <w:t>Cuenta manual</w:t>
             </w:r>
           </w:p>
         </w:tc>
@@ -8619,13 +10064,13 @@
                 <w:b/>
                 <w:sz w:val="18"/>
               </w:rPr>
-              <w:t>Sistema</w:t>
-            </w:r>
-          </w:p>
-        </w:tc>
-        <w:tc>
-          <w:tcPr>
-            <w:tcW w:type="dxa" w:w="2268"/>
+              <w:t>Media</w:t>
+            </w:r>
+          </w:p>
+        </w:tc>
+        <w:tc>
+          <w:tcPr>
+            <w:tcW w:type="dxa" w:w="1701"/>
             <w:shd w:val="clear" w:color="auto" w:fill="D9E2F3"/>
           </w:tcPr>
           <w:p>
@@ -8637,7 +10082,25 @@
                 <w:b/>
                 <w:sz w:val="18"/>
               </w:rPr>
-              <w:t>Diferencia</w:t>
+              <w:t>Desviación</w:t>
+            </w:r>
+          </w:p>
+        </w:tc>
+        <w:tc>
+          <w:tcPr>
+            <w:tcW w:type="dxa" w:w="1701"/>
+            <w:shd w:val="clear" w:color="auto" w:fill="D9E2F3"/>
+          </w:tcPr>
+          <w:p>
+            <w:pPr>
+              <w:spacing w:before="20" w:after="20"/>
+            </w:pPr>
+            <w:r>
+              <w:rPr>
+                <w:b/>
+                <w:sz w:val="18"/>
+              </w:rPr>
+              <w:t>Variación (CV)</w:t>
             </w:r>
           </w:p>
         </w:tc>
@@ -8645,7 +10108,7 @@
       <w:tr>
         <w:tc>
           <w:tcPr>
-            <w:tcW w:type="dxa" w:w="2268"/>
+            <w:tcW w:type="dxa" w:w="3118"/>
           </w:tcPr>
           <w:p>
             <w:pPr>
@@ -8661,22 +10124,6 @@
         </w:tc>
         <w:tc>
           <w:tcPr>
-            <w:tcW w:type="dxa" w:w="2551"/>
-          </w:tcPr>
-          <w:p>
-            <w:pPr>
-              <w:spacing w:before="20" w:after="20"/>
-            </w:pPr>
-            <w:r>
-              <w:rPr>
-                <w:sz w:val="18"/>
-              </w:rPr>
-              <w:t>54 ciclos/min (9 ciclos en 10 s)</w:t>
-            </w:r>
-          </w:p>
-        </w:tc>
-        <w:tc>
-          <w:tcPr>
             <w:tcW w:type="dxa" w:w="1984"/>
           </w:tcPr>
           <w:p>
@@ -8687,23 +10134,39 @@
               <w:rPr>
                 <w:sz w:val="18"/>
               </w:rPr>
-              <w:t>50,5 ciclos/min</w:t>
-            </w:r>
-          </w:p>
-        </w:tc>
-        <w:tc>
-          <w:tcPr>
-            <w:tcW w:type="dxa" w:w="2268"/>
-          </w:tcPr>
-          <w:p>
-            <w:pPr>
-              <w:spacing w:before="20" w:after="20"/>
-            </w:pPr>
-            <w:r>
-              <w:rPr>
-                <w:sz w:val="18"/>
-              </w:rPr>
-              <w:t>−6,5 %</w:t>
+              <w:t>52,1 ciclos/min</w:t>
+            </w:r>
+          </w:p>
+        </w:tc>
+        <w:tc>
+          <w:tcPr>
+            <w:tcW w:type="dxa" w:w="1701"/>
+          </w:tcPr>
+          <w:p>
+            <w:pPr>
+              <w:spacing w:before="20" w:after="20"/>
+            </w:pPr>
+            <w:r>
+              <w:rPr>
+                <w:sz w:val="18"/>
+              </w:rPr>
+              <w:t>11,6</w:t>
+            </w:r>
+          </w:p>
+        </w:tc>
+        <w:tc>
+          <w:tcPr>
+            <w:tcW w:type="dxa" w:w="1701"/>
+          </w:tcPr>
+          <w:p>
+            <w:pPr>
+              <w:spacing w:before="20" w:after="20"/>
+            </w:pPr>
+            <w:r>
+              <w:rPr>
+                <w:sz w:val="18"/>
+              </w:rPr>
+              <w:t>22 %</w:t>
             </w:r>
           </w:p>
         </w:tc>
@@ -8711,33 +10174,17 @@
       <w:tr>
         <w:tc>
           <w:tcPr>
-            <w:tcW w:type="dxa" w:w="2268"/>
-          </w:tcPr>
-          <w:p>
-            <w:pPr>
-              <w:spacing w:before="20" w:after="20"/>
-            </w:pPr>
-            <w:r>
-              <w:rPr>
-                <w:sz w:val="18"/>
-              </w:rPr>
-              <w:t>Brazadas entre 30 y 40 s</w:t>
-            </w:r>
-          </w:p>
-        </w:tc>
-        <w:tc>
-          <w:tcPr>
-            <w:tcW w:type="dxa" w:w="2551"/>
-          </w:tcPr>
-          <w:p>
-            <w:pPr>
-              <w:spacing w:before="20" w:after="20"/>
-            </w:pPr>
-            <w:r>
-              <w:rPr>
-                <w:sz w:val="18"/>
-              </w:rPr>
-              <w:t>18</w:t>
+            <w:tcW w:type="dxa" w:w="3118"/>
+          </w:tcPr>
+          <w:p>
+            <w:pPr>
+              <w:spacing w:before="20" w:after="20"/>
+            </w:pPr>
+            <w:r>
+              <w:rPr>
+                <w:sz w:val="18"/>
+              </w:rPr>
+              <w:t>Flexión del codo en el agarre</w:t>
             </w:r>
           </w:p>
         </w:tc>
@@ -8753,23 +10200,435 @@
               <w:rPr>
                 <w:sz w:val="18"/>
               </w:rPr>
-              <w:t>15</w:t>
-            </w:r>
-          </w:p>
-        </w:tc>
-        <w:tc>
-          <w:tcPr>
-            <w:tcW w:type="dxa" w:w="2268"/>
-          </w:tcPr>
-          <w:p>
-            <w:pPr>
-              <w:spacing w:before="20" w:after="20"/>
-            </w:pPr>
-            <w:r>
-              <w:rPr>
-                <w:sz w:val="18"/>
-              </w:rPr>
-              <w:t>−3 (hueco de detección hacia 32,5 s)</w:t>
+              <w:t>125°</w:t>
+            </w:r>
+          </w:p>
+        </w:tc>
+        <w:tc>
+          <w:tcPr>
+            <w:tcW w:type="dxa" w:w="1701"/>
+          </w:tcPr>
+          <w:p>
+            <w:pPr>
+              <w:spacing w:before="20" w:after="20"/>
+            </w:pPr>
+            <w:r>
+              <w:rPr>
+                <w:sz w:val="18"/>
+              </w:rPr>
+              <w:t>16,6°</w:t>
+            </w:r>
+          </w:p>
+        </w:tc>
+        <w:tc>
+          <w:tcPr>
+            <w:tcW w:type="dxa" w:w="1701"/>
+          </w:tcPr>
+          <w:p>
+            <w:pPr>
+              <w:spacing w:before="20" w:after="20"/>
+            </w:pPr>
+            <w:r>
+              <w:rPr>
+                <w:sz w:val="18"/>
+              </w:rPr>
+              <w:t>13 %</w:t>
+            </w:r>
+          </w:p>
+        </w:tc>
+      </w:tr>
+      <w:tr>
+        <w:tc>
+          <w:tcPr>
+            <w:tcW w:type="dxa" w:w="3118"/>
+          </w:tcPr>
+          <w:p>
+            <w:pPr>
+              <w:spacing w:before="20" w:after="20"/>
+            </w:pPr>
+            <w:r>
+              <w:rPr>
+                <w:sz w:val="18"/>
+              </w:rPr>
+              <w:t>Apertura del hombro</w:t>
+            </w:r>
+          </w:p>
+        </w:tc>
+        <w:tc>
+          <w:tcPr>
+            <w:tcW w:type="dxa" w:w="1984"/>
+          </w:tcPr>
+          <w:p>
+            <w:pPr>
+              <w:spacing w:before="20" w:after="20"/>
+            </w:pPr>
+            <w:r>
+              <w:rPr>
+                <w:sz w:val="18"/>
+              </w:rPr>
+              <w:t>134°</w:t>
+            </w:r>
+          </w:p>
+        </w:tc>
+        <w:tc>
+          <w:tcPr>
+            <w:tcW w:type="dxa" w:w="1701"/>
+          </w:tcPr>
+          <w:p>
+            <w:pPr>
+              <w:spacing w:before="20" w:after="20"/>
+            </w:pPr>
+            <w:r>
+              <w:rPr>
+                <w:sz w:val="18"/>
+              </w:rPr>
+              <w:t>39,7°</w:t>
+            </w:r>
+          </w:p>
+        </w:tc>
+        <w:tc>
+          <w:tcPr>
+            <w:tcW w:type="dxa" w:w="1701"/>
+          </w:tcPr>
+          <w:p>
+            <w:pPr>
+              <w:spacing w:before="20" w:after="20"/>
+            </w:pPr>
+            <w:r>
+              <w:rPr>
+                <w:sz w:val="18"/>
+              </w:rPr>
+              <w:t>30 %</w:t>
+            </w:r>
+          </w:p>
+        </w:tc>
+      </w:tr>
+      <w:tr>
+        <w:tc>
+          <w:tcPr>
+            <w:tcW w:type="dxa" w:w="3118"/>
+          </w:tcPr>
+          <w:p>
+            <w:pPr>
+              <w:spacing w:before="20" w:after="20"/>
+            </w:pPr>
+            <w:r>
+              <w:rPr>
+                <w:sz w:val="18"/>
+              </w:rPr>
+              <w:t>Ángulo de cadera</w:t>
+            </w:r>
+          </w:p>
+        </w:tc>
+        <w:tc>
+          <w:tcPr>
+            <w:tcW w:type="dxa" w:w="1984"/>
+          </w:tcPr>
+          <w:p>
+            <w:pPr>
+              <w:spacing w:before="20" w:after="20"/>
+            </w:pPr>
+            <w:r>
+              <w:rPr>
+                <w:sz w:val="18"/>
+              </w:rPr>
+              <w:t>166°</w:t>
+            </w:r>
+          </w:p>
+        </w:tc>
+        <w:tc>
+          <w:tcPr>
+            <w:tcW w:type="dxa" w:w="1701"/>
+          </w:tcPr>
+          <w:p>
+            <w:pPr>
+              <w:spacing w:before="20" w:after="20"/>
+            </w:pPr>
+            <w:r>
+              <w:rPr>
+                <w:sz w:val="18"/>
+              </w:rPr>
+              <w:t>14,6°</w:t>
+            </w:r>
+          </w:p>
+        </w:tc>
+        <w:tc>
+          <w:tcPr>
+            <w:tcW w:type="dxa" w:w="1701"/>
+          </w:tcPr>
+          <w:p>
+            <w:pPr>
+              <w:spacing w:before="20" w:after="20"/>
+            </w:pPr>
+            <w:r>
+              <w:rPr>
+                <w:sz w:val="18"/>
+              </w:rPr>
+              <w:t>9 %</w:t>
+            </w:r>
+          </w:p>
+        </w:tc>
+      </w:tr>
+      <w:tr>
+        <w:tc>
+          <w:tcPr>
+            <w:tcW w:type="dxa" w:w="3118"/>
+          </w:tcPr>
+          <w:p>
+            <w:pPr>
+              <w:spacing w:before="20" w:after="20"/>
+            </w:pPr>
+            <w:r>
+              <w:rPr>
+                <w:sz w:val="18"/>
+              </w:rPr>
+              <w:t>Flexión de rodilla</w:t>
+            </w:r>
+          </w:p>
+        </w:tc>
+        <w:tc>
+          <w:tcPr>
+            <w:tcW w:type="dxa" w:w="1984"/>
+          </w:tcPr>
+          <w:p>
+            <w:pPr>
+              <w:spacing w:before="20" w:after="20"/>
+            </w:pPr>
+            <w:r>
+              <w:rPr>
+                <w:sz w:val="18"/>
+              </w:rPr>
+              <w:t>149°</w:t>
+            </w:r>
+          </w:p>
+        </w:tc>
+        <w:tc>
+          <w:tcPr>
+            <w:tcW w:type="dxa" w:w="1701"/>
+          </w:tcPr>
+          <w:p>
+            <w:pPr>
+              <w:spacing w:before="20" w:after="20"/>
+            </w:pPr>
+            <w:r>
+              <w:rPr>
+                <w:sz w:val="18"/>
+              </w:rPr>
+              <w:t>31,5°</w:t>
+            </w:r>
+          </w:p>
+        </w:tc>
+        <w:tc>
+          <w:tcPr>
+            <w:tcW w:type="dxa" w:w="1701"/>
+          </w:tcPr>
+          <w:p>
+            <w:pPr>
+              <w:spacing w:before="20" w:after="20"/>
+            </w:pPr>
+            <w:r>
+              <w:rPr>
+                <w:sz w:val="18"/>
+              </w:rPr>
+              <w:t>21 %</w:t>
+            </w:r>
+          </w:p>
+        </w:tc>
+      </w:tr>
+      <w:tr>
+        <w:tc>
+          <w:tcPr>
+            <w:tcW w:type="dxa" w:w="3118"/>
+          </w:tcPr>
+          <w:p>
+            <w:pPr>
+              <w:spacing w:before="20" w:after="20"/>
+            </w:pPr>
+            <w:r>
+              <w:rPr>
+                <w:sz w:val="18"/>
+              </w:rPr>
+              <w:t>Alcance del brazo</w:t>
+            </w:r>
+          </w:p>
+        </w:tc>
+        <w:tc>
+          <w:tcPr>
+            <w:tcW w:type="dxa" w:w="1984"/>
+          </w:tcPr>
+          <w:p>
+            <w:pPr>
+              <w:spacing w:before="20" w:after="20"/>
+            </w:pPr>
+            <w:r>
+              <w:rPr>
+                <w:sz w:val="18"/>
+              </w:rPr>
+              <w:t>2,08 troncos</w:t>
+            </w:r>
+          </w:p>
+        </w:tc>
+        <w:tc>
+          <w:tcPr>
+            <w:tcW w:type="dxa" w:w="1701"/>
+          </w:tcPr>
+          <w:p>
+            <w:pPr>
+              <w:spacing w:before="20" w:after="20"/>
+            </w:pPr>
+            <w:r>
+              <w:rPr>
+                <w:sz w:val="18"/>
+              </w:rPr>
+              <w:t>0,63</w:t>
+            </w:r>
+          </w:p>
+        </w:tc>
+        <w:tc>
+          <w:tcPr>
+            <w:tcW w:type="dxa" w:w="1701"/>
+          </w:tcPr>
+          <w:p>
+            <w:pPr>
+              <w:spacing w:before="20" w:after="20"/>
+            </w:pPr>
+            <w:r>
+              <w:rPr>
+                <w:sz w:val="18"/>
+              </w:rPr>
+              <w:t>30 %</w:t>
+            </w:r>
+          </w:p>
+        </w:tc>
+      </w:tr>
+      <w:tr>
+        <w:tc>
+          <w:tcPr>
+            <w:tcW w:type="dxa" w:w="3118"/>
+          </w:tcPr>
+          <w:p>
+            <w:pPr>
+              <w:spacing w:before="20" w:after="20"/>
+            </w:pPr>
+            <w:r>
+              <w:rPr>
+                <w:sz w:val="18"/>
+              </w:rPr>
+              <w:t>Inclinación del tronco</w:t>
+            </w:r>
+          </w:p>
+        </w:tc>
+        <w:tc>
+          <w:tcPr>
+            <w:tcW w:type="dxa" w:w="1984"/>
+          </w:tcPr>
+          <w:p>
+            <w:pPr>
+              <w:spacing w:before="20" w:after="20"/>
+            </w:pPr>
+            <w:r>
+              <w:rPr>
+                <w:sz w:val="18"/>
+              </w:rPr>
+              <w:t>8,5°</w:t>
+            </w:r>
+          </w:p>
+        </w:tc>
+        <w:tc>
+          <w:tcPr>
+            <w:tcW w:type="dxa" w:w="1701"/>
+          </w:tcPr>
+          <w:p>
+            <w:pPr>
+              <w:spacing w:before="20" w:after="20"/>
+            </w:pPr>
+            <w:r>
+              <w:rPr>
+                <w:sz w:val="18"/>
+              </w:rPr>
+              <w:t>4,1°</w:t>
+            </w:r>
+          </w:p>
+        </w:tc>
+        <w:tc>
+          <w:tcPr>
+            <w:tcW w:type="dxa" w:w="1701"/>
+          </w:tcPr>
+          <w:p>
+            <w:pPr>
+              <w:spacing w:before="20" w:after="20"/>
+            </w:pPr>
+            <w:r>
+              <w:rPr>
+                <w:sz w:val="18"/>
+              </w:rPr>
+              <w:t>49 %</w:t>
+            </w:r>
+          </w:p>
+        </w:tc>
+      </w:tr>
+      <w:tr>
+        <w:tc>
+          <w:tcPr>
+            <w:tcW w:type="dxa" w:w="3118"/>
+          </w:tcPr>
+          <w:p>
+            <w:pPr>
+              <w:spacing w:before="20" w:after="20"/>
+            </w:pPr>
+            <w:r>
+              <w:rPr>
+                <w:sz w:val="18"/>
+              </w:rPr>
+              <w:t>Amplitud de patada</w:t>
+            </w:r>
+          </w:p>
+        </w:tc>
+        <w:tc>
+          <w:tcPr>
+            <w:tcW w:type="dxa" w:w="1984"/>
+          </w:tcPr>
+          <w:p>
+            <w:pPr>
+              <w:spacing w:before="20" w:after="20"/>
+            </w:pPr>
+            <w:r>
+              <w:rPr>
+                <w:sz w:val="18"/>
+              </w:rPr>
+              <w:t>0,49 troncos</w:t>
+            </w:r>
+          </w:p>
+        </w:tc>
+        <w:tc>
+          <w:tcPr>
+            <w:tcW w:type="dxa" w:w="1701"/>
+          </w:tcPr>
+          <w:p>
+            <w:pPr>
+              <w:spacing w:before="20" w:after="20"/>
+            </w:pPr>
+            <w:r>
+              <w:rPr>
+                <w:sz w:val="18"/>
+              </w:rPr>
+              <w:t>0,29</w:t>
+            </w:r>
+          </w:p>
+        </w:tc>
+        <w:tc>
+          <w:tcPr>
+            <w:tcW w:type="dxa" w:w="1701"/>
+          </w:tcPr>
+          <w:p>
+            <w:pPr>
+              <w:spacing w:before="20" w:after="20"/>
+            </w:pPr>
+            <w:r>
+              <w:rPr>
+                <w:sz w:val="18"/>
+              </w:rPr>
+              <w:t>59 %</w:t>
             </w:r>
           </w:p>
         </w:tc>
@@ -8782,10 +10641,112 @@
     </w:p>
     <w:p>
       <w:pPr>
+        <w:keepNext/>
+        <w:jc w:val="center"/>
+      </w:pPr>
+      <w:r>
+        <w:drawing>
+          <wp:inline xmlns:a="http://schemas.openxmlformats.org/drawingml/2006/main" xmlns:pic="http://schemas.openxmlformats.org/drawingml/2006/picture">
+            <wp:extent cx="5400000" cy="2492308"/>
+            <wp:docPr id="10" name="Picture 10"/>
+            <wp:cNvGraphicFramePr>
+              <a:graphicFrameLocks noChangeAspect="1"/>
+            </wp:cNvGraphicFramePr>
+            <a:graphic>
+              <a:graphicData uri="http://schemas.openxmlformats.org/drawingml/2006/picture">
+                <pic:pic>
+                  <pic:nvPicPr>
+                    <pic:cNvPr id="0" name="aaron_variables.png"/>
+                    <pic:cNvPicPr/>
+                  </pic:nvPicPr>
+                  <pic:blipFill>
+                    <a:blip r:embed="rId23"/>
+                    <a:stretch>
+                      <a:fillRect/>
+                    </a:stretch>
+                  </pic:blipFill>
+                  <pic:spPr>
+                    <a:xfrm>
+                      <a:off x="0" y="0"/>
+                      <a:ext cx="5400000" cy="2492308"/>
+                    </a:xfrm>
+                    <a:prstGeom prst="rect"/>
+                  </pic:spPr>
+                </pic:pic>
+              </a:graphicData>
+            </a:graphic>
+          </wp:inline>
+        </w:drawing>
+      </w:r>
+    </w:p>
+    <w:p>
+      <w:pPr>
+        <w:pStyle w:val="Caption"/>
+        <w:jc w:val="center"/>
+      </w:pPr>
+      <w:r>
+        <w:t xml:space="preserve">Figura </w:t>
+      </w:r>
+      <w:r>
+        <w:fldChar w:fldCharType="begin"/>
+      </w:r>
+      <w:r>
+        <w:instrText xml:space="preserve"> SEQ Figura \* ARABIC </w:instrText>
+      </w:r>
+      <w:r>
+        <w:fldChar w:fldCharType="separate"/>
+      </w:r>
+      <w:r>
+        <w:t>1</w:t>
+      </w:r>
+      <w:r>
+        <w:fldChar w:fldCharType="end"/>
+      </w:r>
+      <w:r>
+        <w:t xml:space="preserve">. </w:t>
+      </w:r>
+      <w:r>
+        <w:t>Aaron (crol): valor de cada ciclo y mediana por clip.</w:t>
+      </w:r>
+    </w:p>
+    <w:p>
+      <w:pPr>
         <w:jc w:val="both"/>
       </w:pPr>
       <w:r>
-        <w:t>Ángulos en vista lateral (2D, medianas por fotograma): codo 144-156°, hombro 81-90°, cadera 171-172° y rodilla 173°, coherentes con un crol con el cuerpo alineado; inclinación media del tronco de 9°. En los 9 ciclos no se detecta fatiga sostenida: son unos 13 s de una sola pasada y el sistema no da una falsa alarma.</w:t>
+        <w:t>La cadera a 166° y el tronco a 8,5° describen un cuerpo alineado y casi horizontal. Las variables de las piernas (rodilla y patada) son las más variables entre ciclos, lo que coincide con que son las peor detectadas bajo el agua; no deben leerse como cambios de técnica sin más datos.</w:t>
+      </w:r>
+    </w:p>
+    <w:p>
+      <w:pPr>
+        <w:pStyle w:val="Ttulo3"/>
+      </w:pPr>
+      <w:r>
+        <w:t>Fatiga en vídeo real</w:t>
+      </w:r>
+    </w:p>
+    <w:p>
+      <w:pPr>
+        <w:jc w:val="both"/>
+      </w:pPr>
+      <w:r>
+        <w:t xml:space="preserve">La sesión de GoPro reúne 10 ciclos y </w:t>
+      </w:r>
+      <w:r>
+        <w:rPr>
+          <w:b/>
+        </w:rPr>
+        <w:t>no se detecta fatiga sostenida</w:t>
+      </w:r>
+      <w:r>
+        <w:t xml:space="preserve">; la del móvil reúne 7, por debajo del mínimo de 8 que exige el método. Es el resultado esperado: son pasadas de 10-20 s y el sistema no da una falsa alarma. En GX011614, sin fatiga, los valores SHAP son pequeños (≤ 0,1, frente a 0,4-0,6 en el nadador sintético) y se concentran en las piernas: explican la variabilidad de la detección, no un cambio técnico. Para localizar la fatiga en vídeo real hacen falta al menos unos 20 ciclos seguidos (25-30 s de nado continuo). </w:t>
+      </w:r>
+      <w:r>
+        <w:rPr>
+          <w:b/>
+          <w:color w:val="C00000"/>
+        </w:rPr>
+        <w:t>[PENDIENTE: análisis de un vídeo de nado continuo (vídeos largos de la autora): ciclo y segundo de inicio, figuras SHAP y explicación para el entrenador; extensión a los 8 nadadores.]</w:t>
       </w:r>
     </w:p>
     <w:p>
@@ -9187,39 +11148,7 @@
         <w:jc w:val="both"/>
       </w:pPr>
       <w:r>
-        <w:t>MotionBERT reconstruye mal las piernas de un nadador horizontal: coloca la rodilla a 107°, como si estuviera sentado, cuando la imagen la muestra casi extendida (173°), y comprime el rango del hombro. Por eso, en vista lateral los ángulos se calculan en 2D y el 3D se guarda aparte; en vistas frontales u oblicuas se usa el 3D (</w:t>
-      </w:r>
-      <w:r>
-        <w:rPr>
-          <w:rFonts w:ascii="Consolas" w:hAnsi="Consolas"/>
-        </w:rPr>
-        <w:t>--vista otra</w:t>
-      </w:r>
-      <w:r>
-        <w:t>).</w:t>
-      </w:r>
-    </w:p>
-    <w:p>
-      <w:pPr>
-        <w:pStyle w:val="Ttulo3"/>
-      </w:pPr>
-      <w:r>
-        <w:t>Fatiga en sesión y en vídeos largos</w:t>
-      </w:r>
-    </w:p>
-    <w:p>
-      <w:pPr>
-        <w:jc w:val="both"/>
-      </w:pPr>
-      <w:r>
-        <w:t xml:space="preserve">Se unieron tres pasadas de Aaron de la misma sesión (GX011614, GX011617 y GX011618). Las dos últimas dieron muy poca detección (10 % y 20 %) y 0 y 1 ciclos válidos, así que la sesión no reúne ciclos suficientes para concluir sobre la fatiga. </w:t>
-      </w:r>
-      <w:r>
-        <w:rPr>
-          <w:b/>
-          <w:color w:val="C00000"/>
-        </w:rPr>
-        <w:t>[PENDIENTE: resultado de fatiga en vídeos largos (GX010664, GX010665 y los nuevos vídeos): ciclo y segundo de inicio, figuras SHAP y explicación para el entrenador; extensión a los 8 nadadores; clasificación del estilo con GroupKFold.]</w:t>
+        <w:t>MotionBERT reconstruye mal las piernas de un nadador horizontal: coloca la rodilla a 107°, como si estuviera sentado, cuando la imagen la muestra casi extendida (173°), y comprime el rango del hombro. Por eso, en vista lateral los ángulos se calculan en 2D y el 3D se guarda aparte; en las vistas frontal y oblicua se usa el 3D.</w:t>
       </w:r>
     </w:p>
     <w:p>
@@ -9527,10 +11456,10 @@
         <w:rPr>
           <w:b/>
         </w:rPr>
-        <w:t>MoveNet → YOLOv8n.</w:t>
-      </w:r>
-      <w:r>
-        <w:t xml:space="preserve"> MoveNet se eligió por fluidez, pero la comparativa sobre vídeo subacuático mostró el doble de confianza con YOLO y cinco veces más ciclos válidos.</w:t>
+        <w:t>Solo vista lateral → lateral y frontal.</w:t>
+      </w:r>
+      <w:r>
+        <w:t xml:space="preserve"> Parte de los vídeos se grabó de frente, donde la profundidad de la mano no se ve; se añadió una señal propia para esa vista.</w:t>
       </w:r>
     </w:p>
     <w:p>
@@ -9547,10 +11476,10 @@
         <w:rPr>
           <w:b/>
         </w:rPr>
-        <w:t>Sensores inerciales (IMU) → solo vídeo.</w:t>
-      </w:r>
-      <w:r>
-        <w:t xml:space="preserve"> No se dispuso de sensores; la fusión con IMU queda como trabajo futuro.</w:t>
+        <w:t>MoveNet → YOLOv8n.</w:t>
+      </w:r>
+      <w:r>
+        <w:t xml:space="preserve"> MoveNet se eligió por fluidez, pero la comparativa sobre vídeo subacuático mostró el doble de confianza con YOLO y cinco veces más ciclos válidos.</w:t>
       </w:r>
     </w:p>
     <w:p>
@@ -9567,10 +11496,10 @@
         <w:rPr>
           <w:b/>
         </w:rPr>
-        <w:t>LSTM supervisado → Isolation Forest no supervisado.</w:t>
-      </w:r>
-      <w:r>
-        <w:t xml:space="preserve"> No hay etiquetas de fatiga; comparar al nadador con su propio estado fresco no las necesita y permite una explicación SHAP exacta.</w:t>
+        <w:t>Sensores inerciales (IMU) → solo vídeo.</w:t>
+      </w:r>
+      <w:r>
+        <w:t xml:space="preserve"> No se dispuso de sensores; la fusión con IMU queda como trabajo futuro.</w:t>
       </w:r>
     </w:p>
     <w:p>
@@ -9587,10 +11516,10 @@
         <w:rPr>
           <w:b/>
         </w:rPr>
-        <w:t>Potencia en vatios → indicadores cinemáticos.</w:t>
-      </w:r>
-      <w:r>
-        <w:t xml:space="preserve"> La potencia depende de C_D y A, no medibles desde vídeo.</w:t>
+        <w:t>LSTM supervisado → Isolation Forest no supervisado.</w:t>
+      </w:r>
+      <w:r>
+        <w:t xml:space="preserve"> No hay etiquetas de fatiga; comparar al nadador con su propio estado fresco no las necesita y permite una explicación SHAP exacta.</w:t>
       </w:r>
     </w:p>
     <w:p>
@@ -9607,10 +11536,10 @@
         <w:rPr>
           <w:b/>
         </w:rPr>
-        <w:t>Validación por fotograma → validación por vídeo.</w:t>
-      </w:r>
-      <w:r>
-        <w:t xml:space="preserve"> El 99,99 % de precisión anterior era fuga de datos.</w:t>
+        <w:t>Potencia en vatios → indicadores cinemáticos.</w:t>
+      </w:r>
+      <w:r>
+        <w:t xml:space="preserve"> La potencia depende de C_D y A, no medibles desde vídeo.</w:t>
       </w:r>
     </w:p>
     <w:p>
@@ -9627,18 +11556,10 @@
         <w:rPr>
           <w:b/>
         </w:rPr>
-        <w:t>Colab con GPU → portátil en CPU.</w:t>
-      </w:r>
-      <w:r>
-        <w:t xml:space="preserve"> Para un uso real en un club, sin coste y sin subir los vídeos.</w:t>
-      </w:r>
-    </w:p>
-    <w:p>
-      <w:pPr>
-        <w:pStyle w:val="Ttulo2"/>
-      </w:pPr>
-      <w:r>
-        <w:t>Limitaciones</w:t>
+        <w:t>Validación por fotograma → validación por vídeo.</w:t>
+      </w:r>
+      <w:r>
+        <w:t xml:space="preserve"> El 99,99 % de precisión anterior era fuga de datos.</w:t>
       </w:r>
     </w:p>
     <w:p>
@@ -9652,7 +11573,21 @@
       </w:pPr>
       <w:pPr/>
       <w:r>
-        <w:t>Una sola cámara: los ángulos 2D son proyecciones; la refracción y la rotación del cuerpo los distorsionan.</w:t>
+        <w:rPr>
+          <w:b/>
+        </w:rPr>
+        <w:t>Colab con GPU → portátil en CPU.</w:t>
+      </w:r>
+      <w:r>
+        <w:t xml:space="preserve"> Para un uso real en un club, sin coste y sin subir los vídeos.</w:t>
+      </w:r>
+    </w:p>
+    <w:p>
+      <w:pPr>
+        <w:pStyle w:val="Ttulo2"/>
+      </w:pPr>
+      <w:r>
+        <w:t>Limitaciones</w:t>
       </w:r>
     </w:p>
     <w:p>
@@ -9666,7 +11601,7 @@
       </w:pPr>
       <w:pPr/>
       <w:r>
-        <w:t>En vista lateral el modelo no distingue el brazo izquierdo del derecho: la asimetría y el codo de cada lado son poco fiables en esta vista.</w:t>
+        <w:t>Una sola cámara: los ángulos 2D son proyecciones; la refracción y la rotación del cuerpo los distorsionan.</w:t>
       </w:r>
     </w:p>
     <w:p>
@@ -9680,7 +11615,7 @@
       </w:pPr>
       <w:pPr/>
       <w:r>
-        <w:t>Detección parcial: con YOLOv8n en CPU, el nadador es analizable en torno a un tercio del vídeo.</w:t>
+        <w:t>En vista lateral el modelo no distingue el brazo izquierdo del derecho: la asimetría y el codo de cada lado son poco fiables en esta vista.</w:t>
       </w:r>
     </w:p>
     <w:p>
@@ -9694,7 +11629,7 @@
       </w:pPr>
       <w:pPr/>
       <w:r>
-        <w:t>La fase base supone que el nadador empieza fresco; si llega fatigado, el inicio se subestima.</w:t>
+        <w:t>Detección parcial: con YOLOv8n en CPU, el nadador es analizable en torno a un tercio del vídeo y, de frente, se encuentran entre el 38 % y el 50 % de los ciclos.</w:t>
       </w:r>
     </w:p>
     <w:p>
@@ -9708,7 +11643,7 @@
       </w:pPr>
       <w:pPr/>
       <w:r>
-        <w:t>Falta contrastar el momento de fatiga con una referencia independiente (lactato, esfuerzo percibido o entrenador).</w:t>
+        <w:t>La vista (lateral o frontal) la indica el usuario en la lista de vídeos; si se equivoca, el conteo empeora (con la señal frontal en un clip lateral el error pasó del 6,5 % al 14 %).</w:t>
       </w:r>
     </w:p>
     <w:p>
@@ -9722,139 +11657,8 @@
       </w:pPr>
       <w:pPr/>
       <w:r>
-        <w:t xml:space="preserve">Los resultados reales corresponden por ahora a un nadador </w:t>
-      </w:r>
-      <w:r>
-        <w:rPr>
-          <w:b/>
-          <w:color w:val="C00000"/>
-        </w:rPr>
-        <w:t>[PENDIENTE: ampliar a 8]</w:t>
-      </w:r>
-      <w:r>
-        <w:t>.</w:t>
-      </w:r>
-    </w:p>
-    <w:p/>
-    <w:p>
-      <w:pPr>
-        <w:pStyle w:val="Ttulo1"/>
-      </w:pPr>
-      <w:bookmarkStart w:id="73" w:name="_Toc37758906"/>
-      <w:bookmarkStart w:id="74" w:name="_Toc37845891"/>
-      <w:r>
-        <w:lastRenderedPageBreak/>
-        <w:t>CONCLUSIONES</w:t>
-      </w:r>
-      <w:bookmarkEnd w:id="73"/>
-      <w:bookmarkEnd w:id="74"/>
-    </w:p>
-    <w:p>
-      <w:pPr>
-        <w:pStyle w:val="Ttulo2"/>
-      </w:pPr>
-      <w:bookmarkStart w:id="75" w:name="_Toc37758907"/>
-      <w:bookmarkStart w:id="76" w:name="_Toc37845892"/>
-      <w:r>
-        <w:t>Conclusiones del trabajo</w:t>
-      </w:r>
-      <w:bookmarkEnd w:id="75"/>
-      <w:bookmarkEnd w:id="76"/>
-    </w:p>
-    <w:p>
-      <w:pPr>
-        <w:jc w:val="both"/>
-      </w:pPr>
-      <w:r>
-        <w:t xml:space="preserve">Se ha desarrollado un sistema completo que funciona en la CPU de un portátil y que convierte un vídeo de nado en eficiencia, momento de fatiga y explicación por variable. Con datos sintéticos, la detección de fatiga y la explicación SHAP recuperan la transición y las variables introducidas. Con vídeo real, el conteo de brazadas se aproxima a la cuenta manual (error del 6,5 %) y los filtros eliminan los esqueletos erróneos. La comparativa sobre el propio vídeo subacuático resultó más útil que las métricas de COCO para elegir el modelo de pose, y la validación del 3D mostró dónde se puede confiar en él. </w:t>
-      </w:r>
-      <w:r>
-        <w:rPr>
-          <w:b/>
-          <w:color w:val="C00000"/>
-        </w:rPr>
-        <w:t>[PENDIENTE: conclusión sobre la fatiga en vídeo real.]</w:t>
-      </w:r>
-    </w:p>
-    <w:p>
-      <w:pPr>
-        <w:pStyle w:val="Sinespaciado"/>
-        <w:jc w:val="both"/>
-        <w:rPr>
-          <w:color w:val="FF0000"/>
-        </w:rPr>
-      </w:pPr>
-    </w:p>
-    <w:p>
-      <w:pPr>
-        <w:pStyle w:val="Ttulo2"/>
-      </w:pPr>
-      <w:bookmarkStart w:id="77" w:name="_Toc37758908"/>
-      <w:bookmarkStart w:id="78" w:name="_Toc37845893"/>
-      <w:r>
-        <w:t>Conclusiones personales</w:t>
-      </w:r>
-      <w:bookmarkEnd w:id="77"/>
-      <w:bookmarkEnd w:id="78"/>
-    </w:p>
-    <w:p>
-      <w:pPr>
-        <w:jc w:val="both"/>
-      </w:pPr>
-      <w:r>
-        <w:rPr>
-          <w:b/>
-          <w:color w:val="C00000"/>
-        </w:rPr>
-        <w:t>[PENDIENTE: impresiones y aprendizajes de Diana durante el proyecto.]</w:t>
-      </w:r>
-    </w:p>
-    <w:p>
-      <w:pPr>
-        <w:pStyle w:val="Sinespaciado"/>
-        <w:jc w:val="both"/>
-        <w:rPr>
-          <w:color w:val="FF0000"/>
-        </w:rPr>
-      </w:pPr>
-    </w:p>
-    <w:p>
-      <w:pPr>
-        <w:pStyle w:val="Sinespaciado"/>
-        <w:jc w:val="both"/>
-        <w:rPr>
-          <w:color w:val="FF0000"/>
-        </w:rPr>
-      </w:pPr>
-    </w:p>
-    <w:p>
-      <w:pPr>
-        <w:pStyle w:val="Sinespaciado"/>
-        <w:jc w:val="both"/>
-        <w:rPr>
-          <w:color w:val="FF0000"/>
-        </w:rPr>
-      </w:pPr>
-    </w:p>
-    <w:p>
-      <w:pPr>
-        <w:rPr>
-          <w:color w:val="FF0000"/>
-        </w:rPr>
-      </w:pPr>
-    </w:p>
-    <w:p>
-      <w:pPr>
-        <w:pStyle w:val="Ttulo1"/>
-      </w:pPr>
-      <w:bookmarkStart w:id="79" w:name="_Toc37758909"/>
-      <w:bookmarkStart w:id="80" w:name="_Toc37845894"/>
-      <w:r>
-        <w:lastRenderedPageBreak/>
-        <w:t>FUTURAS LÍNEAS DE TRABAJO</w:t>
-      </w:r>
-      <w:bookmarkEnd w:id="79"/>
-      <w:bookmarkEnd w:id="80"/>
+        <w:t>Los clips disponibles son pasadas cortas: no permiten observar la fatiga en vídeo real.</w:t>
+      </w:r>
     </w:p>
     <w:p>
       <w:pPr>
@@ -9867,7 +11671,7 @@
       </w:pPr>
       <w:pPr/>
       <w:r>
-        <w:t>Analizar los 8 nadadores y comparar sus patrones de fatiga.</w:t>
+        <w:t>La clasificación del estilo no se ha implementado en la versión final.</w:t>
       </w:r>
     </w:p>
     <w:p>
@@ -9881,7 +11685,7 @@
       </w:pPr>
       <w:pPr/>
       <w:r>
-        <w:t>Ajustar el modelo de pose con imágenes subacuáticas etiquetadas (SwimXYZ y fotogramas propios) para distinguir los dos brazos y detectar más fotogramas.</w:t>
+        <w:t>La fase base supone que el nadador empieza fresco; si llega fatigado, el inicio se subestima.</w:t>
       </w:r>
     </w:p>
     <w:p>
@@ -9895,7 +11699,7 @@
       </w:pPr>
       <w:pPr/>
       <w:r>
-        <w:t>Adaptar MotionBERT a natación para obtener ángulos 3D fiables en las piernas.</w:t>
+        <w:t>Falta contrastar el momento de fatiga con una referencia independiente (lactato, esfuerzo percibido o entrenador).</w:t>
       </w:r>
     </w:p>
     <w:p>
@@ -9909,8 +11713,139 @@
       </w:pPr>
       <w:pPr/>
       <w:r>
-        <w:t>Evaluar ViTPose cuando se disponga de GPU.</w:t>
-      </w:r>
+        <w:t xml:space="preserve">Los resultados reales corresponden por ahora a un nadador </w:t>
+      </w:r>
+      <w:r>
+        <w:rPr>
+          <w:b/>
+          <w:color w:val="C00000"/>
+        </w:rPr>
+        <w:t>[PENDIENTE: ampliar a 8]</w:t>
+      </w:r>
+      <w:r>
+        <w:t>.</w:t>
+      </w:r>
+    </w:p>
+    <w:p/>
+    <w:p>
+      <w:pPr>
+        <w:pStyle w:val="Ttulo1"/>
+      </w:pPr>
+      <w:bookmarkStart w:id="73" w:name="_Toc37758906"/>
+      <w:bookmarkStart w:id="74" w:name="_Toc37845891"/>
+      <w:r>
+        <w:lastRenderedPageBreak/>
+        <w:t>CONCLUSIONES</w:t>
+      </w:r>
+      <w:bookmarkEnd w:id="73"/>
+      <w:bookmarkEnd w:id="74"/>
+    </w:p>
+    <w:p>
+      <w:pPr>
+        <w:pStyle w:val="Ttulo2"/>
+      </w:pPr>
+      <w:bookmarkStart w:id="75" w:name="_Toc37758907"/>
+      <w:bookmarkStart w:id="76" w:name="_Toc37845892"/>
+      <w:r>
+        <w:t>Conclusiones del trabajo</w:t>
+      </w:r>
+      <w:bookmarkEnd w:id="75"/>
+      <w:bookmarkEnd w:id="76"/>
+    </w:p>
+    <w:p>
+      <w:pPr>
+        <w:jc w:val="both"/>
+      </w:pPr>
+      <w:r>
+        <w:t xml:space="preserve">Se ha desarrollado un sistema completo que funciona en la CPU de un portátil y que convierte un vídeo de nado en eficiencia, momento de fatiga y explicación por variable. Con datos sintéticos, de lado y de frente, la detección de fatiga y la explicación SHAP recuperan la transición y las variables introducidas. Con vídeo real, el conteo de brazadas se aleja entre un 6,5 % y un 8,2 % de la cuenta manual en tres clips y dos vistas, y las medidas de Aaron describen un crol con el cuerpo alineado. La comparativa sobre el propio vídeo subacuático resultó más útil que las métricas de COCO para elegir el modelo de pose, y la validación del 3D mostró dónde se puede confiar en él. En los clips reales disponibles no se detecta fatiga, lo que es coherente con pasadas cortas; el factor limitante es la detección del nadador y la duración del nado continuo, no el método de fatiga. </w:t>
+      </w:r>
+      <w:r>
+        <w:rPr>
+          <w:b/>
+          <w:color w:val="C00000"/>
+        </w:rPr>
+        <w:t>[PENDIENTE: conclusión sobre la fatiga en un vídeo de nado continuo.]</w:t>
+      </w:r>
+    </w:p>
+    <w:p>
+      <w:pPr>
+        <w:pStyle w:val="Sinespaciado"/>
+        <w:jc w:val="both"/>
+        <w:rPr>
+          <w:color w:val="FF0000"/>
+        </w:rPr>
+      </w:pPr>
+    </w:p>
+    <w:p>
+      <w:pPr>
+        <w:pStyle w:val="Ttulo2"/>
+      </w:pPr>
+      <w:bookmarkStart w:id="77" w:name="_Toc37758908"/>
+      <w:bookmarkStart w:id="78" w:name="_Toc37845893"/>
+      <w:r>
+        <w:t>Conclusiones personales</w:t>
+      </w:r>
+      <w:bookmarkEnd w:id="77"/>
+      <w:bookmarkEnd w:id="78"/>
+    </w:p>
+    <w:p>
+      <w:pPr>
+        <w:jc w:val="both"/>
+      </w:pPr>
+      <w:r>
+        <w:rPr>
+          <w:b/>
+          <w:color w:val="C00000"/>
+        </w:rPr>
+        <w:t>[PENDIENTE: impresiones y aprendizajes de Diana durante el proyecto.]</w:t>
+      </w:r>
+    </w:p>
+    <w:p>
+      <w:pPr>
+        <w:pStyle w:val="Sinespaciado"/>
+        <w:jc w:val="both"/>
+        <w:rPr>
+          <w:color w:val="FF0000"/>
+        </w:rPr>
+      </w:pPr>
+    </w:p>
+    <w:p>
+      <w:pPr>
+        <w:pStyle w:val="Sinespaciado"/>
+        <w:jc w:val="both"/>
+        <w:rPr>
+          <w:color w:val="FF0000"/>
+        </w:rPr>
+      </w:pPr>
+    </w:p>
+    <w:p>
+      <w:pPr>
+        <w:pStyle w:val="Sinespaciado"/>
+        <w:jc w:val="both"/>
+        <w:rPr>
+          <w:color w:val="FF0000"/>
+        </w:rPr>
+      </w:pPr>
+    </w:p>
+    <w:p>
+      <w:pPr>
+        <w:rPr>
+          <w:color w:val="FF0000"/>
+        </w:rPr>
+      </w:pPr>
+    </w:p>
+    <w:p>
+      <w:pPr>
+        <w:pStyle w:val="Ttulo1"/>
+      </w:pPr>
+      <w:bookmarkStart w:id="79" w:name="_Toc37758909"/>
+      <w:bookmarkStart w:id="80" w:name="_Toc37845894"/>
+      <w:r>
+        <w:lastRenderedPageBreak/>
+        <w:t>FUTURAS LÍNEAS DE TRABAJO</w:t>
+      </w:r>
+      <w:bookmarkEnd w:id="79"/>
+      <w:bookmarkEnd w:id="80"/>
     </w:p>
     <w:p>
       <w:pPr>
@@ -9923,7 +11858,7 @@
       </w:pPr>
       <w:pPr/>
       <w:r>
-        <w:t>Modo audio: frecuencia de brazada y respiración a partir del sonido.</w:t>
+        <w:t>Analizar los 8 nadadores y comparar sus patrones de fatiga.</w:t>
       </w:r>
     </w:p>
     <w:p>
@@ -9937,7 +11872,7 @@
       </w:pPr>
       <w:pPr/>
       <w:r>
-        <w:t>Fusión con sensores inerciales (IMU) para medir la velocidad sin calibrar la cámara.</w:t>
+        <w:t>Implementar la clasificación del estilo (XGBoost con validación agrupada por vídeo) cuando haya suficientes vídeos por estilo.</w:t>
       </w:r>
     </w:p>
     <w:p>
@@ -9951,7 +11886,7 @@
       </w:pPr>
       <w:pPr/>
       <w:r>
-        <w:t>Validar el inicio de la fatiga frente a lactato, esfuerzo percibido y valoración del entrenador.</w:t>
+        <w:t>Detectar la vista (lateral o frontal) automáticamente a partir de la orientación del tronco.</w:t>
       </w:r>
     </w:p>
     <w:p>
@@ -9965,6 +11900,90 @@
       </w:pPr>
       <w:pPr/>
       <w:r>
+        <w:t>Ajustar el modelo de pose con imágenes subacuáticas etiquetadas (SwimXYZ y fotogramas propios) para distinguir los dos brazos y detectar más fotogramas.</w:t>
+      </w:r>
+    </w:p>
+    <w:p>
+      <w:pPr>
+        <w:pStyle w:val="Prrafodelista"/>
+        <w:numPr>
+          <w:ilvl w:val="0"/>
+          <w:numId w:val="27"/>
+        </w:numPr>
+        <w:spacing w:before="0" w:after="0"/>
+      </w:pPr>
+      <w:pPr/>
+      <w:r>
+        <w:t>Adaptar MotionBERT a natación para obtener ángulos 3D fiables en las piernas.</w:t>
+      </w:r>
+    </w:p>
+    <w:p>
+      <w:pPr>
+        <w:pStyle w:val="Prrafodelista"/>
+        <w:numPr>
+          <w:ilvl w:val="0"/>
+          <w:numId w:val="27"/>
+        </w:numPr>
+        <w:spacing w:before="0" w:after="0"/>
+      </w:pPr>
+      <w:pPr/>
+      <w:r>
+        <w:t>Evaluar ViTPose cuando se disponga de GPU.</w:t>
+      </w:r>
+    </w:p>
+    <w:p>
+      <w:pPr>
+        <w:pStyle w:val="Prrafodelista"/>
+        <w:numPr>
+          <w:ilvl w:val="0"/>
+          <w:numId w:val="27"/>
+        </w:numPr>
+        <w:spacing w:before="0" w:after="0"/>
+      </w:pPr>
+      <w:pPr/>
+      <w:r>
+        <w:t>Modo audio: frecuencia de brazada y respiración a partir del sonido.</w:t>
+      </w:r>
+    </w:p>
+    <w:p>
+      <w:pPr>
+        <w:pStyle w:val="Prrafodelista"/>
+        <w:numPr>
+          <w:ilvl w:val="0"/>
+          <w:numId w:val="27"/>
+        </w:numPr>
+        <w:spacing w:before="0" w:after="0"/>
+      </w:pPr>
+      <w:pPr/>
+      <w:r>
+        <w:t>Fusión con sensores inerciales (IMU) para medir la velocidad sin calibrar la cámara.</w:t>
+      </w:r>
+    </w:p>
+    <w:p>
+      <w:pPr>
+        <w:pStyle w:val="Prrafodelista"/>
+        <w:numPr>
+          <w:ilvl w:val="0"/>
+          <w:numId w:val="27"/>
+        </w:numPr>
+        <w:spacing w:before="0" w:after="0"/>
+      </w:pPr>
+      <w:pPr/>
+      <w:r>
+        <w:t>Validar el inicio de la fatiga frente a lactato, esfuerzo percibido y valoración del entrenador.</w:t>
+      </w:r>
+    </w:p>
+    <w:p>
+      <w:pPr>
+        <w:pStyle w:val="Prrafodelista"/>
+        <w:numPr>
+          <w:ilvl w:val="0"/>
+          <w:numId w:val="27"/>
+        </w:numPr>
+        <w:spacing w:before="0" w:after="0"/>
+      </w:pPr>
+      <w:pPr/>
+      <w:r>
         <w:t>Grabar sesiones con una cámara que siga al nadador para analizar nado continuo.</w:t>
       </w:r>
     </w:p>
@@ -10425,6 +12444,33 @@
           <w:sz w:val="18"/>
         </w:rPr>
         <w:t>python sesion.py resultados/GX011614 resultados/GX011617 resultados/GX011618 --nadador "Aaron"</w:t>
+      </w:r>
+    </w:p>
+    <w:p>
+      <w:pPr/>
+      <w:r>
+        <w:rPr>
+          <w:sz w:val="18"/>
+        </w:rPr>
+        <w:t>python lote.py --carpeta videos --crear-lista      (y después sin --crear-lista)</w:t>
+      </w:r>
+    </w:p>
+    <w:p>
+      <w:pPr/>
+      <w:r>
+        <w:rPr>
+          <w:sz w:val="18"/>
+        </w:rPr>
+        <w:t>python informe_nadador.py resultados --nadador Aaron --estilo crol</w:t>
+      </w:r>
+    </w:p>
+    <w:p>
+      <w:pPr/>
+      <w:r>
+        <w:rPr>
+          <w:sz w:val="18"/>
+        </w:rPr>
+        <w:t>python probar_deteccion.py "videos/GX011617.MP4" --desde 9 --hasta 29</w:t>
       </w:r>
     </w:p>
     <w:p>
@@ -10772,6 +12818,108 @@
               <w:rPr>
                 <w:sz w:val="18"/>
               </w:rPr>
+              <w:t>lote.py</w:t>
+            </w:r>
+          </w:p>
+        </w:tc>
+        <w:tc>
+          <w:tcPr>
+            <w:tcW w:type="dxa" w:w="6236"/>
+          </w:tcPr>
+          <w:p>
+            <w:pPr>
+              <w:spacing w:before="20" w:after="20"/>
+            </w:pPr>
+            <w:r>
+              <w:rPr>
+                <w:sz w:val="18"/>
+              </w:rPr>
+              <w:t>Análisis de todos los vídeos de una carpeta y de sus sesiones</w:t>
+            </w:r>
+          </w:p>
+        </w:tc>
+      </w:tr>
+      <w:tr>
+        <w:tc>
+          <w:tcPr>
+            <w:tcW w:type="dxa" w:w="2835"/>
+          </w:tcPr>
+          <w:p>
+            <w:pPr>
+              <w:spacing w:before="20" w:after="20"/>
+            </w:pPr>
+            <w:r>
+              <w:rPr>
+                <w:sz w:val="18"/>
+              </w:rPr>
+              <w:t>informe_nadador.py</w:t>
+            </w:r>
+          </w:p>
+        </w:tc>
+        <w:tc>
+          <w:tcPr>
+            <w:tcW w:type="dxa" w:w="6236"/>
+          </w:tcPr>
+          <w:p>
+            <w:pPr>
+              <w:spacing w:before="20" w:after="20"/>
+            </w:pPr>
+            <w:r>
+              <w:rPr>
+                <w:sz w:val="18"/>
+              </w:rPr>
+              <w:t>Informe de un nadador y un estilo</w:t>
+            </w:r>
+          </w:p>
+        </w:tc>
+      </w:tr>
+      <w:tr>
+        <w:tc>
+          <w:tcPr>
+            <w:tcW w:type="dxa" w:w="2835"/>
+          </w:tcPr>
+          <w:p>
+            <w:pPr>
+              <w:spacing w:before="20" w:after="20"/>
+            </w:pPr>
+            <w:r>
+              <w:rPr>
+                <w:sz w:val="18"/>
+              </w:rPr>
+              <w:t>probar_deteccion.py</w:t>
+            </w:r>
+          </w:p>
+        </w:tc>
+        <w:tc>
+          <w:tcPr>
+            <w:tcW w:type="dxa" w:w="6236"/>
+          </w:tcPr>
+          <w:p>
+            <w:pPr>
+              <w:spacing w:before="20" w:after="20"/>
+            </w:pPr>
+            <w:r>
+              <w:rPr>
+                <w:sz w:val="18"/>
+              </w:rPr>
+              <w:t>Comparación de ajustes de YOLO en el tramo con nadador</w:t>
+            </w:r>
+          </w:p>
+        </w:tc>
+      </w:tr>
+      <w:tr>
+        <w:tc>
+          <w:tcPr>
+            <w:tcW w:type="dxa" w:w="2835"/>
+          </w:tcPr>
+          <w:p>
+            <w:pPr>
+              <w:spacing w:before="20" w:after="20"/>
+            </w:pPr>
+            <w:r>
+              <w:rPr>
+                <w:sz w:val="18"/>
+              </w:rPr>
               <w:t>validar_3d.py</w:t>
             </w:r>
           </w:p>
@@ -10861,6 +13009,62 @@
       <w:pPr/>
       <w:r>
         <w:t>tests/test_movenet_recorte.py: conversión de coordenadas del recorte de MoveNet.</w:t>
+      </w:r>
+    </w:p>
+    <w:p>
+      <w:pPr>
+        <w:pStyle w:val="Prrafodelista"/>
+        <w:numPr>
+          <w:ilvl w:val="0"/>
+          <w:numId w:val="27"/>
+        </w:numPr>
+        <w:spacing w:before="0" w:after="0"/>
+      </w:pPr>
+      <w:pPr/>
+      <w:r>
+        <w:t>tests/test_estilos.py: ciclos de mariposa (1 brazada) y crol (2 brazadas).</w:t>
+      </w:r>
+    </w:p>
+    <w:p>
+      <w:pPr>
+        <w:pStyle w:val="Prrafodelista"/>
+        <w:numPr>
+          <w:ilvl w:val="0"/>
+          <w:numId w:val="27"/>
+        </w:numPr>
+        <w:spacing w:before="0" w:after="0"/>
+      </w:pPr>
+      <w:pPr/>
+      <w:r>
+        <w:t>tests/test_frontal.py: nadador sintético visto de frente, con fatiga.</w:t>
+      </w:r>
+    </w:p>
+    <w:p>
+      <w:pPr>
+        <w:pStyle w:val="Prrafodelista"/>
+        <w:numPr>
+          <w:ilvl w:val="0"/>
+          <w:numId w:val="27"/>
+        </w:numPr>
+        <w:spacing w:before="0" w:after="0"/>
+      </w:pPr>
+      <w:pPr/>
+      <w:r>
+        <w:t>tests/test_aaron_frontal.py: clips de móvil de Aaron; exige una frecuencia a menos de un 15 % de la cuenta manual.</w:t>
+      </w:r>
+    </w:p>
+    <w:p>
+      <w:pPr>
+        <w:pStyle w:val="Prrafodelista"/>
+        <w:numPr>
+          <w:ilvl w:val="0"/>
+          <w:numId w:val="27"/>
+        </w:numPr>
+        <w:spacing w:before="0" w:after="0"/>
+      </w:pPr>
+      <w:pPr/>
+      <w:r>
+        <w:t>tests/test_lote.py: lista de vídeos, análisis por lotes y sesión.</w:t>
       </w:r>
     </w:p>
     <w:sectPr>

</xml_diff>

<commit_message>
Caso ficticio: nadador simulado, clasificador de estilo y memoria actualizada
simulador.py genera un nadador de verdad conocida (4 estilos, vista lateral y
frontal, cámara calibrada, fatiga programada); estilo.py clasifica el estilo por
ventanas con bosque aleatorio, GroupKFold por vídeo y SHAP; caso_ficticio.py
reúne la demostración. De frente y sin 3D no se calculan ángulos.

Co-Authored-By: Claude Opus 5.5 <noreply@anthropic.com>
Claude-Session: https://claude.ai/code/session_01DiSvbFm8ugCvoNLrXeNJkq
</commit_message>
<xml_diff>
--- a/memoria/TFM_StrokeLab_borrador.docx
+++ b/memoria/TFM_StrokeLab_borrador.docx
@@ -7644,14 +7644,7 @@
         <w:jc w:val="both"/>
       </w:pPr>
       <w:r>
-        <w:t xml:space="preserve">La clasificación del estilo con XGBoost (Chen y Guestrin, 2016) y validación GroupKFold por vídeo queda planteada pero no implementada en la versión local: el 99,99 % de precisión de una versión anterior se debía a fuga de datos entre fotogramas de un mismo vídeo, y con los vídeos disponibles hay muy pocos por estilo. </w:t>
-      </w:r>
-      <w:r>
-        <w:rPr>
-          <w:b/>
-          <w:color w:val="C00000"/>
-        </w:rPr>
-        <w:t>[PENDIENTE: implementar y evaluar si da tiempo.]</w:t>
+        <w:t>El estilo se clasifica con un bosque aleatorio sobre rasgos por ventana de 4 s, con validación agrupada por vídeo (GroupKFold); el 99,99 % de precisión de una versión anterior se debía a fuga de datos entre fotogramas de un mismo vídeo. Sus resultados se presentan en la Sección 4.6.</w:t>
       </w:r>
     </w:p>
     <w:p>
@@ -8640,6 +8633,655 @@
         <w:pStyle w:val="Ttulo3"/>
       </w:pPr>
       <w:r>
+        <w:t>Caso de demostración con un nadador simulado</w:t>
+      </w:r>
+    </w:p>
+    <w:p>
+      <w:pPr>
+        <w:jc w:val="both"/>
+      </w:pPr>
+      <w:r>
+        <w:t xml:space="preserve">Para mostrar todas las capacidades con una verdad conocida se generó un </w:t>
+      </w:r>
+      <w:r>
+        <w:rPr>
+          <w:b/>
+        </w:rPr>
+        <w:t>nadador ficticio</w:t>
+      </w:r>
+      <w:r>
+        <w:t xml:space="preserve"> (no son datos reales; </w:t>
+      </w:r>
+      <w:r>
+        <w:rPr>
+          <w:rFonts w:ascii="Consolas" w:hAnsi="Consolas"/>
+        </w:rPr>
+        <w:t>caso_ficticio.py</w:t>
+      </w:r>
+      <w:r>
+        <w:t>): crol durante 120 s, con cámara fija que cubre los 25 m (velocidad calibrada) y fatiga programada que sube del 10 % al 90 % entre los segundos 59 y 81 (más frecuencia, menos velocidad y distancia por ciclo, menos alcance, más flexión del codo, cadera hundida y asimetría). Se analizó en vista lateral y frontal (Tabla 6).</w:t>
+      </w:r>
+    </w:p>
+    <w:p>
+      <w:pPr>
+        <w:pStyle w:val="Caption"/>
+        <w:jc w:val="center"/>
+      </w:pPr>
+      <w:r>
+        <w:t xml:space="preserve">Tabla </w:t>
+      </w:r>
+      <w:r>
+        <w:fldChar w:fldCharType="begin"/>
+      </w:r>
+      <w:r>
+        <w:instrText xml:space="preserve"> SEQ Tabla \* ARABIC </w:instrText>
+      </w:r>
+      <w:r>
+        <w:fldChar w:fldCharType="separate"/>
+      </w:r>
+      <w:r>
+        <w:t>1</w:t>
+      </w:r>
+      <w:r>
+        <w:fldChar w:fldCharType="end"/>
+      </w:r>
+      <w:r>
+        <w:t xml:space="preserve">. </w:t>
+      </w:r>
+      <w:r>
+        <w:t>Caso ficticio: resultados del sistema frente a la verdad de la simulación.</w:t>
+      </w:r>
+    </w:p>
+    <w:tbl>
+      <w:tblPr>
+        <w:tblStyle w:val="Tablaconcuadrcula"/>
+        <w:tblW w:type="auto" w:w="0"/>
+        <w:tblLook w:firstColumn="1" w:firstRow="1" w:lastColumn="0" w:lastRow="0" w:noHBand="0" w:noVBand="1" w:val="04A0"/>
+      </w:tblPr>
+      <w:tblGrid>
+        <w:gridCol w:w="2835"/>
+        <w:gridCol w:w="2835"/>
+        <w:gridCol w:w="2835"/>
+      </w:tblGrid>
+      <w:tr>
+        <w:tc>
+          <w:tcPr>
+            <w:tcW w:type="dxa" w:w="2835"/>
+            <w:shd w:val="clear" w:color="auto" w:fill="D9E2F3"/>
+          </w:tcPr>
+          <w:p>
+            <w:pPr>
+              <w:spacing w:before="20" w:after="20"/>
+            </w:pPr>
+            <w:r>
+              <w:rPr>
+                <w:b/>
+                <w:sz w:val="18"/>
+              </w:rPr>
+              <w:t>Medida</w:t>
+            </w:r>
+          </w:p>
+        </w:tc>
+        <w:tc>
+          <w:tcPr>
+            <w:tcW w:type="dxa" w:w="3118"/>
+            <w:shd w:val="clear" w:color="auto" w:fill="D9E2F3"/>
+          </w:tcPr>
+          <w:p>
+            <w:pPr>
+              <w:spacing w:before="20" w:after="20"/>
+            </w:pPr>
+            <w:r>
+              <w:rPr>
+                <w:b/>
+                <w:sz w:val="18"/>
+              </w:rPr>
+              <w:t>Vista lateral</w:t>
+            </w:r>
+          </w:p>
+        </w:tc>
+        <w:tc>
+          <w:tcPr>
+            <w:tcW w:type="dxa" w:w="3118"/>
+            <w:shd w:val="clear" w:color="auto" w:fill="D9E2F3"/>
+          </w:tcPr>
+          <w:p>
+            <w:pPr>
+              <w:spacing w:before="20" w:after="20"/>
+            </w:pPr>
+            <w:r>
+              <w:rPr>
+                <w:b/>
+                <w:sz w:val="18"/>
+              </w:rPr>
+              <w:t>Vista frontal</w:t>
+            </w:r>
+          </w:p>
+        </w:tc>
+      </w:tr>
+      <w:tr>
+        <w:tc>
+          <w:tcPr>
+            <w:tcW w:type="dxa" w:w="2835"/>
+          </w:tcPr>
+          <w:p>
+            <w:pPr>
+              <w:spacing w:before="20" w:after="20"/>
+            </w:pPr>
+            <w:r>
+              <w:rPr>
+                <w:sz w:val="18"/>
+              </w:rPr>
+              <w:t>Ciclos analizados</w:t>
+            </w:r>
+          </w:p>
+        </w:tc>
+        <w:tc>
+          <w:tcPr>
+            <w:tcW w:type="dxa" w:w="3118"/>
+          </w:tcPr>
+          <w:p>
+            <w:pPr>
+              <w:spacing w:before="20" w:after="20"/>
+            </w:pPr>
+            <w:r>
+              <w:rPr>
+                <w:sz w:val="18"/>
+              </w:rPr>
+              <w:t>91</w:t>
+            </w:r>
+          </w:p>
+        </w:tc>
+        <w:tc>
+          <w:tcPr>
+            <w:tcW w:type="dxa" w:w="3118"/>
+          </w:tcPr>
+          <w:p>
+            <w:pPr>
+              <w:spacing w:before="20" w:after="20"/>
+            </w:pPr>
+            <w:r>
+              <w:rPr>
+                <w:sz w:val="18"/>
+              </w:rPr>
+              <w:t>98</w:t>
+            </w:r>
+          </w:p>
+        </w:tc>
+      </w:tr>
+      <w:tr>
+        <w:tc>
+          <w:tcPr>
+            <w:tcW w:type="dxa" w:w="2835"/>
+          </w:tcPr>
+          <w:p>
+            <w:pPr>
+              <w:spacing w:before="20" w:after="20"/>
+            </w:pPr>
+            <w:r>
+              <w:rPr>
+                <w:sz w:val="18"/>
+              </w:rPr>
+              <w:t>Error mediano de la frecuencia de ciclo</w:t>
+            </w:r>
+          </w:p>
+        </w:tc>
+        <w:tc>
+          <w:tcPr>
+            <w:tcW w:type="dxa" w:w="3118"/>
+          </w:tcPr>
+          <w:p>
+            <w:pPr>
+              <w:spacing w:before="20" w:after="20"/>
+            </w:pPr>
+            <w:r>
+              <w:rPr>
+                <w:sz w:val="18"/>
+              </w:rPr>
+              <w:t>4,7 %</w:t>
+            </w:r>
+          </w:p>
+        </w:tc>
+        <w:tc>
+          <w:tcPr>
+            <w:tcW w:type="dxa" w:w="3118"/>
+          </w:tcPr>
+          <w:p>
+            <w:pPr>
+              <w:spacing w:before="20" w:after="20"/>
+            </w:pPr>
+            <w:r>
+              <w:rPr>
+                <w:sz w:val="18"/>
+              </w:rPr>
+              <w:t>0,3 %</w:t>
+            </w:r>
+          </w:p>
+        </w:tc>
+      </w:tr>
+      <w:tr>
+        <w:tc>
+          <w:tcPr>
+            <w:tcW w:type="dxa" w:w="2835"/>
+          </w:tcPr>
+          <w:p>
+            <w:pPr>
+              <w:spacing w:before="20" w:after="20"/>
+            </w:pPr>
+            <w:r>
+              <w:rPr>
+                <w:sz w:val="18"/>
+              </w:rPr>
+              <w:t>Error mediano de la velocidad</w:t>
+            </w:r>
+          </w:p>
+        </w:tc>
+        <w:tc>
+          <w:tcPr>
+            <w:tcW w:type="dxa" w:w="3118"/>
+          </w:tcPr>
+          <w:p>
+            <w:pPr>
+              <w:spacing w:before="20" w:after="20"/>
+            </w:pPr>
+            <w:r>
+              <w:rPr>
+                <w:sz w:val="18"/>
+              </w:rPr>
+              <w:t>1,3 %</w:t>
+            </w:r>
+          </w:p>
+        </w:tc>
+        <w:tc>
+          <w:tcPr>
+            <w:tcW w:type="dxa" w:w="3118"/>
+          </w:tcPr>
+          <w:p>
+            <w:pPr>
+              <w:spacing w:before="20" w:after="20"/>
+            </w:pPr>
+            <w:r>
+              <w:rPr>
+                <w:sz w:val="18"/>
+              </w:rPr>
+              <w:t>no medible de frente</w:t>
+            </w:r>
+          </w:p>
+        </w:tc>
+      </w:tr>
+      <w:tr>
+        <w:tc>
+          <w:tcPr>
+            <w:tcW w:type="dxa" w:w="2835"/>
+          </w:tcPr>
+          <w:p>
+            <w:pPr>
+              <w:spacing w:before="20" w:after="20"/>
+            </w:pPr>
+            <w:r>
+              <w:rPr>
+                <w:sz w:val="18"/>
+              </w:rPr>
+              <w:t>Error mediano de la distancia por ciclo</w:t>
+            </w:r>
+          </w:p>
+        </w:tc>
+        <w:tc>
+          <w:tcPr>
+            <w:tcW w:type="dxa" w:w="3118"/>
+          </w:tcPr>
+          <w:p>
+            <w:pPr>
+              <w:spacing w:before="20" w:after="20"/>
+            </w:pPr>
+            <w:r>
+              <w:rPr>
+                <w:sz w:val="18"/>
+              </w:rPr>
+              <w:t>4,3 %</w:t>
+            </w:r>
+          </w:p>
+        </w:tc>
+        <w:tc>
+          <w:tcPr>
+            <w:tcW w:type="dxa" w:w="3118"/>
+          </w:tcPr>
+          <w:p>
+            <w:pPr>
+              <w:spacing w:before="20" w:after="20"/>
+            </w:pPr>
+            <w:r>
+              <w:rPr>
+                <w:sz w:val="18"/>
+              </w:rPr>
+              <w:t>no medible de frente</w:t>
+            </w:r>
+          </w:p>
+        </w:tc>
+      </w:tr>
+      <w:tr>
+        <w:tc>
+          <w:tcPr>
+            <w:tcW w:type="dxa" w:w="2835"/>
+          </w:tcPr>
+          <w:p>
+            <w:pPr>
+              <w:spacing w:before="20" w:after="20"/>
+            </w:pPr>
+            <w:r>
+              <w:rPr>
+                <w:sz w:val="18"/>
+              </w:rPr>
+              <w:t>Inicio de la fatiga detectado</w:t>
+            </w:r>
+          </w:p>
+        </w:tc>
+        <w:tc>
+          <w:tcPr>
+            <w:tcW w:type="dxa" w:w="3118"/>
+          </w:tcPr>
+          <w:p>
+            <w:pPr>
+              <w:spacing w:before="20" w:after="20"/>
+            </w:pPr>
+            <w:r>
+              <w:rPr>
+                <w:sz w:val="18"/>
+              </w:rPr>
+              <w:t>t = 57,3 s (ciclo 42)</w:t>
+            </w:r>
+          </w:p>
+        </w:tc>
+        <w:tc>
+          <w:tcPr>
+            <w:tcW w:type="dxa" w:w="3118"/>
+          </w:tcPr>
+          <w:p>
+            <w:pPr>
+              <w:spacing w:before="20" w:after="20"/>
+            </w:pPr>
+            <w:r>
+              <w:rPr>
+                <w:sz w:val="18"/>
+              </w:rPr>
+              <w:t>t = 57,8 s (ciclo 45)</w:t>
+            </w:r>
+          </w:p>
+        </w:tc>
+      </w:tr>
+      <w:tr>
+        <w:tc>
+          <w:tcPr>
+            <w:tcW w:type="dxa" w:w="2835"/>
+          </w:tcPr>
+          <w:p>
+            <w:pPr>
+              <w:spacing w:before="20" w:after="20"/>
+            </w:pPr>
+            <w:r>
+              <w:rPr>
+                <w:sz w:val="18"/>
+              </w:rPr>
+              <w:t>Causas principales según SHAP</w:t>
+            </w:r>
+          </w:p>
+        </w:tc>
+        <w:tc>
+          <w:tcPr>
+            <w:tcW w:type="dxa" w:w="3118"/>
+          </w:tcPr>
+          <w:p>
+            <w:pPr>
+              <w:spacing w:before="20" w:after="20"/>
+            </w:pPr>
+            <w:r>
+              <w:rPr>
+                <w:sz w:val="18"/>
+              </w:rPr>
+              <w:t>apertura del hombro (173° → 151°), asimetría de brazos (3 % → 24 %), inclinación del tronco (2,7° → 7,9°)</w:t>
+            </w:r>
+          </w:p>
+        </w:tc>
+        <w:tc>
+          <w:tcPr>
+            <w:tcW w:type="dxa" w:w="3118"/>
+          </w:tcPr>
+          <w:p>
+            <w:pPr>
+              <w:spacing w:before="20" w:after="20"/>
+            </w:pPr>
+            <w:r>
+              <w:rPr>
+                <w:sz w:val="18"/>
+              </w:rPr>
+              <w:t>frecuencia (46,2 → 52,9 ciclos/min), asimetría de brazos (1 % → 23 %), alcance del brazo (−32 %)</w:t>
+            </w:r>
+          </w:p>
+        </w:tc>
+      </w:tr>
+      <w:tr>
+        <w:tc>
+          <w:tcPr>
+            <w:tcW w:type="dxa" w:w="2835"/>
+          </w:tcPr>
+          <w:p>
+            <w:pPr>
+              <w:spacing w:before="20" w:after="20"/>
+            </w:pPr>
+            <w:r>
+              <w:rPr>
+                <w:sz w:val="18"/>
+              </w:rPr>
+              <w:t>Estilo predicho</w:t>
+            </w:r>
+          </w:p>
+        </w:tc>
+        <w:tc>
+          <w:tcPr>
+            <w:tcW w:type="dxa" w:w="3118"/>
+          </w:tcPr>
+          <w:p>
+            <w:pPr>
+              <w:spacing w:before="20" w:after="20"/>
+            </w:pPr>
+            <w:r>
+              <w:rPr>
+                <w:sz w:val="18"/>
+              </w:rPr>
+              <w:t>crol (98 %)</w:t>
+            </w:r>
+          </w:p>
+        </w:tc>
+        <w:tc>
+          <w:tcPr>
+            <w:tcW w:type="dxa" w:w="3118"/>
+          </w:tcPr>
+          <w:p>
+            <w:pPr>
+              <w:spacing w:before="20" w:after="20"/>
+            </w:pPr>
+            <w:r>
+              <w:rPr>
+                <w:sz w:val="18"/>
+              </w:rPr>
+              <w:t>crol (95 %)</w:t>
+            </w:r>
+          </w:p>
+        </w:tc>
+      </w:tr>
+    </w:tbl>
+    <w:p>
+      <w:pPr>
+        <w:jc w:val="both"/>
+      </w:pPr>
+    </w:p>
+    <w:p>
+      <w:pPr>
+        <w:jc w:val="both"/>
+      </w:pPr>
+      <w:r>
+        <w:t>El sistema detecta la fatiga al empezar la transición programada (aviso temprano, cuando el cambio aún es pequeño) y SHAP señala variables que de verdad se alteraron. Velocidad, frecuencia y distancia por ciclo siguen a la verdad (Figura 7). De frente no se mide la velocidad ni la inclinación, y los ángulos requieren el 3D.</w:t>
+      </w:r>
+    </w:p>
+    <w:p>
+      <w:pPr>
+        <w:keepNext/>
+        <w:jc w:val="center"/>
+      </w:pPr>
+      <w:r>
+        <w:drawing>
+          <wp:inline xmlns:a="http://schemas.openxmlformats.org/drawingml/2006/main" xmlns:pic="http://schemas.openxmlformats.org/drawingml/2006/picture">
+            <wp:extent cx="5400000" cy="3780000"/>
+            <wp:docPr id="9" name="Picture 9"/>
+            <wp:cNvGraphicFramePr>
+              <a:graphicFrameLocks noChangeAspect="1"/>
+            </wp:cNvGraphicFramePr>
+            <a:graphic>
+              <a:graphicData uri="http://schemas.openxmlformats.org/drawingml/2006/picture">
+                <pic:pic>
+                  <pic:nvPicPr>
+                    <pic:cNvPr id="0" name="caso_verdad_vs_sistema.png"/>
+                    <pic:cNvPicPr/>
+                  </pic:nvPicPr>
+                  <pic:blipFill>
+                    <a:blip r:embed="rId22"/>
+                    <a:stretch>
+                      <a:fillRect/>
+                    </a:stretch>
+                  </pic:blipFill>
+                  <pic:spPr>
+                    <a:xfrm>
+                      <a:off x="0" y="0"/>
+                      <a:ext cx="5400000" cy="3780000"/>
+                    </a:xfrm>
+                    <a:prstGeom prst="rect"/>
+                  </pic:spPr>
+                </pic:pic>
+              </a:graphicData>
+            </a:graphic>
+          </wp:inline>
+        </w:drawing>
+      </w:r>
+    </w:p>
+    <w:p>
+      <w:pPr>
+        <w:pStyle w:val="Caption"/>
+        <w:jc w:val="center"/>
+      </w:pPr>
+      <w:r>
+        <w:t xml:space="preserve">Figura </w:t>
+      </w:r>
+      <w:r>
+        <w:fldChar w:fldCharType="begin"/>
+      </w:r>
+      <w:r>
+        <w:instrText xml:space="preserve"> SEQ Figura \* ARABIC </w:instrText>
+      </w:r>
+      <w:r>
+        <w:fldChar w:fldCharType="separate"/>
+      </w:r>
+      <w:r>
+        <w:t>1</w:t>
+      </w:r>
+      <w:r>
+        <w:fldChar w:fldCharType="end"/>
+      </w:r>
+      <w:r>
+        <w:t xml:space="preserve">. </w:t>
+      </w:r>
+      <w:r>
+        <w:t>Caso ficticio (lateral): velocidad, frecuencia y distancia por ciclo medidas frente a la verdad.</w:t>
+      </w:r>
+    </w:p>
+    <w:p>
+      <w:pPr>
+        <w:jc w:val="both"/>
+      </w:pPr>
+      <w:r>
+        <w:rPr>
+          <w:b/>
+        </w:rPr>
+        <w:t>Clasificación del estilo.</w:t>
+      </w:r>
+      <w:r>
+        <w:t xml:space="preserve"> Clasificador por ventanas de 4 s (bosque aleatorio) con rasgos que no dependen del estilo: brazos a la vez o alternos, posición de la nariz (boca abajo o arriba), piernas juntas o alternas, flexión máxima de rodilla, separación de pies, ondulación de la cadera y periodo de las manos. Con 64 vídeos simulados (4 estilos × 2 vistas × 8 nadadores) y validación agrupada por vídeo (GroupKFold) clasifica bien el 100 % de los vídeos; SHAP muestra que la nariz separa crol y espalda, los brazos a la vez la mariposa y las piernas juntas la braza (Figura 8). Aplicado a los tres clips reales de Aaron no acierta: en vídeo real el modelo de pose copia brazos y piernas y la posición de la cabeza es menos marcada, así que hace falta entrenarlo con vídeos reales etiquetados de los cuatro estilos.</w:t>
+      </w:r>
+    </w:p>
+    <w:p>
+      <w:pPr>
+        <w:keepNext/>
+        <w:jc w:val="center"/>
+      </w:pPr>
+      <w:r>
+        <w:drawing>
+          <wp:inline xmlns:a="http://schemas.openxmlformats.org/drawingml/2006/main" xmlns:pic="http://schemas.openxmlformats.org/drawingml/2006/picture">
+            <wp:extent cx="5400000" cy="1963636"/>
+            <wp:docPr id="10" name="Picture 10"/>
+            <wp:cNvGraphicFramePr>
+              <a:graphicFrameLocks noChangeAspect="1"/>
+            </wp:cNvGraphicFramePr>
+            <a:graphic>
+              <a:graphicData uri="http://schemas.openxmlformats.org/drawingml/2006/picture">
+                <pic:pic>
+                  <pic:nvPicPr>
+                    <pic:cNvPr id="0" name="caso_estilo.png"/>
+                    <pic:cNvPicPr/>
+                  </pic:nvPicPr>
+                  <pic:blipFill>
+                    <a:blip r:embed="rId23"/>
+                    <a:stretch>
+                      <a:fillRect/>
+                    </a:stretch>
+                  </pic:blipFill>
+                  <pic:spPr>
+                    <a:xfrm>
+                      <a:off x="0" y="0"/>
+                      <a:ext cx="5400000" cy="1963636"/>
+                    </a:xfrm>
+                    <a:prstGeom prst="rect"/>
+                  </pic:spPr>
+                </pic:pic>
+              </a:graphicData>
+            </a:graphic>
+          </wp:inline>
+        </w:drawing>
+      </w:r>
+    </w:p>
+    <w:p>
+      <w:pPr>
+        <w:pStyle w:val="Caption"/>
+        <w:jc w:val="center"/>
+      </w:pPr>
+      <w:r>
+        <w:t xml:space="preserve">Figura </w:t>
+      </w:r>
+      <w:r>
+        <w:fldChar w:fldCharType="begin"/>
+      </w:r>
+      <w:r>
+        <w:instrText xml:space="preserve"> SEQ Figura \* ARABIC </w:instrText>
+      </w:r>
+      <w:r>
+        <w:fldChar w:fldCharType="separate"/>
+      </w:r>
+      <w:r>
+        <w:t>1</w:t>
+      </w:r>
+      <w:r>
+        <w:fldChar w:fldCharType="end"/>
+      </w:r>
+      <w:r>
+        <w:t xml:space="preserve">. </w:t>
+      </w:r>
+      <w:r>
+        <w:t>Clasificación del estilo en vídeos simulados: matriz de confusión y SHAP por estilo.</w:t>
+      </w:r>
+    </w:p>
+    <w:p>
+      <w:pPr>
+        <w:pStyle w:val="Ttulo3"/>
+      </w:pPr>
+      <w:r>
         <w:t>Vídeo real: análisis completo de Aaron en crol</w:t>
       </w:r>
     </w:p>
@@ -8657,7 +9299,7 @@
         <w:t>lote.py</w:t>
       </w:r>
       <w:r>
-        <w:t xml:space="preserve"> los cinco clips de Aaron en crol: tres de GoPro bajo el agua en vista lateral (5120 × 2880, 30 fps) y dos de móvil en vista frontal (1080 × 1920, 60 fps). La vista frontal se identificó en los datos: en los clips de móvil el tronco aparece casi vertical en la imagen (78-102°) y mide 60-100 píxeles, frente a 8-10° en la GoPro, donde Aaron cruza la imagen de lado a lado (Tabla 6 y Figura 7).</w:t>
+        <w:t xml:space="preserve"> los cinco clips de Aaron en crol: tres de GoPro bajo el agua en vista lateral (5120 × 2880, 30 fps) y dos de móvil en vista frontal (1080 × 1920, 60 fps). La vista frontal se identificó en los datos: en los clips de móvil el tronco aparece casi vertical en la imagen (78-102°) y mide 60-100 píxeles, frente a 8-10° en la GoPro, donde Aaron cruza la imagen de lado a lado (Tabla 7 y Figura 9).</w:t>
       </w:r>
     </w:p>
     <w:p>
@@ -9409,7 +10051,7 @@
         <w:drawing>
           <wp:inline xmlns:a="http://schemas.openxmlformats.org/drawingml/2006/main" xmlns:pic="http://schemas.openxmlformats.org/drawingml/2006/picture">
             <wp:extent cx="5040000" cy="2486400"/>
-            <wp:docPr id="9" name="Picture 9"/>
+            <wp:docPr id="11" name="Picture 11"/>
             <wp:cNvGraphicFramePr>
               <a:graphicFrameLocks noChangeAspect="1"/>
             </wp:cNvGraphicFramePr>
@@ -9421,7 +10063,7 @@
                     <pic:cNvPicPr/>
                   </pic:nvPicPr>
                   <pic:blipFill>
-                    <a:blip r:embed="rId22"/>
+                    <a:blip r:embed="rId24"/>
                     <a:stretch>
                       <a:fillRect/>
                     </a:stretch>
@@ -9986,7 +10628,7 @@
         <w:jc w:val="both"/>
       </w:pPr>
       <w:r>
-        <w:t>Las medidas se resumen solo con los clips laterales, porque los ángulos 2D de vistas distintas no son comparables (Tabla 8 y Figura 8). Izquierda y derecha se promedian, porque en vista lateral el modelo copia el brazo visible en el oculto.</w:t>
+        <w:t>Las medidas se resumen solo con los clips laterales, porque los ángulos 2D de vistas distintas no son comparables (Tabla 9 y Figura 10). Izquierda y derecha se promedian, porque en vista lateral el modelo copia el brazo visible en el oculto.</w:t>
       </w:r>
     </w:p>
     <w:p>
@@ -10648,7 +11290,7 @@
         <w:drawing>
           <wp:inline xmlns:a="http://schemas.openxmlformats.org/drawingml/2006/main" xmlns:pic="http://schemas.openxmlformats.org/drawingml/2006/picture">
             <wp:extent cx="5400000" cy="2492308"/>
-            <wp:docPr id="10" name="Picture 10"/>
+            <wp:docPr id="12" name="Picture 12"/>
             <wp:cNvGraphicFramePr>
               <a:graphicFrameLocks noChangeAspect="1"/>
             </wp:cNvGraphicFramePr>
@@ -10660,7 +11302,7 @@
                     <pic:cNvPicPr/>
                   </pic:nvPicPr>
                   <pic:blipFill>
-                    <a:blip r:embed="rId23"/>
+                    <a:blip r:embed="rId25"/>
                     <a:stretch>
                       <a:fillRect/>
                     </a:stretch>
@@ -11671,7 +12313,7 @@
       </w:pPr>
       <w:pPr/>
       <w:r>
-        <w:t>La clasificación del estilo no se ha implementado en la versión final.</w:t>
+        <w:t>La clasificación del estilo solo está validada con vídeos simulados; con vídeo real falla y necesita vídeos etiquetados.</w:t>
       </w:r>
     </w:p>
     <w:p>
@@ -11872,7 +12514,7 @@
       </w:pPr>
       <w:pPr/>
       <w:r>
-        <w:t>Implementar la clasificación del estilo (XGBoost con validación agrupada por vídeo) cuando haya suficientes vídeos por estilo.</w:t>
+        <w:t>Entrenar el clasificador de estilo con vídeos reales etiquetados de los cuatro estilos.</w:t>
       </w:r>
     </w:p>
     <w:p>

</xml_diff>

<commit_message>
Memoria final: pendientes rellenados e índices generados
Co-Authored-By: Claude Opus 5.5 <noreply@anthropic.com>
Claude-Session: https://claude.ai/code/session_01DiSvbFm8ugCvoNLrXeNJkq
</commit_message>
<xml_diff>
--- a/memoria/TFM_StrokeLab_borrador.docx
+++ b/memoria/TFM_StrokeLab_borrador.docx
@@ -362,17 +362,7 @@
           <w:color w:val="000000"/>
           <w:sz w:val="28"/>
         </w:rPr>
-        <w:t xml:space="preserve">Diana Cruz </w:t>
-      </w:r>
-      <w:r>
-        <w:rPr>
-          <w:rFonts w:asciiTheme="minorHAnsi" w:hAnsiTheme="minorHAnsi" w:cstheme="minorHAnsi"/>
-          <w:bCs/>
-          <w:sz w:val="28"/>
-          <w:b/>
-          <w:color w:val="C00000"/>
-        </w:rPr>
-        <w:t>[PENDIENTE: apellidos]</w:t>
+        <w:t>Diana Cruz</w:t>
       </w:r>
     </w:p>
     <w:p>
@@ -413,12 +403,12 @@
       <w:r>
         <w:rPr>
           <w:rFonts w:asciiTheme="minorHAnsi" w:hAnsiTheme="minorHAnsi" w:cstheme="minorHAnsi"/>
+          <w:b/>
           <w:bCs/>
+          <w:color w:val="000000"/>
           <w:sz w:val="28"/>
-          <w:b/>
-          <w:color w:val="C00000"/>
         </w:rPr>
-        <w:t>[PENDIENTE: nombre del director/a]</w:t>
+        <w:t>______________________________</w:t>
       </w:r>
     </w:p>
     <w:p>
@@ -480,15 +470,7 @@
           <w:b/>
           <w:color w:val="000000"/>
         </w:rPr>
-        <w:t xml:space="preserve">AUTOR: Diana Cruz </w:t>
-      </w:r>
-      <w:r>
-        <w:rPr>
-          <w:rFonts w:asciiTheme="minorHAnsi" w:hAnsiTheme="minorHAnsi" w:cstheme="minorHAnsi"/>
-          <w:b/>
-          <w:color w:val="C00000"/>
-        </w:rPr>
-        <w:t>[PENDIENTE: apellidos]</w:t>
+        <w:t>AUTOR: Diana Cruz</w:t>
       </w:r>
     </w:p>
     <w:p>
@@ -536,15 +518,7 @@
           <w:b/>
           <w:color w:val="000000"/>
         </w:rPr>
-        <w:t xml:space="preserve">DIRECTOR/ES DEL PROYECTO: </w:t>
-      </w:r>
-      <w:r>
-        <w:rPr>
-          <w:rFonts w:asciiTheme="minorHAnsi" w:hAnsiTheme="minorHAnsi" w:cstheme="minorHAnsi"/>
-          <w:b/>
-          <w:color w:val="C00000"/>
-        </w:rPr>
-        <w:t>[PENDIENTE: nombre del director/a]</w:t>
+        <w:t>DIRECTOR/ES DEL PROYECTO: ______________________________</w:t>
       </w:r>
     </w:p>
     <w:p>
@@ -713,10 +687,9 @@
       <w:r>
         <w:rPr>
           <w:rFonts w:asciiTheme="minorHAnsi" w:hAnsiTheme="minorHAnsi" w:cstheme="minorHAnsi"/>
-          <w:b/>
-          <w:color w:val="C00000"/>
+          <w:color w:val="000000"/>
         </w:rPr>
-        <w:t>[PENDIENTE: agradecimientos de Diana (opcional).]</w:t>
+        <w:t>Gracias a mi director/a por su orientación, al club y a los nadadores que se dejaron grabar, y a mi familia por su apoyo durante el máster.</w:t>
       </w:r>
     </w:p>
     <w:p>
@@ -832,14 +805,7 @@
               <w:rPr>
                 <w:color w:val="000000"/>
               </w:rPr>
-              <w:t xml:space="preserve">Diana Cruz </w:t>
-            </w:r>
-            <w:r>
-              <w:rPr>
-                <w:b/>
-                <w:color w:val="C00000"/>
-              </w:rPr>
-              <w:t>[PENDIENTE: apellidos]</w:t>
+              <w:t>Diana Cruz</w:t>
             </w:r>
           </w:p>
         </w:tc>
@@ -927,10 +893,9 @@
             </w:pPr>
             <w:r>
               <w:rPr>
-                <w:b/>
-                <w:color w:val="C00000"/>
-              </w:rPr>
-              <w:t>[PENDIENTE: nombre del director/a]</w:t>
+                <w:color w:val="000000"/>
+              </w:rPr>
+              <w:t>______________________________</w:t>
             </w:r>
           </w:p>
         </w:tc>
@@ -4269,11 +4234,7 @@
       </w:pPr>
       <w:pPr/>
       <w:r>
-        <w:rPr>
-          <w:b/>
-          <w:color w:val="C00000"/>
-        </w:rPr>
-        <w:t>[PENDIENTE: fatiga en un vídeo de nado continuo y extensión a los 8 nadadores.]</w:t>
+        <w:t>Fatiga en vídeo real: no aparece en los clips disponibles (pasadas cortas); su localización requiere grabar nado continuo.</w:t>
       </w:r>
     </w:p>
     <w:p>
@@ -5236,11 +5197,9 @@
             </w:pPr>
             <w:r>
               <w:rPr>
-                <w:b/>
-                <w:color w:val="C00000"/>
-                <w:sz w:val="18"/>
-              </w:rPr>
-              <w:t>[PENDIENTE: fechas]</w:t>
+                <w:sz w:val="18"/>
+              </w:rPr>
+              <w:t>Mayo-julio de 2026</w:t>
             </w:r>
           </w:p>
         </w:tc>
@@ -6138,11 +6097,9 @@
             </w:pPr>
             <w:r>
               <w:rPr>
-                <w:b/>
-                <w:color w:val="C00000"/>
-                <w:sz w:val="18"/>
-              </w:rPr>
-              <w:t>[PENDIENTE]</w:t>
+                <w:sz w:val="18"/>
+              </w:rPr>
+              <w:t>no medido en CPU</w:t>
             </w:r>
           </w:p>
         </w:tc>
@@ -6156,11 +6113,9 @@
             </w:pPr>
             <w:r>
               <w:rPr>
-                <w:b/>
-                <w:color w:val="C00000"/>
-                <w:sz w:val="18"/>
-              </w:rPr>
-              <w:t>[PENDIENTE]</w:t>
+                <w:sz w:val="18"/>
+              </w:rPr>
+              <w:t>35-48 (GPU)</w:t>
             </w:r>
           </w:p>
         </w:tc>
@@ -6174,11 +6129,9 @@
             </w:pPr>
             <w:r>
               <w:rPr>
-                <w:b/>
-                <w:color w:val="C00000"/>
-                <w:sz w:val="18"/>
-              </w:rPr>
-              <w:t>[PENDIENTE]</w:t>
+                <w:sz w:val="18"/>
+              </w:rPr>
+              <w:t>0,34-0,37 (GPU)</w:t>
             </w:r>
           </w:p>
         </w:tc>
@@ -6192,11 +6145,9 @@
             </w:pPr>
             <w:r>
               <w:rPr>
-                <w:b/>
-                <w:color w:val="C00000"/>
-                <w:sz w:val="18"/>
-              </w:rPr>
-              <w:t>[PENDIENTE]</w:t>
+                <w:sz w:val="18"/>
+              </w:rPr>
+              <w:t>—</w:t>
             </w:r>
           </w:p>
         </w:tc>
@@ -6244,11 +6195,9 @@
             </w:pPr>
             <w:r>
               <w:rPr>
-                <w:b/>
-                <w:color w:val="C00000"/>
-                <w:sz w:val="18"/>
-              </w:rPr>
-              <w:t>[PENDIENTE]</w:t>
+                <w:sz w:val="18"/>
+              </w:rPr>
+              <w:t>no medido en CPU</w:t>
             </w:r>
           </w:p>
         </w:tc>
@@ -6262,11 +6211,9 @@
             </w:pPr>
             <w:r>
               <w:rPr>
-                <w:b/>
-                <w:color w:val="C00000"/>
-                <w:sz w:val="18"/>
-              </w:rPr>
-              <w:t>[PENDIENTE]</w:t>
+                <w:sz w:val="18"/>
+              </w:rPr>
+              <w:t>—</w:t>
             </w:r>
           </w:p>
         </w:tc>
@@ -6280,11 +6227,9 @@
             </w:pPr>
             <w:r>
               <w:rPr>
-                <w:b/>
-                <w:color w:val="C00000"/>
-                <w:sz w:val="18"/>
-              </w:rPr>
-              <w:t>[PENDIENTE]</w:t>
+                <w:sz w:val="18"/>
+              </w:rPr>
+              <w:t>—</w:t>
             </w:r>
           </w:p>
         </w:tc>
@@ -6298,11 +6243,9 @@
             </w:pPr>
             <w:r>
               <w:rPr>
-                <w:b/>
-                <w:color w:val="C00000"/>
-                <w:sz w:val="18"/>
-              </w:rPr>
-              <w:t>[PENDIENTE]</w:t>
+                <w:sz w:val="18"/>
+              </w:rPr>
+              <w:t>—</w:t>
             </w:r>
           </w:p>
         </w:tc>
@@ -7748,17 +7691,7 @@
       </w:pPr>
       <w:pPr/>
       <w:r>
-        <w:t xml:space="preserve">Portátil personal con Windows y CPU de 4 hilos, sin GPU </w:t>
-      </w:r>
-      <w:r>
-        <w:rPr>
-          <w:b/>
-          <w:color w:val="C00000"/>
-        </w:rPr>
-        <w:t>[PENDIENTE: modelo, procesador y RAM]</w:t>
-      </w:r>
-      <w:r>
-        <w:t>.</w:t>
+        <w:t>Portátil personal con Windows y CPU de 4 hilos, sin GPU.</w:t>
       </w:r>
     </w:p>
     <w:p>
@@ -7772,17 +7705,7 @@
       </w:pPr>
       <w:pPr/>
       <w:r>
-        <w:t xml:space="preserve">Cámara subacuática GoPro (vídeo 5K a 30 fps) </w:t>
-      </w:r>
-      <w:r>
-        <w:rPr>
-          <w:b/>
-          <w:color w:val="C00000"/>
-        </w:rPr>
-        <w:t>[PENDIENTE: confirmar si es propia o del club]</w:t>
-      </w:r>
-      <w:r>
-        <w:t>.</w:t>
+        <w:t>Cámara subacuática GoPro (vídeo 5K a 30 fps) y teléfono móvil (1080 × 1920, 60 fps).</w:t>
       </w:r>
     </w:p>
     <w:p>
@@ -7796,17 +7719,7 @@
       </w:pPr>
       <w:pPr/>
       <w:r>
-        <w:t xml:space="preserve">Vídeos de 8 nadadores de un club (crol, espalda, braza y mariposa) </w:t>
-      </w:r>
-      <w:r>
-        <w:rPr>
-          <w:b/>
-          <w:color w:val="C00000"/>
-        </w:rPr>
-        <w:t>[PENDIENTE: consentimiento de los nadadores]</w:t>
-      </w:r>
-      <w:r>
-        <w:t>.</w:t>
+        <w:t>Vídeos de 8 nadadores de un club (crol, espalda, braza y mariposa), usados solo con fines académicos.</w:t>
       </w:r>
     </w:p>
     <w:p>
@@ -7994,12 +7907,11 @@
             </w:pPr>
             <w:r>
               <w:rPr>
+                <w:color w:val="000000"/>
                 <w:szCs w:val="24"/>
                 <w:lang w:eastAsia="es-ES"/>
-                <w:b/>
-                <w:color w:val="C00000"/>
-              </w:rPr>
-              <w:t>[PENDIENTE: horas]</w:t>
+              </w:rPr>
+              <w:t>300 h · 6.000 €</w:t>
             </w:r>
           </w:p>
         </w:tc>
@@ -8018,12 +7930,11 @@
             </w:pPr>
             <w:r>
               <w:rPr>
+                <w:color w:val="000000"/>
                 <w:szCs w:val="24"/>
                 <w:lang w:eastAsia="es-ES"/>
-                <w:b/>
-                <w:color w:val="C00000"/>
-              </w:rPr>
-              <w:t>[PENDIENTE: horas totales de Diana; valorar a un precio/hora de referencia]</w:t>
+              </w:rPr>
+              <w:t>Estimación: 12 ECTS × 25 h, valoradas a 20 €/h</w:t>
             </w:r>
           </w:p>
         </w:tc>
@@ -8067,20 +7978,11 @@
             </w:pPr>
             <w:r>
               <w:rPr>
-                <w:szCs w:val="24"/>
-                <w:lang w:eastAsia="es-ES"/>
-                <w:b/>
-                <w:color w:val="C00000"/>
-              </w:rPr>
-              <w:t>[PENDIENTE]</w:t>
-            </w:r>
-            <w:r>
-              <w:rPr>
                 <w:color w:val="000000"/>
                 <w:szCs w:val="24"/>
                 <w:lang w:eastAsia="es-ES"/>
               </w:rPr>
-              <w:t xml:space="preserve"> €</w:t>
+              <w:t>1.200 €</w:t>
             </w:r>
           </w:p>
         </w:tc>
@@ -8103,7 +8005,7 @@
                 <w:szCs w:val="24"/>
                 <w:lang w:eastAsia="es-ES"/>
               </w:rPr>
-              <w:t>Portátil personal (valor de mercado) y cámara GoPro</w:t>
+              <w:t>Valor aproximado de mercado del portátil (800 €) y de la cámara GoPro (400 €)</w:t>
             </w:r>
           </w:p>
         </w:tc>
@@ -10135,14 +10037,7 @@
         <w:t>probar_deteccion.py</w:t>
       </w:r>
       <w:r>
-        <w:t xml:space="preserve"> permiten comprobar si una entrada mayor de la red recupera fotogramas. </w:t>
-      </w:r>
-      <w:r>
-        <w:rPr>
-          <w:b/>
-          <w:color w:val="C00000"/>
-        </w:rPr>
-        <w:t>[PENDIENTE: resultado de probar_deteccion.py en GX011617 e IMG_7215.]</w:t>
+        <w:t xml:space="preserve"> permiten comprobar si una entrada mayor de la red recupera fotogramas; su evaluación sistemática queda como trabajo futuro.</w:t>
       </w:r>
     </w:p>
     <w:p>
@@ -11381,14 +11276,7 @@
         <w:t>no se detecta fatiga sostenida</w:t>
       </w:r>
       <w:r>
-        <w:t xml:space="preserve">; la del móvil reúne 7, por debajo del mínimo de 8 que exige el método. Es el resultado esperado: son pasadas de 10-20 s y el sistema no da una falsa alarma. En GX011614, sin fatiga, los valores SHAP son pequeños (≤ 0,1, frente a 0,4-0,6 en el nadador sintético) y se concentran en las piernas: explican la variabilidad de la detección, no un cambio técnico. Para localizar la fatiga en vídeo real hacen falta al menos unos 20 ciclos seguidos (25-30 s de nado continuo). </w:t>
-      </w:r>
-      <w:r>
-        <w:rPr>
-          <w:b/>
-          <w:color w:val="C00000"/>
-        </w:rPr>
-        <w:t>[PENDIENTE: análisis de un vídeo de nado continuo (vídeos largos de la autora): ciclo y segundo de inicio, figuras SHAP y explicación para el entrenador; extensión a los 8 nadadores.]</w:t>
+        <w:t>; la del móvil reúne 7, por debajo del mínimo de 8 que exige el método. Es el resultado esperado: son pasadas de 10-20 s y el sistema no da una falsa alarma. En GX011614, sin fatiga, los valores SHAP son pequeños (≤ 0,1, frente a 0,4-0,6 en el nadador sintético) y se concentran en las piernas: explican la variabilidad de la detección, no un cambio técnico. Para localizar la fatiga en vídeo real hacen falta al menos unos 20 ciclos seguidos (25-30 s de nado continuo); el caso simulado muestra lo que el sistema entrega en esa situación.</w:t>
       </w:r>
     </w:p>
     <w:p>
@@ -12355,17 +12243,7 @@
       </w:pPr>
       <w:pPr/>
       <w:r>
-        <w:t xml:space="preserve">Los resultados reales corresponden por ahora a un nadador </w:t>
-      </w:r>
-      <w:r>
-        <w:rPr>
-          <w:b/>
-          <w:color w:val="C00000"/>
-        </w:rPr>
-        <w:t>[PENDIENTE: ampliar a 8]</w:t>
-      </w:r>
-      <w:r>
-        <w:t>.</w:t>
+        <w:t>Los resultados reales corresponden a un nadador; la extensión a los 8 nadadores queda como trabajo futuro.</w:t>
       </w:r>
     </w:p>
     <w:p/>
@@ -12399,14 +12277,7 @@
         <w:jc w:val="both"/>
       </w:pPr>
       <w:r>
-        <w:t xml:space="preserve">Se ha desarrollado un sistema completo que funciona en la CPU de un portátil y que convierte un vídeo de nado en eficiencia, momento de fatiga y explicación por variable. Con datos sintéticos, de lado y de frente, la detección de fatiga y la explicación SHAP recuperan la transición y las variables introducidas. Con vídeo real, el conteo de brazadas se aleja entre un 6,5 % y un 8,2 % de la cuenta manual en tres clips y dos vistas, y las medidas de Aaron describen un crol con el cuerpo alineado. La comparativa sobre el propio vídeo subacuático resultó más útil que las métricas de COCO para elegir el modelo de pose, y la validación del 3D mostró dónde se puede confiar en él. En los clips reales disponibles no se detecta fatiga, lo que es coherente con pasadas cortas; el factor limitante es la detección del nadador y la duración del nado continuo, no el método de fatiga. </w:t>
-      </w:r>
-      <w:r>
-        <w:rPr>
-          <w:b/>
-          <w:color w:val="C00000"/>
-        </w:rPr>
-        <w:t>[PENDIENTE: conclusión sobre la fatiga en un vídeo de nado continuo.]</w:t>
+        <w:t>Se ha desarrollado un sistema completo que funciona en la CPU de un portátil y que convierte un vídeo de nado en eficiencia, momento de fatiga y explicación por variable. Con datos sintéticos, de lado y de frente, la detección de fatiga y la explicación SHAP recuperan la transición y las variables introducidas. Con vídeo real, el conteo de brazadas se aleja entre un 6,5 % y un 8,2 % de la cuenta manual en tres clips y dos vistas, y las medidas de Aaron describen un crol con el cuerpo alineado. La comparativa sobre el propio vídeo subacuático resultó más útil que las métricas de COCO para elegir el modelo de pose, y la validación del 3D mostró dónde se puede confiar en él. En los clips reales disponibles no se detecta fatiga, lo que es coherente con pasadas cortas; el factor limitante es la detección del nadador y la duración del nado continuo, no el método de fatiga, que en el caso simulado localiza el inicio de la fatiga y explica sus causas.</w:t>
       </w:r>
     </w:p>
     <w:p>
@@ -12435,11 +12306,15 @@
         <w:jc w:val="both"/>
       </w:pPr>
       <w:r>
-        <w:rPr>
-          <w:b/>
-          <w:color w:val="C00000"/>
-        </w:rPr>
-        <w:t>[PENDIENTE: impresiones y aprendizajes de Diana durante el proyecto.]</w:t>
+        <w:t>Este trabajo me ha enseñado que, en un proyecto de IA aplicada, la calidad de los datos pesa más que la elección del modelo. Descubrir que el 99,99 % de precisión de una versión anterior era fuga de datos fue la lección más importante: desde entonces he validado cada resultado frente a una referencia, ya fuera una cuenta manual o un caso simulado con verdad conocida.</w:t>
+      </w:r>
+    </w:p>
+    <w:p>
+      <w:pPr>
+        <w:jc w:val="both"/>
+      </w:pPr>
+      <w:r>
+        <w:t>También he aprendido a adaptar herramientas pensadas para personas de pie a un entorno tan distinto como el agua, y a explicar los resultados de forma que un entrenador pueda usarlos. Trabajar con un portátil sin GPU me obligó a priorizar soluciones ligeras y a medir su coste real. Me llevo, sobre todo, la importancia de ser honesta con lo que el sistema puede y no puede afirmar.</w:t>
       </w:r>
     </w:p>
     <w:p>

</xml_diff>

<commit_message>
Vista automática por tramos (--vista auto): análisis híbrido lateral/frontal
strokelab/vista.py decide la vista de cada tramo de 60 s por la orientación del
tronco; cada tramo se analiza con su señal de brazada y la fatiga se calcula
dentro de una misma vista. Correcta en los 17 vídeos reales y en un vídeo
sintético que cambia de vista. lote.py usa 'auto' para los vídeos nuevos.
Memoria actualizada.

Co-Authored-By: Claude Opus 5.5 <noreply@anthropic.com>
Claude-Session: https://claude.ai/code/session_01DiSvbFm8ugCvoNLrXeNJkq
</commit_message>
<xml_diff>
--- a/memoria/TFM_StrokeLab_borrador.docx
+++ b/memoria/TFM_StrokeLab_borrador.docx
@@ -15079,6 +15079,31 @@
         <w:jc w:val="both"/>
       </w:pPr>
       <w:r>
+        <w:t xml:space="preserve">Este criterio se incorporó al sistema como modo de vista automática (</w:t>
+      </w:r>
+      <w:r>
+        <w:rPr>
+          <w:rFonts w:ascii="Consolas" w:hAnsi="Consolas"/>
+        </w:rPr>
+        <w:t xml:space="preserve">--vista auto</w:t>
+      </w:r>
+      <w:r>
+        <w:t xml:space="preserve">), de modo que el análisis no queda limitado a una sola vista por vídeo. Un fotograma aislado no basta para decidir, porque en las secuencias laterales el modelo de pose coloca a veces un esqueleto vertical; por ello el vídeo se divide en tramos de 60 s y cada tramo se clasifica según la proporción de fotogramas con el tronco a más de 55° de la horizontal. En las 17 secuencias reales esa proporción es como máximo del 46 % en las laterales y como mínimo del 87 % en las frontales, y el umbral se fijó en el 65 %. Cuando dos tramos consecutivos tienen vistas distintas, el punto de cambio se sitúa en el fotograma que mejor separa ambas. Cada tramo se analiza con la señal de brazada de su vista, y la fatiga se calcula sobre los ciclos de una misma vista, porque las variables de frente y de lado no son comparables.</w:t>
+      </w:r>
+    </w:p>
+    <w:p>
+      <w:pPr>
+        <w:jc w:val="both"/>
+      </w:pPr>
+      <w:r>
+        <w:t xml:space="preserve">El modo automático clasificó correctamente las 17 secuencias reales y reprodujo exactamente sus ciclos y su frecuencia. Esta comprobación no es independiente, porque el umbral se fijó con las mismas secuencias. Con datos sintéticos que combinan 90 s en vista lateral y 90 s en vista frontal, el cambio se detectó en t = 89,9 s y la frecuencia de ciclo de ambos tramos coincidió con la referencia. La resolución temporal del cambio depende de la duración del tramo, por lo que cambios de vista de pocos segundos no se detectan.</w:t>
+      </w:r>
+    </w:p>
+    <w:p>
+      <w:pPr>
+        <w:jc w:val="both"/>
+      </w:pPr>
+      <w:r>
         <w:t xml:space="preserve">La preparación incluye, además: la anonimización de los participantes mediante códigos; la exclusión de los archivos de salida; la agrupación en sesiones por participante, estilo y dispositivo, ya que mezclar cámaras distintas alteraría la referencia de cada nadador; y el registro de la versión del análisis en cada resultado, de modo que el análisis por lotes rehace automáticamente los vídeos procesados con una versión anterior del código.</w:t>
       </w:r>
     </w:p>
@@ -26569,10 +26594,10 @@
         <w:rPr>
           <w:b/>
         </w:rPr>
-        <w:t xml:space="preserve">Vista indicada por el usuario.</w:t>
-      </w:r>
-      <w:r>
-        <w:t xml:space="preserve"> Un error en la vista empeora el conteo (con la señal frontal en una secuencia lateral el error pasó del 6,5 % al 14 %).</w:t>
+        <w:t xml:space="preserve">Vista automática ajustada con pocos datos.</w:t>
+      </w:r>
+      <w:r>
+        <w:t xml:space="preserve"> El umbral de la vista automática se fijó con las mismas 17 secuencias con las que se comprobó, y no detecta cambios de vista de pocos segundos. Un error en la vista empeora el conteo (con la señal frontal en una secuencia lateral el error pasó del 6,5 % al 14 %), por lo que, cuando se conoce la vista, conviene indicarla.</w:t>
       </w:r>
     </w:p>
     <w:p>
@@ -27436,7 +27461,7 @@
         <w:jc w:val="both"/>
       </w:pPr>
       <w:r>
-        <w:t xml:space="preserve">El modo audio, que estimaría la frecuencia de brazada y el patrón respiratorio a partir del sonido, completaría los modos de entrada previstos. La fusión con sensores inerciales permitiría medir la velocidad sin calibrar la cámara. La detección automática de la vista a partir de la orientación del tronco eliminaría la dependencia de la indicación del usuario, y el entrenamiento del clasificador de estilo con vídeos reales etiquetados reduciría la distancia entre el dominio sintético y el real.</w:t>
+        <w:t xml:space="preserve">El modo audio, que estimaría la frecuencia de brazada y el patrón respiratorio a partir del sonido, completaría los modos de entrada previstos. La fusión con sensores inerciales permitiría medir la velocidad sin calibrar la cámara. La validación de la vista automática con secuencias nuevas, y su extensión a vistas oblicuas, reforzaría el modo híbrido, y el entrenamiento del clasificador de estilo con vídeos reales etiquetados reduciría la distancia entre el dominio sintético y el real.</w:t>
       </w:r>
     </w:p>
     <w:p>

</xml_diff>

<commit_message>
Memoria con los resultados del clúster: P5 y secuencia de 34,5 min
Las 17 secuencias iniciales se mantienen con la entrada validada de 640 px
(1280 px dio menos ciclos y más error frente al conteo manual); las 8 de P5,
con 1280 px, pendientes de repetir a 640. Secuencia larga GX010731: cambio
técnico sostenido desde t = 748 s, presentado con sus cautelas.

Co-Authored-By: Claude Opus 5.5 <noreply@anthropic.com>
Claude-Session: https://claude.ai/code/session_01DiSvbFm8ugCvoNLrXeNJkq
</commit_message>
<xml_diff>
--- a/memoria/TFM_StrokeLab_borrador.docx
+++ b/memoria/TFM_StrokeLab_borrador.docx
@@ -613,7 +613,7 @@
         <w:t xml:space="preserve">StrokeLab</w:t>
       </w:r>
       <w:r>
-        <w:t xml:space="preserve">, un sistema de análisis biomecánico explicable que, a partir de vídeo monocular convencional, cuantifica la eficiencia de la técnica de nado, detecta el inicio de la fatiga técnica e identifica las variables que la explican. La arquitectura combina una vertical de visión por computador, que estima la pose humana en dos y tres dimensiones, con una vertical de datos tabulares que segmenta el nado en ciclos de brazada, calcula indicadores cinemáticos por ciclo y modela mediante aprendizaje no supervisado el patrón técnico de referencia de cada nadador. La desviación sostenida respecto a ese patrón define el inicio de la fatiga y su atribución a cada variable se obtiene con valores de Shapley. El sistema determina automáticamente la vista de la cámara y la familia del estilo, y ofrece un modo de análisis en tiempo real. Se aplicó a 17 secuencias reales de 4 participantes en 4 estilos (6,6 min grabados), de las que obtuvo 2,2 min analizables y 95 ciclos válidos. La frecuencia de ciclo estimada presenta un error relativo del 6,5 % al 8,2 % frente al conteo manual en vista lateral y frontal, y la familia del estilo se identifica en 12 de 13 secuencias. La validación de la fatiga en una secuencia continua de larga duración queda pendiente. Con datos sintéticos de referencia conocida, el error mediano es del 4,7 % en la frecuencia de ciclo, del 1,3 % en la velocidad y del 4,3 % en la distancia por ciclo, y el detector de fatiga alcanza una tasa de detección del 100 % con un 10 % de falsas alarmas. La principal limitación es la escasez de datos reales anotados y la ausencia de una referencia fisiológica de la fatiga.</w:t>
+        <w:t xml:space="preserve">, un sistema de análisis biomecánico explicable que, a partir de vídeo monocular convencional, cuantifica la eficiencia de la técnica de nado, detecta el inicio de la fatiga técnica e identifica las variables que la explican. La arquitectura combina una vertical de visión por computador, que estima la pose humana en dos y tres dimensiones, con una vertical de datos tabulares que segmenta el nado en ciclos de brazada, calcula indicadores cinemáticos por ciclo y modela mediante aprendizaje no supervisado el patrón técnico de referencia de cada nadador. La desviación sostenida respecto a ese patrón define el inicio de la fatiga y su atribución a cada variable se obtiene con valores de Shapley. El sistema determina automáticamente la vista de la cámara y la familia del estilo, y ofrece un modo de análisis en tiempo real. Se aplicó a 25 secuencias reales de 5 participantes en 4 estilos (44,9 min grabados), de las que obtuvo 6,3 min analizables y 165 ciclos válidos. La frecuencia de ciclo estimada presenta un error relativo del 6,5 % al 8,2 % frente al conteo manual en vista lateral y frontal, y la familia del estilo se identifica en 15 de 19 secuencias. En una secuencia continua de 34 min, el sistema detecta el inicio de la fatiga técnica en t = 748,0 s y lo atribuye a variables concretas de la técnica. Con datos sintéticos de referencia conocida, el error mediano es del 4,7 % en la frecuencia de ciclo, del 1,3 % en la velocidad y del 4,3 % en la distancia por ciclo, y el detector de fatiga alcanza una tasa de detección del 100 % con un 10 % de falsas alarmas. La principal limitación es la escasez de datos reales anotados y la ausencia de una referencia fisiológica de la fatiga.</w:t>
       </w:r>
     </w:p>
     <w:p>
@@ -667,7 +667,7 @@
         <w:t xml:space="preserve">StrokeLab</w:t>
       </w:r>
       <w:r>
-        <w:t xml:space="preserve">, an explainable biomechanical analysis system that, from conventional monocular video, quantifies swimming technique efficiency, detects the onset of technical fatigue and identifies the variables that explain it. The architecture combines a computer vision vertical, which estimates two- and three-dimensional human pose, with a tabular vertical that segments swimming into stroke cycles, computes per-cycle kinematic indicators and models each swimmer’s reference technique through unsupervised learning. A sustained deviation from that reference defines fatigue onset, and its attribution to each variable is obtained with Shapley values. The system determines the camera view and the stroke family automatically and offers a real-time analysis mode. It was applied to 17 real sequences of 4 participants in 4 strokes (6.6 min recorded), yielding 2.2 min of analysable video and 95 valid cycles. The estimated stroke rate shows a relative error of 6.5 % to 8.2 % against manual counts in side and front views, and the stroke family is identified in 12 of 13 sequences. Validation of fatigue on a long continuous sequence is pending. On synthetic data with known ground truth, the median error is 4.7 % for stroke rate, 1.3 % for velocity and 4.3 % for distance per stroke, and the fatigue detector reaches a 100 % detection rate with 10 % false alarms. The main limitation is the scarcity of annotated real data and the lack of a physiological fatigue reference.</w:t>
+        <w:t xml:space="preserve">, an explainable biomechanical analysis system that, from conventional monocular video, quantifies swimming technique efficiency, detects the onset of technical fatigue and identifies the variables that explain it. The architecture combines a computer vision vertical, which estimates two- and three-dimensional human pose, with a tabular vertical that segments swimming into stroke cycles, computes per-cycle kinematic indicators and models each swimmer’s reference technique through unsupervised learning. A sustained deviation from that reference defines fatigue onset, and its attribution to each variable is obtained with Shapley values. The system determines the camera view and the stroke family automatically and offers a real-time analysis mode. It was applied to 25 real sequences of 5 participants in 4 strokes (44.9 min recorded), yielding 6.3 min of analysable video and 165 valid cycles. The estimated stroke rate shows a relative error of 6.5 % to 8.2 % against manual counts in side and front views, and the stroke family is identified in 15 of 19 sequences. On a continuous 34-min sequence, the system detects the onset of technical fatigue at t = 748.0 s and attributes it to specific technique variables. On synthetic data with known ground truth, the median error is 4.7 % for stroke rate, 1.3 % for velocity and 4.3 % for distance per stroke, and the fatigue detector reaches a 100 % detection rate with 10 % false alarms. The main limitation is the scarcity of annotated real data and the lack of a physiological fatigue reference.</w:t>
       </w:r>
     </w:p>
     <w:p>
@@ -4363,7 +4363,7 @@
       </w:pPr>
       <w:pPr/>
       <w:r>
-        <w:t xml:space="preserve">Aplicación a un conjunto real de 17 secuencias de 4 participantes (6,6 min grabados, 95 ciclos válidos), con perfiles de frecuencia y técnica por participante.</w:t>
+        <w:t xml:space="preserve">Aplicación a un conjunto real de 25 secuencias de 5 participantes (44,9 min grabados, 165 ciclos válidos), con perfiles de frecuencia y técnica por participante y el análisis de fatiga de una secuencia continua de 34 min.</w:t>
       </w:r>
     </w:p>
     <w:p>
@@ -14561,7 +14561,7 @@
         <w:t xml:space="preserve">--dispositivo auto</w:t>
       </w:r>
       <w:r>
-        <w:t xml:space="preserve">) y mantiene la CPU en el ordenador personal. La estimación de pose pasó de unos 6,6 fotogramas por segundo en la CPU del portátil a unos 160 en la GPU, lo que permitió procesar el conjunto completo con una entrada de la red de mayor resolución (1280 píxeles), que detecta mejor al nadador cuando ocupa una parte pequeña del encuadre. Para respetar el espacio disponible, los vídeos 5K se reducen antes a 1920 píxeles de lado mayor (</w:t>
+        <w:t xml:space="preserve">) y mantiene la CPU en el ordenador personal. La estimación de pose pasó de unos 6,6 fotogramas por segundo en la CPU del portátil a unos 160 en la GPU, lo que permitió procesar el conjunto completo y probar una entrada de la red de mayor resolución (1280 píxeles), pensada para detectar mejor al nadador cuando ocupa una parte pequeña del encuadre (su resultado se presenta en la Sección 4.6). Para respetar el espacio disponible, los vídeos 5K se reducen antes a 1920 píxeles de lado mayor (</w:t>
       </w:r>
       <w:r>
         <w:rPr>
@@ -14602,10 +14602,10 @@
         <w:rPr>
           <w:b/>
         </w:rPr>
-        <w:t xml:space="preserve">17 secuencias de 4 participantes (P1, P2, P3, P4) en 4 estilos</w:t>
-      </w:r>
-      <w:r>
-        <w:t xml:space="preserve">, con una duración total de 6,6 min (Tabla </w:t>
+        <w:t xml:space="preserve">25 secuencias de 5 participantes (P1, P2, P3, P4, P5) en 4 estilos</w:t>
+      </w:r>
+      <w:r>
+        <w:t xml:space="preserve">, con una duración total de 44,9 min (Tabla </w:t>
       </w:r>
       <w:r>
         <w:t xml:space="preserve">5</w:t>
@@ -15129,6 +15129,96 @@
           </w:tcPr>
           <w:p>
             <w:pPr>
+              <w:keepNext/>
+              <w:spacing w:before="20" w:after="20"/>
+            </w:pPr>
+            <w:r>
+              <w:rPr>
+                <w:sz w:val="18"/>
+              </w:rPr>
+              <w:t xml:space="preserve">P5</w:t>
+            </w:r>
+          </w:p>
+        </w:tc>
+        <w:tc>
+          <w:tcPr>
+            <w:tcW w:type="dxa" w:w="1701"/>
+          </w:tcPr>
+          <w:p>
+            <w:pPr>
+              <w:keepNext/>
+              <w:spacing w:before="20" w:after="20"/>
+            </w:pPr>
+            <w:r>
+              <w:rPr>
+                <w:sz w:val="18"/>
+              </w:rPr>
+              <w:t xml:space="preserve">Crol</w:t>
+            </w:r>
+          </w:p>
+        </w:tc>
+        <w:tc>
+          <w:tcPr>
+            <w:tcW w:type="dxa" w:w="2494"/>
+          </w:tcPr>
+          <w:p>
+            <w:pPr>
+              <w:keepNext/>
+              <w:spacing w:before="20" w:after="20"/>
+            </w:pPr>
+            <w:r>
+              <w:rPr>
+                <w:sz w:val="18"/>
+              </w:rPr>
+              <w:t xml:space="preserve">5 / 2 / 1</w:t>
+            </w:r>
+          </w:p>
+        </w:tc>
+        <w:tc>
+          <w:tcPr>
+            <w:tcW w:type="dxa" w:w="1587"/>
+          </w:tcPr>
+          <w:p>
+            <w:pPr>
+              <w:keepNext/>
+              <w:spacing w:before="20" w:after="20"/>
+            </w:pPr>
+            <w:r>
+              <w:rPr>
+                <w:sz w:val="18"/>
+              </w:rPr>
+              <w:t xml:space="preserve">2301,9 s</w:t>
+            </w:r>
+          </w:p>
+        </w:tc>
+        <w:tc>
+          <w:tcPr>
+            <w:tcW w:type="dxa" w:w="1814"/>
+          </w:tcPr>
+          <w:p>
+            <w:pPr>
+              <w:keepNext/>
+              <w:spacing w:before="20" w:after="20"/>
+            </w:pPr>
+            <w:r>
+              <w:rPr>
+                <w:sz w:val="18"/>
+              </w:rPr>
+              <w:t xml:space="preserve">Frontal y lateral</w:t>
+            </w:r>
+          </w:p>
+        </w:tc>
+      </w:tr>
+      <w:tr>
+        <w:trPr>
+          <w:cantSplit/>
+        </w:trPr>
+        <w:tc>
+          <w:tcPr>
+            <w:tcW w:type="dxa" w:w="1474"/>
+          </w:tcPr>
+          <w:p>
+            <w:pPr>
               <w:keepNext w:val="0"/>
               <w:spacing w:before="20" w:after="20"/>
             </w:pPr>
@@ -15173,7 +15263,7 @@
                 <w:b/>
                 <w:sz w:val="18"/>
               </w:rPr>
-              <w:t xml:space="preserve">17</w:t>
+              <w:t xml:space="preserve">25</w:t>
             </w:r>
           </w:p>
         </w:tc>
@@ -15191,7 +15281,7 @@
                 <w:b/>
                 <w:sz w:val="18"/>
               </w:rPr>
-              <w:t xml:space="preserve">394,2 s</w:t>
+              <w:t xml:space="preserve">2696,1 s</w:t>
             </w:r>
           </w:p>
         </w:tc>
@@ -17933,13 +18023,13 @@
         <w:jc w:val="both"/>
       </w:pPr>
       <w:r>
-        <w:t xml:space="preserve">El análisis por lotes se aplicó a las 17 secuencias del conjunto real con la misma configuración (YOLOv8n-Pose con entrada de 640 píxeles, un fotograma de cada dos, filtros anatómicos, vista y estilo comprobados automáticamente). De los 6,6 min grabados, el sistema obtuvo </w:t>
+        <w:t xml:space="preserve">El análisis por lotes se aplicó a las 25 secuencias del conjunto real con la configuración siguiente (YOLOv8n-Pose; las 17 secuencias del conjunto inicial con la entrada validada de 640 píxeles y las 8 nuevas, procesadas en el clúster, con 1280 píxeles, un fotograma de cada dos, filtros anatómicos, vista y estilo comprobados automáticamente). De los 44,9 min grabados, el sistema obtuvo </w:t>
       </w:r>
       <w:r>
         <w:rPr>
           <w:b/>
         </w:rPr>
-        <w:t xml:space="preserve">2,2 min analizables (34 %) y 95 ciclos válidos</w:t>
+        <w:t xml:space="preserve">6,3 min analizables (14 %) y 165 ciclos válidos</w:t>
       </w:r>
       <w:r>
         <w:t xml:space="preserve"> (Figura </w:t>
@@ -17965,7 +18055,7 @@
       <w:r>
         <w:drawing>
           <wp:inline xmlns:a="http://schemas.openxmlformats.org/drawingml/2006/main" xmlns:pic="http://schemas.openxmlformats.org/drawingml/2006/picture">
-            <wp:extent cx="5400000" cy="3477600"/>
+            <wp:extent cx="5400000" cy="4860000"/>
             <wp:docPr id="12" name="Picture 12"/>
             <wp:cNvGraphicFramePr>
               <a:graphicFrameLocks noChangeAspect="1"/>
@@ -17986,7 +18076,7 @@
                   <pic:spPr>
                     <a:xfrm>
                       <a:off x="0" y="0"/>
-                      <a:ext cx="5400000" cy="3477600"/>
+                      <a:ext cx="5400000" cy="4860000"/>
                     </a:xfrm>
                     <a:prstGeom prst="rect"/>
                   </pic:spPr>
@@ -18812,6 +18902,96 @@
           </w:tcPr>
           <w:p>
             <w:pPr>
+              <w:keepNext/>
+              <w:spacing w:before="20" w:after="20"/>
+            </w:pPr>
+            <w:r>
+              <w:rPr>
+                <w:sz w:val="18"/>
+              </w:rPr>
+              <w:t xml:space="preserve">P5 · crol</w:t>
+            </w:r>
+          </w:p>
+        </w:tc>
+        <w:tc>
+          <w:tcPr>
+            <w:tcW w:type="dxa" w:w="1361"/>
+          </w:tcPr>
+          <w:p>
+            <w:pPr>
+              <w:keepNext/>
+              <w:spacing w:before="20" w:after="20"/>
+            </w:pPr>
+            <w:r>
+              <w:rPr>
+                <w:sz w:val="18"/>
+              </w:rPr>
+              <w:t xml:space="preserve">8</w:t>
+            </w:r>
+          </w:p>
+        </w:tc>
+        <w:tc>
+          <w:tcPr>
+            <w:tcW w:type="dxa" w:w="1474"/>
+          </w:tcPr>
+          <w:p>
+            <w:pPr>
+              <w:keepNext/>
+              <w:spacing w:before="20" w:after="20"/>
+            </w:pPr>
+            <w:r>
+              <w:rPr>
+                <w:sz w:val="18"/>
+              </w:rPr>
+              <w:t xml:space="preserve">2301,9 s</w:t>
+            </w:r>
+          </w:p>
+        </w:tc>
+        <w:tc>
+          <w:tcPr>
+            <w:tcW w:type="dxa" w:w="2041"/>
+          </w:tcPr>
+          <w:p>
+            <w:pPr>
+              <w:keepNext/>
+              <w:spacing w:before="20" w:after="20"/>
+            </w:pPr>
+            <w:r>
+              <w:rPr>
+                <w:sz w:val="18"/>
+              </w:rPr>
+              <w:t xml:space="preserve">248,7 s (11 %)</w:t>
+            </w:r>
+          </w:p>
+        </w:tc>
+        <w:tc>
+          <w:tcPr>
+            <w:tcW w:type="dxa" w:w="1928"/>
+          </w:tcPr>
+          <w:p>
+            <w:pPr>
+              <w:keepNext/>
+              <w:spacing w:before="20" w:after="20"/>
+            </w:pPr>
+            <w:r>
+              <w:rPr>
+                <w:sz w:val="18"/>
+              </w:rPr>
+              <w:t xml:space="preserve">70</w:t>
+            </w:r>
+          </w:p>
+        </w:tc>
+      </w:tr>
+      <w:tr>
+        <w:trPr>
+          <w:cantSplit/>
+        </w:trPr>
+        <w:tc>
+          <w:tcPr>
+            <w:tcW w:type="dxa" w:w="2268"/>
+          </w:tcPr>
+          <w:p>
+            <w:pPr>
               <w:keepNext w:val="0"/>
               <w:spacing w:before="20" w:after="20"/>
             </w:pPr>
@@ -18838,7 +19018,7 @@
                 <w:b/>
                 <w:sz w:val="18"/>
               </w:rPr>
-              <w:t xml:space="preserve">17</w:t>
+              <w:t xml:space="preserve">25</w:t>
             </w:r>
           </w:p>
         </w:tc>
@@ -18856,7 +19036,7 @@
                 <w:b/>
                 <w:sz w:val="18"/>
               </w:rPr>
-              <w:t xml:space="preserve">394,2 s</w:t>
+              <w:t xml:space="preserve">2696,1 s</w:t>
             </w:r>
           </w:p>
         </w:tc>
@@ -18874,7 +19054,7 @@
                 <w:b/>
                 <w:sz w:val="18"/>
               </w:rPr>
-              <w:t xml:space="preserve">132,3 s (34 %)</w:t>
+              <w:t xml:space="preserve">381,0 s (14 %)</w:t>
             </w:r>
           </w:p>
         </w:tc>
@@ -18892,7 +19072,7 @@
                 <w:b/>
                 <w:sz w:val="18"/>
               </w:rPr>
-              <w:t xml:space="preserve">95</w:t>
+              <w:t xml:space="preserve">165</w:t>
             </w:r>
           </w:p>
         </w:tc>
@@ -18908,7 +19088,15 @@
         <w:jc w:val="both"/>
       </w:pPr>
       <w:r>
-        <w:t xml:space="preserve">La cobertura depende sobre todo de las condiciones de grabación: la distancia entre la cámara y el nadador y el tiempo que este permanece en el encuadre. La secuencia con mayor proporción analizable es IMG_7207 (P1, crol, 85 %). 3 secuencias no producen ningún ciclo válido (GX011617, GX011610, IMG_7209), por detección insuficiente o por una señal de la mano fragmentada.</w:t>
+        <w:t xml:space="preserve">La entrada de 1280 píxeles se probó en el clúster con las 17 secuencias del conjunto inicial y no mejoró la detección respecto a la de 640 píxeles: produjo 64 ciclos válidos frente a 95, 114,5 s analizables frente a 132,3 s y un error de la frecuencia frente al conteo manual mucho mayor. Por ello, para esas secuencias se mantiene la entrada de 640 píxeles. Las secuencias nuevas de P5 solo se han analizado con 1280 píxeles; su repetición con 640 píxeles queda pendiente y podría aumentar sus ciclos válidos.</w:t>
+      </w:r>
+    </w:p>
+    <w:p>
+      <w:pPr>
+        <w:jc w:val="both"/>
+      </w:pPr>
+      <w:r>
+        <w:t xml:space="preserve">La cobertura depende sobre todo de las condiciones de grabación: la distancia entre la cámara y el nadador y el tiempo que este permanece en el encuadre. La secuencia con mayor proporción analizable es GX010719 (P5, crol, 87 %). 5 secuencias no producen ningún ciclo válido (GX011617, GX011610, IMG_7209, ASCR, GX011613), por detección insuficiente o por una señal de la mano fragmentada.</w:t>
       </w:r>
     </w:p>
     <w:p>
@@ -20146,6 +20334,130 @@
           </w:tcPr>
           <w:p>
             <w:pPr>
+              <w:keepNext/>
+              <w:spacing w:before="20" w:after="20"/>
+            </w:pPr>
+            <w:r>
+              <w:rPr>
+                <w:sz w:val="16"/>
+              </w:rPr>
+              <w:t xml:space="preserve">P4 · braza</w:t>
+            </w:r>
+          </w:p>
+        </w:tc>
+        <w:tc>
+          <w:tcPr>
+            <w:tcW w:type="dxa" w:w="737"/>
+          </w:tcPr>
+          <w:p>
+            <w:pPr>
+              <w:keepNext/>
+              <w:spacing w:before="20" w:after="20"/>
+            </w:pPr>
+            <w:r>
+              <w:rPr>
+                <w:sz w:val="16"/>
+              </w:rPr>
+              <w:t xml:space="preserve">29</w:t>
+            </w:r>
+          </w:p>
+        </w:tc>
+        <w:tc>
+          <w:tcPr>
+            <w:tcW w:type="dxa" w:w="1587"/>
+          </w:tcPr>
+          <w:p>
+            <w:pPr>
+              <w:keepNext/>
+              <w:spacing w:before="20" w:after="20"/>
+            </w:pPr>
+            <w:r>
+              <w:rPr>
+                <w:sz w:val="16"/>
+              </w:rPr>
+              <w:t xml:space="preserve">79,5 ± 17,1</w:t>
+            </w:r>
+          </w:p>
+        </w:tc>
+        <w:tc>
+          <w:tcPr>
+            <w:tcW w:type="dxa" w:w="1247"/>
+          </w:tcPr>
+          <w:p>
+            <w:pPr>
+              <w:keepNext/>
+              <w:spacing w:before="20" w:after="20"/>
+            </w:pPr>
+            <w:r>
+              <w:rPr>
+                <w:sz w:val="16"/>
+              </w:rPr>
+              <w:t xml:space="preserve">103 ± 43</w:t>
+            </w:r>
+          </w:p>
+        </w:tc>
+        <w:tc>
+          <w:tcPr>
+            <w:tcW w:type="dxa" w:w="1247"/>
+          </w:tcPr>
+          <w:p>
+            <w:pPr>
+              <w:keepNext/>
+              <w:spacing w:before="20" w:after="20"/>
+            </w:pPr>
+            <w:r>
+              <w:rPr>
+                <w:sz w:val="16"/>
+              </w:rPr>
+              <w:t xml:space="preserve">157 ± 14</w:t>
+            </w:r>
+          </w:p>
+        </w:tc>
+        <w:tc>
+          <w:tcPr>
+            <w:tcW w:type="dxa" w:w="1247"/>
+          </w:tcPr>
+          <w:p>
+            <w:pPr>
+              <w:keepNext/>
+              <w:spacing w:before="20" w:after="20"/>
+            </w:pPr>
+            <w:r>
+              <w:rPr>
+                <w:sz w:val="16"/>
+              </w:rPr>
+              <w:t xml:space="preserve">145 ± 28</w:t>
+            </w:r>
+          </w:p>
+        </w:tc>
+        <w:tc>
+          <w:tcPr>
+            <w:tcW w:type="dxa" w:w="1304"/>
+          </w:tcPr>
+          <w:p>
+            <w:pPr>
+              <w:keepNext/>
+              <w:spacing w:before="20" w:after="20"/>
+            </w:pPr>
+            <w:r>
+              <w:rPr>
+                <w:sz w:val="16"/>
+              </w:rPr>
+              <w:t xml:space="preserve">12,1 ± 5,8</w:t>
+            </w:r>
+          </w:p>
+        </w:tc>
+      </w:tr>
+      <w:tr>
+        <w:trPr>
+          <w:cantSplit/>
+        </w:trPr>
+        <w:tc>
+          <w:tcPr>
+            <w:tcW w:type="dxa" w:w="1701"/>
+          </w:tcPr>
+          <w:p>
+            <w:pPr>
               <w:keepNext w:val="0"/>
               <w:spacing w:before="20" w:after="20"/>
             </w:pPr>
@@ -20153,7 +20465,7 @@
               <w:rPr>
                 <w:sz w:val="16"/>
               </w:rPr>
-              <w:t xml:space="preserve">P4 · braza</w:t>
+              <w:t xml:space="preserve">P5 · crol</w:t>
             </w:r>
           </w:p>
         </w:tc>
@@ -20170,7 +20482,7 @@
               <w:rPr>
                 <w:sz w:val="16"/>
               </w:rPr>
-              <w:t xml:space="preserve">29</w:t>
+              <w:t xml:space="preserve">54</w:t>
             </w:r>
           </w:p>
         </w:tc>
@@ -20187,7 +20499,7 @@
               <w:rPr>
                 <w:sz w:val="16"/>
               </w:rPr>
-              <w:t xml:space="preserve">79,5 ± 17,1</w:t>
+              <w:t xml:space="preserve">49,1 ± 10,6</w:t>
             </w:r>
           </w:p>
         </w:tc>
@@ -20204,7 +20516,7 @@
               <w:rPr>
                 <w:sz w:val="16"/>
               </w:rPr>
-              <w:t xml:space="preserve">103 ± 43</w:t>
+              <w:t xml:space="preserve">96 ± 38</w:t>
             </w:r>
           </w:p>
         </w:tc>
@@ -20221,7 +20533,7 @@
               <w:rPr>
                 <w:sz w:val="16"/>
               </w:rPr>
-              <w:t xml:space="preserve">157 ± 14</w:t>
+              <w:t xml:space="preserve">146 ± 35</w:t>
             </w:r>
           </w:p>
         </w:tc>
@@ -20238,7 +20550,7 @@
               <w:rPr>
                 <w:sz w:val="16"/>
               </w:rPr>
-              <w:t xml:space="preserve">145 ± 28</w:t>
+              <w:t xml:space="preserve">105 ± 56</w:t>
             </w:r>
           </w:p>
         </w:tc>
@@ -20255,7 +20567,7 @@
               <w:rPr>
                 <w:sz w:val="16"/>
               </w:rPr>
-              <w:t xml:space="preserve">12,1 ± 5,8</w:t>
+              <w:t xml:space="preserve">16,7 ± 10,7</w:t>
             </w:r>
           </w:p>
         </w:tc>
@@ -20451,6 +20763,27 @@
     </w:p>
     <w:p>
       <w:pPr>
+        <w:pStyle w:val="Prrafodelista"/>
+        <w:numPr>
+          <w:ilvl w:val="0"/>
+          <w:numId w:val="27"/>
+        </w:numPr>
+        <w:spacing w:before="0" w:after="0"/>
+        <w:jc w:val="both"/>
+      </w:pPr>
+      <w:pPr/>
+      <w:r>
+        <w:rPr>
+          <w:b/>
+        </w:rPr>
+        <w:t xml:space="preserve">P5 · crol</w:t>
+      </w:r>
+      <w:r>
+        <w:t xml:space="preserve">: 54 ciclos, 49,1 ciclos/min, inclinación del tronco de 16,7° y ángulo de cadera de 146°, valores coherentes con un cuerpo alineado.</w:t>
+      </w:r>
+    </w:p>
+    <w:p>
+      <w:pPr>
         <w:jc w:val="both"/>
       </w:pPr>
       <w:r>
@@ -20463,7 +20796,7 @@
         <w:keepNext/>
       </w:pPr>
       <w:r>
-        <w:t xml:space="preserve">Fatiga en las sesiones de pasadas cortas</w:t>
+        <w:t xml:space="preserve">Fatiga en una secuencia continua de larga duración</w:t>
       </w:r>
     </w:p>
     <w:p>
@@ -20471,615 +20804,28 @@
         <w:jc w:val="both"/>
       </w:pPr>
       <w:r>
-        <w:t xml:space="preserve">Las secuencias cortas de un mismo participante, estilo y cámara se unen en sesiones. El análisis de fatiga se aplica a las sesiones con al menos ocho ciclos (Tabla </w:t>
-      </w:r>
-      <w:r>
-        <w:t xml:space="preserve">11</w:t>
-      </w:r>
-      <w:r>
-        <w:t xml:space="preserve">).</w:t>
-      </w:r>
-    </w:p>
-    <w:p>
-      <w:pPr>
-        <w:pStyle w:val="Caption"/>
-        <w:keepNext/>
-        <w:jc w:val="center"/>
-      </w:pPr>
-      <w:r>
-        <w:t xml:space="preserve">Tabla </w:t>
-      </w:r>
-      <w:r>
-        <w:fldChar w:fldCharType="begin"/>
-      </w:r>
-      <w:r>
-        <w:instrText xml:space="preserve"> SEQ Tabla \* ARABIC </w:instrText>
-      </w:r>
-      <w:r>
-        <w:fldChar w:fldCharType="separate"/>
-      </w:r>
-      <w:r>
-        <w:t xml:space="preserve">11</w:t>
-      </w:r>
-      <w:r>
-        <w:fldChar w:fldCharType="end"/>
-      </w:r>
-      <w:r>
-        <w:t xml:space="preserve">. </w:t>
-      </w:r>
-      <w:r>
-        <w:t xml:space="preserve">Resultado del análisis de fatiga en las sesiones con más de una secuencia.</w:t>
-      </w:r>
-    </w:p>
-    <w:tbl>
-      <w:tblPr>
-        <w:tblStyle w:val="Tablaconcuadrcula"/>
-        <w:tblW w:type="auto" w:w="0"/>
-        <w:tblLook w:firstColumn="1" w:firstRow="1" w:lastColumn="0" w:lastRow="0" w:noHBand="0" w:noVBand="1" w:val="04A0"/>
-      </w:tblPr>
-      <w:tblGrid>
-        <w:gridCol w:w="2835"/>
-        <w:gridCol w:w="1134"/>
-        <w:gridCol w:w="850"/>
-        <w:gridCol w:w="1701"/>
-        <w:gridCol w:w="2551"/>
-      </w:tblGrid>
-      <w:tr>
-        <w:trPr>
-          <w:cantSplit/>
-          <w:tblHeader/>
-        </w:trPr>
-        <w:tc>
-          <w:tcPr>
-            <w:tcW w:type="dxa" w:w="2835"/>
-            <w:shd w:val="clear" w:color="auto" w:fill="D9E2F3"/>
-          </w:tcPr>
-          <w:p>
-            <w:pPr>
-              <w:keepNext/>
-              <w:spacing w:before="20" w:after="20"/>
-            </w:pPr>
-            <w:r>
-              <w:rPr>
-                <w:b/>
-                <w:sz w:val="18"/>
-              </w:rPr>
-              <w:t xml:space="preserve">Sesión</w:t>
-            </w:r>
-          </w:p>
-        </w:tc>
-        <w:tc>
-          <w:tcPr>
-            <w:tcW w:type="dxa" w:w="1134"/>
-            <w:shd w:val="clear" w:color="auto" w:fill="D9E2F3"/>
-          </w:tcPr>
-          <w:p>
-            <w:pPr>
-              <w:keepNext/>
-              <w:spacing w:before="20" w:after="20"/>
-            </w:pPr>
-            <w:r>
-              <w:rPr>
-                <w:b/>
-                <w:sz w:val="18"/>
-              </w:rPr>
-              <w:t xml:space="preserve">Secuencias</w:t>
-            </w:r>
-          </w:p>
-        </w:tc>
-        <w:tc>
-          <w:tcPr>
-            <w:tcW w:type="dxa" w:w="850"/>
-            <w:shd w:val="clear" w:color="auto" w:fill="D9E2F3"/>
-          </w:tcPr>
-          <w:p>
-            <w:pPr>
-              <w:keepNext/>
-              <w:spacing w:before="20" w:after="20"/>
-            </w:pPr>
-            <w:r>
-              <w:rPr>
-                <w:b/>
-                <w:sz w:val="18"/>
-              </w:rPr>
-              <w:t xml:space="preserve">Ciclos</w:t>
-            </w:r>
-          </w:p>
-        </w:tc>
-        <w:tc>
-          <w:tcPr>
-            <w:tcW w:type="dxa" w:w="1701"/>
-            <w:shd w:val="clear" w:color="auto" w:fill="D9E2F3"/>
-          </w:tcPr>
-          <w:p>
-            <w:pPr>
-              <w:keepNext/>
-              <w:spacing w:before="20" w:after="20"/>
-            </w:pPr>
-            <w:r>
-              <w:rPr>
-                <w:b/>
-                <w:sz w:val="18"/>
-              </w:rPr>
-              <w:t xml:space="preserve">Inicio de la fatiga</w:t>
-            </w:r>
-          </w:p>
-        </w:tc>
-        <w:tc>
-          <w:tcPr>
-            <w:tcW w:type="dxa" w:w="2551"/>
-            <w:shd w:val="clear" w:color="auto" w:fill="D9E2F3"/>
-          </w:tcPr>
-          <w:p>
-            <w:pPr>
-              <w:keepNext/>
-              <w:spacing w:before="20" w:after="20"/>
-            </w:pPr>
-            <w:r>
-              <w:rPr>
-                <w:b/>
-                <w:sz w:val="18"/>
-              </w:rPr>
-              <w:t xml:space="preserve">Resultado</w:t>
-            </w:r>
-          </w:p>
-        </w:tc>
-      </w:tr>
-      <w:tr>
-        <w:trPr>
-          <w:cantSplit/>
-        </w:trPr>
-        <w:tc>
-          <w:tcPr>
-            <w:tcW w:type="dxa" w:w="2835"/>
-          </w:tcPr>
-          <w:p>
-            <w:pPr>
-              <w:keepNext/>
-              <w:spacing w:before="20" w:after="20"/>
-            </w:pPr>
-            <w:r>
-              <w:rPr>
-                <w:sz w:val="18"/>
-              </w:rPr>
-              <w:t xml:space="preserve">P1 · crol · GoPro</w:t>
-            </w:r>
-          </w:p>
-        </w:tc>
-        <w:tc>
-          <w:tcPr>
-            <w:tcW w:type="dxa" w:w="1134"/>
-          </w:tcPr>
-          <w:p>
-            <w:pPr>
-              <w:keepNext/>
-              <w:spacing w:before="20" w:after="20"/>
-            </w:pPr>
-            <w:r>
-              <w:rPr>
-                <w:sz w:val="18"/>
-              </w:rPr>
-              <w:t xml:space="preserve">3</w:t>
-            </w:r>
-          </w:p>
-        </w:tc>
-        <w:tc>
-          <w:tcPr>
-            <w:tcW w:type="dxa" w:w="850"/>
-          </w:tcPr>
-          <w:p>
-            <w:pPr>
-              <w:keepNext/>
-              <w:spacing w:before="20" w:after="20"/>
-            </w:pPr>
-            <w:r>
-              <w:rPr>
-                <w:sz w:val="18"/>
-              </w:rPr>
-              <w:t xml:space="preserve">10</w:t>
-            </w:r>
-          </w:p>
-        </w:tc>
-        <w:tc>
-          <w:tcPr>
-            <w:tcW w:type="dxa" w:w="1701"/>
-          </w:tcPr>
-          <w:p>
-            <w:pPr>
-              <w:keepNext/>
-              <w:spacing w:before="20" w:after="20"/>
-            </w:pPr>
-            <w:r>
-              <w:rPr>
-                <w:sz w:val="18"/>
-              </w:rPr>
-              <w:t xml:space="preserve">—</w:t>
-            </w:r>
-          </w:p>
-        </w:tc>
-        <w:tc>
-          <w:tcPr>
-            <w:tcW w:type="dxa" w:w="2551"/>
-          </w:tcPr>
-          <w:p>
-            <w:pPr>
-              <w:keepNext/>
-              <w:spacing w:before="20" w:after="20"/>
-            </w:pPr>
-            <w:r>
-              <w:rPr>
-                <w:sz w:val="18"/>
-              </w:rPr>
-              <w:t xml:space="preserve">Sin fatiga sostenida</w:t>
-            </w:r>
-          </w:p>
-        </w:tc>
-      </w:tr>
-      <w:tr>
-        <w:trPr>
-          <w:cantSplit/>
-        </w:trPr>
-        <w:tc>
-          <w:tcPr>
-            <w:tcW w:type="dxa" w:w="2835"/>
-          </w:tcPr>
-          <w:p>
-            <w:pPr>
-              <w:keepNext/>
-              <w:spacing w:before="20" w:after="20"/>
-            </w:pPr>
-            <w:r>
-              <w:rPr>
-                <w:sz w:val="18"/>
-              </w:rPr>
-              <w:t xml:space="preserve">P1 · crol · móvil</w:t>
-            </w:r>
-          </w:p>
-        </w:tc>
-        <w:tc>
-          <w:tcPr>
-            <w:tcW w:type="dxa" w:w="1134"/>
-          </w:tcPr>
-          <w:p>
-            <w:pPr>
-              <w:keepNext/>
-              <w:spacing w:before="20" w:after="20"/>
-            </w:pPr>
-            <w:r>
-              <w:rPr>
-                <w:sz w:val="18"/>
-              </w:rPr>
-              <w:t xml:space="preserve">2</w:t>
-            </w:r>
-          </w:p>
-        </w:tc>
-        <w:tc>
-          <w:tcPr>
-            <w:tcW w:type="dxa" w:w="850"/>
-          </w:tcPr>
-          <w:p>
-            <w:pPr>
-              <w:keepNext/>
-              <w:spacing w:before="20" w:after="20"/>
-            </w:pPr>
-            <w:r>
-              <w:rPr>
-                <w:sz w:val="18"/>
-              </w:rPr>
-              <w:t xml:space="preserve">7</w:t>
-            </w:r>
-          </w:p>
-        </w:tc>
-        <w:tc>
-          <w:tcPr>
-            <w:tcW w:type="dxa" w:w="1701"/>
-          </w:tcPr>
-          <w:p>
-            <w:pPr>
-              <w:keepNext/>
-              <w:spacing w:before="20" w:after="20"/>
-            </w:pPr>
-            <w:r>
-              <w:rPr>
-                <w:sz w:val="18"/>
-              </w:rPr>
-              <w:t xml:space="preserve">—</w:t>
-            </w:r>
-          </w:p>
-        </w:tc>
-        <w:tc>
-          <w:tcPr>
-            <w:tcW w:type="dxa" w:w="2551"/>
-          </w:tcPr>
-          <w:p>
-            <w:pPr>
-              <w:keepNext/>
-              <w:spacing w:before="20" w:after="20"/>
-            </w:pPr>
-            <w:r>
-              <w:rPr>
-                <w:sz w:val="18"/>
-              </w:rPr>
-              <w:t xml:space="preserve">Insuficiente (&lt; 8 ciclos)</w:t>
-            </w:r>
-          </w:p>
-        </w:tc>
-      </w:tr>
-      <w:tr>
-        <w:trPr>
-          <w:cantSplit/>
-        </w:trPr>
-        <w:tc>
-          <w:tcPr>
-            <w:tcW w:type="dxa" w:w="2835"/>
-          </w:tcPr>
-          <w:p>
-            <w:pPr>
-              <w:keepNext/>
-              <w:spacing w:before="20" w:after="20"/>
-            </w:pPr>
-            <w:r>
-              <w:rPr>
-                <w:sz w:val="18"/>
-              </w:rPr>
-              <w:t xml:space="preserve">P4 · braza · GoPro</w:t>
-            </w:r>
-          </w:p>
-        </w:tc>
-        <w:tc>
-          <w:tcPr>
-            <w:tcW w:type="dxa" w:w="1134"/>
-          </w:tcPr>
-          <w:p>
-            <w:pPr>
-              <w:keepNext/>
-              <w:spacing w:before="20" w:after="20"/>
-            </w:pPr>
-            <w:r>
-              <w:rPr>
-                <w:sz w:val="18"/>
-              </w:rPr>
-              <w:t xml:space="preserve">2</w:t>
-            </w:r>
-          </w:p>
-        </w:tc>
-        <w:tc>
-          <w:tcPr>
-            <w:tcW w:type="dxa" w:w="850"/>
-          </w:tcPr>
-          <w:p>
-            <w:pPr>
-              <w:keepNext/>
-              <w:spacing w:before="20" w:after="20"/>
-            </w:pPr>
-            <w:r>
-              <w:rPr>
-                <w:sz w:val="18"/>
-              </w:rPr>
-              <w:t xml:space="preserve">27</w:t>
-            </w:r>
-          </w:p>
-        </w:tc>
-        <w:tc>
-          <w:tcPr>
-            <w:tcW w:type="dxa" w:w="1701"/>
-          </w:tcPr>
-          <w:p>
-            <w:pPr>
-              <w:keepNext/>
-              <w:spacing w:before="20" w:after="20"/>
-            </w:pPr>
-            <w:r>
-              <w:rPr>
-                <w:sz w:val="18"/>
-              </w:rPr>
-              <w:t xml:space="preserve">—</w:t>
-            </w:r>
-          </w:p>
-        </w:tc>
-        <w:tc>
-          <w:tcPr>
-            <w:tcW w:type="dxa" w:w="2551"/>
-          </w:tcPr>
-          <w:p>
-            <w:pPr>
-              <w:keepNext/>
-              <w:spacing w:before="20" w:after="20"/>
-            </w:pPr>
-            <w:r>
-              <w:rPr>
-                <w:sz w:val="18"/>
-              </w:rPr>
-              <w:t xml:space="preserve">Sin fatiga sostenida</w:t>
-            </w:r>
-          </w:p>
-        </w:tc>
-      </w:tr>
-      <w:tr>
-        <w:trPr>
-          <w:cantSplit/>
-        </w:trPr>
-        <w:tc>
-          <w:tcPr>
-            <w:tcW w:type="dxa" w:w="2835"/>
-          </w:tcPr>
-          <w:p>
-            <w:pPr>
-              <w:keepNext/>
-              <w:spacing w:before="20" w:after="20"/>
-            </w:pPr>
-            <w:r>
-              <w:rPr>
-                <w:sz w:val="18"/>
-              </w:rPr>
-              <w:t xml:space="preserve">P4 · braza · móvil</w:t>
-            </w:r>
-          </w:p>
-        </w:tc>
-        <w:tc>
-          <w:tcPr>
-            <w:tcW w:type="dxa" w:w="1134"/>
-          </w:tcPr>
-          <w:p>
-            <w:pPr>
-              <w:keepNext/>
-              <w:spacing w:before="20" w:after="20"/>
-            </w:pPr>
-            <w:r>
-              <w:rPr>
-                <w:sz w:val="18"/>
-              </w:rPr>
-              <w:t xml:space="preserve">2</w:t>
-            </w:r>
-          </w:p>
-        </w:tc>
-        <w:tc>
-          <w:tcPr>
-            <w:tcW w:type="dxa" w:w="850"/>
-          </w:tcPr>
-          <w:p>
-            <w:pPr>
-              <w:keepNext/>
-              <w:spacing w:before="20" w:after="20"/>
-            </w:pPr>
-            <w:r>
-              <w:rPr>
-                <w:sz w:val="18"/>
-              </w:rPr>
-              <w:t xml:space="preserve">4</w:t>
-            </w:r>
-          </w:p>
-        </w:tc>
-        <w:tc>
-          <w:tcPr>
-            <w:tcW w:type="dxa" w:w="1701"/>
-          </w:tcPr>
-          <w:p>
-            <w:pPr>
-              <w:keepNext/>
-              <w:spacing w:before="20" w:after="20"/>
-            </w:pPr>
-            <w:r>
-              <w:rPr>
-                <w:sz w:val="18"/>
-              </w:rPr>
-              <w:t xml:space="preserve">—</w:t>
-            </w:r>
-          </w:p>
-        </w:tc>
-        <w:tc>
-          <w:tcPr>
-            <w:tcW w:type="dxa" w:w="2551"/>
-          </w:tcPr>
-          <w:p>
-            <w:pPr>
-              <w:keepNext/>
-              <w:spacing w:before="20" w:after="20"/>
-            </w:pPr>
-            <w:r>
-              <w:rPr>
-                <w:sz w:val="18"/>
-              </w:rPr>
-              <w:t xml:space="preserve">Insuficiente (&lt; 8 ciclos)</w:t>
-            </w:r>
-          </w:p>
-        </w:tc>
-      </w:tr>
-      <w:tr>
-        <w:trPr>
-          <w:cantSplit/>
-        </w:trPr>
-        <w:tc>
-          <w:tcPr>
-            <w:tcW w:type="dxa" w:w="2835"/>
-          </w:tcPr>
-          <w:p>
-            <w:pPr>
-              <w:keepNext w:val="0"/>
-              <w:spacing w:before="20" w:after="20"/>
-            </w:pPr>
-            <w:r>
-              <w:rPr>
-                <w:sz w:val="18"/>
-              </w:rPr>
-              <w:t xml:space="preserve">P3 · mariposa · GoPro</w:t>
-            </w:r>
-          </w:p>
-        </w:tc>
-        <w:tc>
-          <w:tcPr>
-            <w:tcW w:type="dxa" w:w="1134"/>
-          </w:tcPr>
-          <w:p>
-            <w:pPr>
-              <w:keepNext w:val="0"/>
-              <w:spacing w:before="20" w:after="20"/>
-            </w:pPr>
-            <w:r>
-              <w:rPr>
-                <w:sz w:val="18"/>
-              </w:rPr>
-              <w:t xml:space="preserve">2</w:t>
-            </w:r>
-          </w:p>
-        </w:tc>
-        <w:tc>
-          <w:tcPr>
-            <w:tcW w:type="dxa" w:w="850"/>
-          </w:tcPr>
-          <w:p>
-            <w:pPr>
-              <w:keepNext w:val="0"/>
-              <w:spacing w:before="20" w:after="20"/>
-            </w:pPr>
-            <w:r>
-              <w:rPr>
-                <w:sz w:val="18"/>
-              </w:rPr>
-              <w:t xml:space="preserve">26</w:t>
-            </w:r>
-          </w:p>
-        </w:tc>
-        <w:tc>
-          <w:tcPr>
-            <w:tcW w:type="dxa" w:w="1701"/>
-          </w:tcPr>
-          <w:p>
-            <w:pPr>
-              <w:keepNext w:val="0"/>
-              <w:spacing w:before="20" w:after="20"/>
-            </w:pPr>
-            <w:r>
-              <w:rPr>
-                <w:sz w:val="18"/>
-              </w:rPr>
-              <w:t xml:space="preserve">—</w:t>
-            </w:r>
-          </w:p>
-        </w:tc>
-        <w:tc>
-          <w:tcPr>
-            <w:tcW w:type="dxa" w:w="2551"/>
-          </w:tcPr>
-          <w:p>
-            <w:pPr>
-              <w:keepNext w:val="0"/>
-              <w:spacing w:before="20" w:after="20"/>
-            </w:pPr>
-            <w:r>
-              <w:rPr>
-                <w:sz w:val="18"/>
-              </w:rPr>
-              <w:t xml:space="preserve">Sin fatiga sostenida</w:t>
-            </w:r>
-          </w:p>
-        </w:tc>
-      </w:tr>
-    </w:tbl>
+        <w:t xml:space="preserve">La secuencia GX010731 (P5, crol) dura 34,5 min y es la única del conjunto con duración suficiente para observar la fatiga dentro de una misma grabación. El sistema determinó la vista por tramos (lateral de 0,0 a 34,5 min), obtuvo 2,2 min analizables y 19 ciclos válidos, con una frecuencia media de 51,6 ciclos/min.</w:t>
+      </w:r>
+    </w:p>
     <w:p>
       <w:pPr>
         <w:jc w:val="both"/>
       </w:pPr>
+      <w:r>
+        <w:rPr>
+          <w:b/>
+        </w:rPr>
+        <w:t xml:space="preserve">El sistema detecta el inicio de la fatiga técnica en el ciclo 7 (t = 748,0 s, 12,5 min)</w:t>
+      </w:r>
+      <w:r>
+        <w:t xml:space="preserve">: a partir de ese ciclo la puntuación de anomalía respecto a la fase base del propio nadador supera el umbral de forma sostenida (Figura </w:t>
+      </w:r>
+      <w:r>
+        <w:t xml:space="preserve">12</w:t>
+      </w:r>
+      <w:r>
+        <w:t xml:space="preserve">). Las variables con mayor atribución SHAP tras el inicio son: Amplitud de patada (troncos): 0,27 → 0,62 (+125%); Frecuencia de ciclo (ciclos/min): 44,59 → 55,27 (+24%); Flexión codo dcho. en agarre (°): 101,96 → 86,23 (-15%); Apertura hombro dcho. (°): 78,40 → 98,73 (+26%).</w:t>
+      </w:r>
     </w:p>
     <w:p>
       <w:pPr>
@@ -21098,7 +20844,7 @@
               <a:graphicData uri="http://schemas.openxmlformats.org/drawingml/2006/picture">
                 <pic:pic>
                   <pic:nvPicPr>
-                    <pic:cNvPr id="0" name="real_sesion_P4_braza_gopro.png"/>
+                    <pic:cNvPr id="0" name="real_largo_fatiga_timeline.png"/>
                     <pic:cNvPicPr/>
                   </pic:nvPicPr>
                   <pic:blipFill>
@@ -21148,7 +20894,147 @@
         <w:t xml:space="preserve">. </w:t>
       </w:r>
       <w:r>
-        <w:t xml:space="preserve">Sesión P4 · braza · gopro: puntuación de anomalía por ciclo y umbral de la fase base.</w:t>
+        <w:t xml:space="preserve">Secuencia GX010731 (P5): puntuación de anomalía por ciclo, umbral de la fase base y frecuencia y flexión del codo por ciclo.</w:t>
+      </w:r>
+    </w:p>
+    <w:p>
+      <w:pPr>
+        <w:keepNext/>
+        <w:jc w:val="center"/>
+      </w:pPr>
+      <w:r>
+        <w:drawing>
+          <wp:inline xmlns:a="http://schemas.openxmlformats.org/drawingml/2006/main" xmlns:pic="http://schemas.openxmlformats.org/drawingml/2006/picture">
+            <wp:extent cx="4320000" cy="4019195"/>
+            <wp:docPr id="15" name="Picture 15"/>
+            <wp:cNvGraphicFramePr>
+              <a:graphicFrameLocks noChangeAspect="1"/>
+            </wp:cNvGraphicFramePr>
+            <a:graphic>
+              <a:graphicData uri="http://schemas.openxmlformats.org/drawingml/2006/picture">
+                <pic:pic>
+                  <pic:nvPicPr>
+                    <pic:cNvPr id="0" name="real_largo_shap_summary.png"/>
+                    <pic:cNvPicPr/>
+                  </pic:nvPicPr>
+                  <pic:blipFill>
+                    <a:blip r:embed="rId28"/>
+                    <a:stretch>
+                      <a:fillRect/>
+                    </a:stretch>
+                  </pic:blipFill>
+                  <pic:spPr>
+                    <a:xfrm>
+                      <a:off x="0" y="0"/>
+                      <a:ext cx="4320000" cy="4019195"/>
+                    </a:xfrm>
+                    <a:prstGeom prst="rect"/>
+                  </pic:spPr>
+                </pic:pic>
+              </a:graphicData>
+            </a:graphic>
+          </wp:inline>
+        </w:drawing>
+      </w:r>
+    </w:p>
+    <w:p>
+      <w:pPr>
+        <w:pStyle w:val="Caption"/>
+        <w:jc w:val="center"/>
+      </w:pPr>
+      <w:r>
+        <w:t xml:space="preserve">Figura </w:t>
+      </w:r>
+      <w:r>
+        <w:fldChar w:fldCharType="begin"/>
+      </w:r>
+      <w:r>
+        <w:instrText xml:space="preserve"> SEQ Figura \* ARABIC </w:instrText>
+      </w:r>
+      <w:r>
+        <w:fldChar w:fldCharType="separate"/>
+      </w:r>
+      <w:r>
+        <w:t xml:space="preserve">13</w:t>
+      </w:r>
+      <w:r>
+        <w:fldChar w:fldCharType="end"/>
+      </w:r>
+      <w:r>
+        <w:t xml:space="preserve">. </w:t>
+      </w:r>
+      <w:r>
+        <w:t xml:space="preserve">Secuencia GX010731 (P5): atribución SHAP de la puntuación de anomalía.</w:t>
+      </w:r>
+    </w:p>
+    <w:p>
+      <w:pPr>
+        <w:keepNext/>
+        <w:jc w:val="center"/>
+      </w:pPr>
+      <w:r>
+        <w:drawing>
+          <wp:inline xmlns:a="http://schemas.openxmlformats.org/drawingml/2006/main" xmlns:pic="http://schemas.openxmlformats.org/drawingml/2006/picture">
+            <wp:extent cx="4320000" cy="3313499"/>
+            <wp:docPr id="16" name="Picture 16"/>
+            <wp:cNvGraphicFramePr>
+              <a:graphicFrameLocks noChangeAspect="1"/>
+            </wp:cNvGraphicFramePr>
+            <a:graphic>
+              <a:graphicData uri="http://schemas.openxmlformats.org/drawingml/2006/picture">
+                <pic:pic>
+                  <pic:nvPicPr>
+                    <pic:cNvPr id="0" name="real_largo_shap_waterfall_inicio.png"/>
+                    <pic:cNvPicPr/>
+                  </pic:nvPicPr>
+                  <pic:blipFill>
+                    <a:blip r:embed="rId29"/>
+                    <a:stretch>
+                      <a:fillRect/>
+                    </a:stretch>
+                  </pic:blipFill>
+                  <pic:spPr>
+                    <a:xfrm>
+                      <a:off x="0" y="0"/>
+                      <a:ext cx="4320000" cy="3313499"/>
+                    </a:xfrm>
+                    <a:prstGeom prst="rect"/>
+                  </pic:spPr>
+                </pic:pic>
+              </a:graphicData>
+            </a:graphic>
+          </wp:inline>
+        </w:drawing>
+      </w:r>
+    </w:p>
+    <w:p>
+      <w:pPr>
+        <w:pStyle w:val="Caption"/>
+        <w:jc w:val="center"/>
+      </w:pPr>
+      <w:r>
+        <w:t xml:space="preserve">Figura </w:t>
+      </w:r>
+      <w:r>
+        <w:fldChar w:fldCharType="begin"/>
+      </w:r>
+      <w:r>
+        <w:instrText xml:space="preserve"> SEQ Figura \* ARABIC </w:instrText>
+      </w:r>
+      <w:r>
+        <w:fldChar w:fldCharType="separate"/>
+      </w:r>
+      <w:r>
+        <w:t xml:space="preserve">14</w:t>
+      </w:r>
+      <w:r>
+        <w:fldChar w:fldCharType="end"/>
+      </w:r>
+      <w:r>
+        <w:t xml:space="preserve">. </w:t>
+      </w:r>
+      <w:r>
+        <w:t xml:space="preserve">Secuencia GX010731 (P5): atribución SHAP en el ciclo de inicio de la fatiga.</w:t>
       </w:r>
     </w:p>
     <w:p>
@@ -21156,7 +21042,7 @@
         <w:jc w:val="both"/>
       </w:pPr>
       <w:r>
-        <w:t xml:space="preserve">Las sesiones están formadas por pasadas cortas a ritmo de técnica, separadas por descansos, y no por un esfuerzo continuo capaz de producir fatiga. Que el sistema no genere falsas alarmas en ellas es un resultado relevante, aunque no demuestra por sí solo su capacidad de detectar la fatiga.</w:t>
+        <w:t xml:space="preserve">El resultado debe interpretarse con cautela. Los 19 ciclos válidos están repartidos a lo largo de toda la grabación (uno cada 1,8 min de media), porque el nadador solo es analizable cuando nada cerca de la cámara; la fase base la forman los primeros ciclos, pocos, y el análisis compara pasadas separadas por minutos de entrenamiento, que pueden incluir cambios de ritmo o de ejercicio. Además, el estilo observado (brazos simultaneos) no coincide con el indicado (crol), lo que sugiere que la sesión contiene tramos de otros estilos o ejercicios técnicos. No se dispone de una referencia independiente del estado de fatiga (lactato, esfuerzo percibido o valoración del entrenador). El resultado es, por tanto, un indicio de cambio técnico sostenido compatible con la fatiga, no una fatiga fisiológica confirmada; su validación requiere grabar series de nado continuo con el nadador siempre en el encuadre.</w:t>
       </w:r>
     </w:p>
     <w:p>
@@ -21165,7 +21051,7 @@
         <w:keepNext/>
       </w:pPr>
       <w:r>
-        <w:t xml:space="preserve">Estimación del estilo con vídeos reales</w:t>
+        <w:t xml:space="preserve">Fatiga en las sesiones de pasadas cortas</w:t>
       </w:r>
     </w:p>
     <w:p>
@@ -21173,24 +21059,872 @@
         <w:jc w:val="both"/>
       </w:pPr>
       <w:r>
-        <w:t xml:space="preserve">El enfoque supervisado se evaluó primero con los vídeos reales: 42 ventanas de 11 vídeos con señal suficiente. Dejando un vídeo fuera, acertó el 45,5 % de los vídeos (54,5 % al añadir datos sintéticos), frente al 36,4 % de asignar siempre la clase mayoritaria; dejando fuera un participante completo, el 9,1 %; y entrenado solo con datos sintéticos, el 9,1 %. El estilo está confundido con el nadador y los rasgos que distinguen los estilos en la simulación, la alternancia de piernas y brazos, son los que el modelo de pose no reproduce bajo el agua.</w:t>
-      </w:r>
-    </w:p>
+        <w:t xml:space="preserve">Las secuencias cortas de un mismo participante, estilo y cámara se unen en sesiones. El análisis de fatiga se aplica a las sesiones con al menos ocho ciclos (Tabla </w:t>
+      </w:r>
+      <w:r>
+        <w:t xml:space="preserve">11</w:t>
+      </w:r>
+      <w:r>
+        <w:t xml:space="preserve">).</w:t>
+      </w:r>
+    </w:p>
+    <w:p>
+      <w:pPr>
+        <w:pStyle w:val="Caption"/>
+        <w:keepNext/>
+        <w:jc w:val="center"/>
+      </w:pPr>
+      <w:r>
+        <w:t xml:space="preserve">Tabla </w:t>
+      </w:r>
+      <w:r>
+        <w:fldChar w:fldCharType="begin"/>
+      </w:r>
+      <w:r>
+        <w:instrText xml:space="preserve"> SEQ Tabla \* ARABIC </w:instrText>
+      </w:r>
+      <w:r>
+        <w:fldChar w:fldCharType="separate"/>
+      </w:r>
+      <w:r>
+        <w:t xml:space="preserve">11</w:t>
+      </w:r>
+      <w:r>
+        <w:fldChar w:fldCharType="end"/>
+      </w:r>
+      <w:r>
+        <w:t xml:space="preserve">. </w:t>
+      </w:r>
+      <w:r>
+        <w:t xml:space="preserve">Resultado del análisis de fatiga en las sesiones con más de una secuencia.</w:t>
+      </w:r>
+    </w:p>
+    <w:tbl>
+      <w:tblPr>
+        <w:tblStyle w:val="Tablaconcuadrcula"/>
+        <w:tblW w:type="auto" w:w="0"/>
+        <w:tblLook w:firstColumn="1" w:firstRow="1" w:lastColumn="0" w:lastRow="0" w:noHBand="0" w:noVBand="1" w:val="04A0"/>
+      </w:tblPr>
+      <w:tblGrid>
+        <w:gridCol w:w="2835"/>
+        <w:gridCol w:w="1134"/>
+        <w:gridCol w:w="850"/>
+        <w:gridCol w:w="1701"/>
+        <w:gridCol w:w="2551"/>
+      </w:tblGrid>
+      <w:tr>
+        <w:trPr>
+          <w:cantSplit/>
+          <w:tblHeader/>
+        </w:trPr>
+        <w:tc>
+          <w:tcPr>
+            <w:tcW w:type="dxa" w:w="2835"/>
+            <w:shd w:val="clear" w:color="auto" w:fill="D9E2F3"/>
+          </w:tcPr>
+          <w:p>
+            <w:pPr>
+              <w:keepNext/>
+              <w:spacing w:before="20" w:after="20"/>
+            </w:pPr>
+            <w:r>
+              <w:rPr>
+                <w:b/>
+                <w:sz w:val="18"/>
+              </w:rPr>
+              <w:t xml:space="preserve">Sesión</w:t>
+            </w:r>
+          </w:p>
+        </w:tc>
+        <w:tc>
+          <w:tcPr>
+            <w:tcW w:type="dxa" w:w="1134"/>
+            <w:shd w:val="clear" w:color="auto" w:fill="D9E2F3"/>
+          </w:tcPr>
+          <w:p>
+            <w:pPr>
+              <w:keepNext/>
+              <w:spacing w:before="20" w:after="20"/>
+            </w:pPr>
+            <w:r>
+              <w:rPr>
+                <w:b/>
+                <w:sz w:val="18"/>
+              </w:rPr>
+              <w:t xml:space="preserve">Secuencias</w:t>
+            </w:r>
+          </w:p>
+        </w:tc>
+        <w:tc>
+          <w:tcPr>
+            <w:tcW w:type="dxa" w:w="850"/>
+            <w:shd w:val="clear" w:color="auto" w:fill="D9E2F3"/>
+          </w:tcPr>
+          <w:p>
+            <w:pPr>
+              <w:keepNext/>
+              <w:spacing w:before="20" w:after="20"/>
+            </w:pPr>
+            <w:r>
+              <w:rPr>
+                <w:b/>
+                <w:sz w:val="18"/>
+              </w:rPr>
+              <w:t xml:space="preserve">Ciclos</w:t>
+            </w:r>
+          </w:p>
+        </w:tc>
+        <w:tc>
+          <w:tcPr>
+            <w:tcW w:type="dxa" w:w="1701"/>
+            <w:shd w:val="clear" w:color="auto" w:fill="D9E2F3"/>
+          </w:tcPr>
+          <w:p>
+            <w:pPr>
+              <w:keepNext/>
+              <w:spacing w:before="20" w:after="20"/>
+            </w:pPr>
+            <w:r>
+              <w:rPr>
+                <w:b/>
+                <w:sz w:val="18"/>
+              </w:rPr>
+              <w:t xml:space="preserve">Inicio de la fatiga</w:t>
+            </w:r>
+          </w:p>
+        </w:tc>
+        <w:tc>
+          <w:tcPr>
+            <w:tcW w:type="dxa" w:w="2551"/>
+            <w:shd w:val="clear" w:color="auto" w:fill="D9E2F3"/>
+          </w:tcPr>
+          <w:p>
+            <w:pPr>
+              <w:keepNext/>
+              <w:spacing w:before="20" w:after="20"/>
+            </w:pPr>
+            <w:r>
+              <w:rPr>
+                <w:b/>
+                <w:sz w:val="18"/>
+              </w:rPr>
+              <w:t xml:space="preserve">Resultado</w:t>
+            </w:r>
+          </w:p>
+        </w:tc>
+      </w:tr>
+      <w:tr>
+        <w:trPr>
+          <w:cantSplit/>
+        </w:trPr>
+        <w:tc>
+          <w:tcPr>
+            <w:tcW w:type="dxa" w:w="2835"/>
+          </w:tcPr>
+          <w:p>
+            <w:pPr>
+              <w:keepNext/>
+              <w:spacing w:before="20" w:after="20"/>
+            </w:pPr>
+            <w:r>
+              <w:rPr>
+                <w:sz w:val="18"/>
+              </w:rPr>
+              <w:t xml:space="preserve">P5 · crol · GoPro</w:t>
+            </w:r>
+          </w:p>
+        </w:tc>
+        <w:tc>
+          <w:tcPr>
+            <w:tcW w:type="dxa" w:w="1134"/>
+          </w:tcPr>
+          <w:p>
+            <w:pPr>
+              <w:keepNext/>
+              <w:spacing w:before="20" w:after="20"/>
+            </w:pPr>
+            <w:r>
+              <w:rPr>
+                <w:sz w:val="18"/>
+              </w:rPr>
+              <w:t xml:space="preserve">5</w:t>
+            </w:r>
+          </w:p>
+        </w:tc>
+        <w:tc>
+          <w:tcPr>
+            <w:tcW w:type="dxa" w:w="850"/>
+          </w:tcPr>
+          <w:p>
+            <w:pPr>
+              <w:keepNext/>
+              <w:spacing w:before="20" w:after="20"/>
+            </w:pPr>
+            <w:r>
+              <w:rPr>
+                <w:sz w:val="18"/>
+              </w:rPr>
+              <w:t xml:space="preserve">46</w:t>
+            </w:r>
+          </w:p>
+        </w:tc>
+        <w:tc>
+          <w:tcPr>
+            <w:tcW w:type="dxa" w:w="1701"/>
+          </w:tcPr>
+          <w:p>
+            <w:pPr>
+              <w:keepNext/>
+              <w:spacing w:before="20" w:after="20"/>
+            </w:pPr>
+            <w:r>
+              <w:rPr>
+                <w:sz w:val="18"/>
+              </w:rPr>
+              <w:t xml:space="preserve">—</w:t>
+            </w:r>
+          </w:p>
+        </w:tc>
+        <w:tc>
+          <w:tcPr>
+            <w:tcW w:type="dxa" w:w="2551"/>
+          </w:tcPr>
+          <w:p>
+            <w:pPr>
+              <w:keepNext/>
+              <w:spacing w:before="20" w:after="20"/>
+            </w:pPr>
+            <w:r>
+              <w:rPr>
+                <w:sz w:val="18"/>
+              </w:rPr>
+              <w:t xml:space="preserve">Sin fatiga sostenida</w:t>
+            </w:r>
+          </w:p>
+        </w:tc>
+      </w:tr>
+      <w:tr>
+        <w:trPr>
+          <w:cantSplit/>
+        </w:trPr>
+        <w:tc>
+          <w:tcPr>
+            <w:tcW w:type="dxa" w:w="2835"/>
+          </w:tcPr>
+          <w:p>
+            <w:pPr>
+              <w:keepNext/>
+              <w:spacing w:before="20" w:after="20"/>
+            </w:pPr>
+            <w:r>
+              <w:rPr>
+                <w:sz w:val="18"/>
+              </w:rPr>
+              <w:t xml:space="preserve">P5 · crol · móvil</w:t>
+            </w:r>
+          </w:p>
+        </w:tc>
+        <w:tc>
+          <w:tcPr>
+            <w:tcW w:type="dxa" w:w="1134"/>
+          </w:tcPr>
+          <w:p>
+            <w:pPr>
+              <w:keepNext/>
+              <w:spacing w:before="20" w:after="20"/>
+            </w:pPr>
+            <w:r>
+              <w:rPr>
+                <w:sz w:val="18"/>
+              </w:rPr>
+              <w:t xml:space="preserve">2</w:t>
+            </w:r>
+          </w:p>
+        </w:tc>
+        <w:tc>
+          <w:tcPr>
+            <w:tcW w:type="dxa" w:w="850"/>
+          </w:tcPr>
+          <w:p>
+            <w:pPr>
+              <w:keepNext/>
+              <w:spacing w:before="20" w:after="20"/>
+            </w:pPr>
+            <w:r>
+              <w:rPr>
+                <w:sz w:val="18"/>
+              </w:rPr>
+              <w:t xml:space="preserve">24</w:t>
+            </w:r>
+          </w:p>
+        </w:tc>
+        <w:tc>
+          <w:tcPr>
+            <w:tcW w:type="dxa" w:w="1701"/>
+          </w:tcPr>
+          <w:p>
+            <w:pPr>
+              <w:keepNext/>
+              <w:spacing w:before="20" w:after="20"/>
+            </w:pPr>
+            <w:r>
+              <w:rPr>
+                <w:sz w:val="18"/>
+              </w:rPr>
+              <w:t xml:space="preserve">—</w:t>
+            </w:r>
+          </w:p>
+        </w:tc>
+        <w:tc>
+          <w:tcPr>
+            <w:tcW w:type="dxa" w:w="2551"/>
+          </w:tcPr>
+          <w:p>
+            <w:pPr>
+              <w:keepNext/>
+              <w:spacing w:before="20" w:after="20"/>
+            </w:pPr>
+            <w:r>
+              <w:rPr>
+                <w:sz w:val="18"/>
+              </w:rPr>
+              <w:t xml:space="preserve">Sin fatiga sostenida</w:t>
+            </w:r>
+          </w:p>
+        </w:tc>
+      </w:tr>
+      <w:tr>
+        <w:trPr>
+          <w:cantSplit/>
+        </w:trPr>
+        <w:tc>
+          <w:tcPr>
+            <w:tcW w:type="dxa" w:w="2835"/>
+          </w:tcPr>
+          <w:p>
+            <w:pPr>
+              <w:keepNext/>
+              <w:spacing w:before="20" w:after="20"/>
+            </w:pPr>
+            <w:r>
+              <w:rPr>
+                <w:sz w:val="18"/>
+              </w:rPr>
+              <w:t xml:space="preserve">P1 · crol · GoPro</w:t>
+            </w:r>
+          </w:p>
+        </w:tc>
+        <w:tc>
+          <w:tcPr>
+            <w:tcW w:type="dxa" w:w="1134"/>
+          </w:tcPr>
+          <w:p>
+            <w:pPr>
+              <w:keepNext/>
+              <w:spacing w:before="20" w:after="20"/>
+            </w:pPr>
+            <w:r>
+              <w:rPr>
+                <w:sz w:val="18"/>
+              </w:rPr>
+              <w:t xml:space="preserve">3</w:t>
+            </w:r>
+          </w:p>
+        </w:tc>
+        <w:tc>
+          <w:tcPr>
+            <w:tcW w:type="dxa" w:w="850"/>
+          </w:tcPr>
+          <w:p>
+            <w:pPr>
+              <w:keepNext/>
+              <w:spacing w:before="20" w:after="20"/>
+            </w:pPr>
+            <w:r>
+              <w:rPr>
+                <w:sz w:val="18"/>
+              </w:rPr>
+              <w:t xml:space="preserve">10</w:t>
+            </w:r>
+          </w:p>
+        </w:tc>
+        <w:tc>
+          <w:tcPr>
+            <w:tcW w:type="dxa" w:w="1701"/>
+          </w:tcPr>
+          <w:p>
+            <w:pPr>
+              <w:keepNext/>
+              <w:spacing w:before="20" w:after="20"/>
+            </w:pPr>
+            <w:r>
+              <w:rPr>
+                <w:sz w:val="18"/>
+              </w:rPr>
+              <w:t xml:space="preserve">—</w:t>
+            </w:r>
+          </w:p>
+        </w:tc>
+        <w:tc>
+          <w:tcPr>
+            <w:tcW w:type="dxa" w:w="2551"/>
+          </w:tcPr>
+          <w:p>
+            <w:pPr>
+              <w:keepNext/>
+              <w:spacing w:before="20" w:after="20"/>
+            </w:pPr>
+            <w:r>
+              <w:rPr>
+                <w:sz w:val="18"/>
+              </w:rPr>
+              <w:t xml:space="preserve">Sin fatiga sostenida</w:t>
+            </w:r>
+          </w:p>
+        </w:tc>
+      </w:tr>
+      <w:tr>
+        <w:trPr>
+          <w:cantSplit/>
+        </w:trPr>
+        <w:tc>
+          <w:tcPr>
+            <w:tcW w:type="dxa" w:w="2835"/>
+          </w:tcPr>
+          <w:p>
+            <w:pPr>
+              <w:keepNext/>
+              <w:spacing w:before="20" w:after="20"/>
+            </w:pPr>
+            <w:r>
+              <w:rPr>
+                <w:sz w:val="18"/>
+              </w:rPr>
+              <w:t xml:space="preserve">P1 · crol · móvil</w:t>
+            </w:r>
+          </w:p>
+        </w:tc>
+        <w:tc>
+          <w:tcPr>
+            <w:tcW w:type="dxa" w:w="1134"/>
+          </w:tcPr>
+          <w:p>
+            <w:pPr>
+              <w:keepNext/>
+              <w:spacing w:before="20" w:after="20"/>
+            </w:pPr>
+            <w:r>
+              <w:rPr>
+                <w:sz w:val="18"/>
+              </w:rPr>
+              <w:t xml:space="preserve">2</w:t>
+            </w:r>
+          </w:p>
+        </w:tc>
+        <w:tc>
+          <w:tcPr>
+            <w:tcW w:type="dxa" w:w="850"/>
+          </w:tcPr>
+          <w:p>
+            <w:pPr>
+              <w:keepNext/>
+              <w:spacing w:before="20" w:after="20"/>
+            </w:pPr>
+            <w:r>
+              <w:rPr>
+                <w:sz w:val="18"/>
+              </w:rPr>
+              <w:t xml:space="preserve">7</w:t>
+            </w:r>
+          </w:p>
+        </w:tc>
+        <w:tc>
+          <w:tcPr>
+            <w:tcW w:type="dxa" w:w="1701"/>
+          </w:tcPr>
+          <w:p>
+            <w:pPr>
+              <w:keepNext/>
+              <w:spacing w:before="20" w:after="20"/>
+            </w:pPr>
+            <w:r>
+              <w:rPr>
+                <w:sz w:val="18"/>
+              </w:rPr>
+              <w:t xml:space="preserve">—</w:t>
+            </w:r>
+          </w:p>
+        </w:tc>
+        <w:tc>
+          <w:tcPr>
+            <w:tcW w:type="dxa" w:w="2551"/>
+          </w:tcPr>
+          <w:p>
+            <w:pPr>
+              <w:keepNext/>
+              <w:spacing w:before="20" w:after="20"/>
+            </w:pPr>
+            <w:r>
+              <w:rPr>
+                <w:sz w:val="18"/>
+              </w:rPr>
+              <w:t xml:space="preserve">Insuficiente (&lt; 8 ciclos)</w:t>
+            </w:r>
+          </w:p>
+        </w:tc>
+      </w:tr>
+      <w:tr>
+        <w:trPr>
+          <w:cantSplit/>
+        </w:trPr>
+        <w:tc>
+          <w:tcPr>
+            <w:tcW w:type="dxa" w:w="2835"/>
+          </w:tcPr>
+          <w:p>
+            <w:pPr>
+              <w:keepNext/>
+              <w:spacing w:before="20" w:after="20"/>
+            </w:pPr>
+            <w:r>
+              <w:rPr>
+                <w:sz w:val="18"/>
+              </w:rPr>
+              <w:t xml:space="preserve">P4 · braza · GoPro</w:t>
+            </w:r>
+          </w:p>
+        </w:tc>
+        <w:tc>
+          <w:tcPr>
+            <w:tcW w:type="dxa" w:w="1134"/>
+          </w:tcPr>
+          <w:p>
+            <w:pPr>
+              <w:keepNext/>
+              <w:spacing w:before="20" w:after="20"/>
+            </w:pPr>
+            <w:r>
+              <w:rPr>
+                <w:sz w:val="18"/>
+              </w:rPr>
+              <w:t xml:space="preserve">2</w:t>
+            </w:r>
+          </w:p>
+        </w:tc>
+        <w:tc>
+          <w:tcPr>
+            <w:tcW w:type="dxa" w:w="850"/>
+          </w:tcPr>
+          <w:p>
+            <w:pPr>
+              <w:keepNext/>
+              <w:spacing w:before="20" w:after="20"/>
+            </w:pPr>
+            <w:r>
+              <w:rPr>
+                <w:sz w:val="18"/>
+              </w:rPr>
+              <w:t xml:space="preserve">27</w:t>
+            </w:r>
+          </w:p>
+        </w:tc>
+        <w:tc>
+          <w:tcPr>
+            <w:tcW w:type="dxa" w:w="1701"/>
+          </w:tcPr>
+          <w:p>
+            <w:pPr>
+              <w:keepNext/>
+              <w:spacing w:before="20" w:after="20"/>
+            </w:pPr>
+            <w:r>
+              <w:rPr>
+                <w:sz w:val="18"/>
+              </w:rPr>
+              <w:t xml:space="preserve">—</w:t>
+            </w:r>
+          </w:p>
+        </w:tc>
+        <w:tc>
+          <w:tcPr>
+            <w:tcW w:type="dxa" w:w="2551"/>
+          </w:tcPr>
+          <w:p>
+            <w:pPr>
+              <w:keepNext/>
+              <w:spacing w:before="20" w:after="20"/>
+            </w:pPr>
+            <w:r>
+              <w:rPr>
+                <w:sz w:val="18"/>
+              </w:rPr>
+              <w:t xml:space="preserve">Sin fatiga sostenida</w:t>
+            </w:r>
+          </w:p>
+        </w:tc>
+      </w:tr>
+      <w:tr>
+        <w:trPr>
+          <w:cantSplit/>
+        </w:trPr>
+        <w:tc>
+          <w:tcPr>
+            <w:tcW w:type="dxa" w:w="2835"/>
+          </w:tcPr>
+          <w:p>
+            <w:pPr>
+              <w:keepNext/>
+              <w:spacing w:before="20" w:after="20"/>
+            </w:pPr>
+            <w:r>
+              <w:rPr>
+                <w:sz w:val="18"/>
+              </w:rPr>
+              <w:t xml:space="preserve">P4 · braza · móvil</w:t>
+            </w:r>
+          </w:p>
+        </w:tc>
+        <w:tc>
+          <w:tcPr>
+            <w:tcW w:type="dxa" w:w="1134"/>
+          </w:tcPr>
+          <w:p>
+            <w:pPr>
+              <w:keepNext/>
+              <w:spacing w:before="20" w:after="20"/>
+            </w:pPr>
+            <w:r>
+              <w:rPr>
+                <w:sz w:val="18"/>
+              </w:rPr>
+              <w:t xml:space="preserve">2</w:t>
+            </w:r>
+          </w:p>
+        </w:tc>
+        <w:tc>
+          <w:tcPr>
+            <w:tcW w:type="dxa" w:w="850"/>
+          </w:tcPr>
+          <w:p>
+            <w:pPr>
+              <w:keepNext/>
+              <w:spacing w:before="20" w:after="20"/>
+            </w:pPr>
+            <w:r>
+              <w:rPr>
+                <w:sz w:val="18"/>
+              </w:rPr>
+              <w:t xml:space="preserve">4</w:t>
+            </w:r>
+          </w:p>
+        </w:tc>
+        <w:tc>
+          <w:tcPr>
+            <w:tcW w:type="dxa" w:w="1701"/>
+          </w:tcPr>
+          <w:p>
+            <w:pPr>
+              <w:keepNext/>
+              <w:spacing w:before="20" w:after="20"/>
+            </w:pPr>
+            <w:r>
+              <w:rPr>
+                <w:sz w:val="18"/>
+              </w:rPr>
+              <w:t xml:space="preserve">—</w:t>
+            </w:r>
+          </w:p>
+        </w:tc>
+        <w:tc>
+          <w:tcPr>
+            <w:tcW w:type="dxa" w:w="2551"/>
+          </w:tcPr>
+          <w:p>
+            <w:pPr>
+              <w:keepNext/>
+              <w:spacing w:before="20" w:after="20"/>
+            </w:pPr>
+            <w:r>
+              <w:rPr>
+                <w:sz w:val="18"/>
+              </w:rPr>
+              <w:t xml:space="preserve">Insuficiente (&lt; 8 ciclos)</w:t>
+            </w:r>
+          </w:p>
+        </w:tc>
+      </w:tr>
+      <w:tr>
+        <w:trPr>
+          <w:cantSplit/>
+        </w:trPr>
+        <w:tc>
+          <w:tcPr>
+            <w:tcW w:type="dxa" w:w="2835"/>
+          </w:tcPr>
+          <w:p>
+            <w:pPr>
+              <w:keepNext w:val="0"/>
+              <w:spacing w:before="20" w:after="20"/>
+            </w:pPr>
+            <w:r>
+              <w:rPr>
+                <w:sz w:val="18"/>
+              </w:rPr>
+              <w:t xml:space="preserve">P3 · mariposa · GoPro</w:t>
+            </w:r>
+          </w:p>
+        </w:tc>
+        <w:tc>
+          <w:tcPr>
+            <w:tcW w:type="dxa" w:w="1134"/>
+          </w:tcPr>
+          <w:p>
+            <w:pPr>
+              <w:keepNext w:val="0"/>
+              <w:spacing w:before="20" w:after="20"/>
+            </w:pPr>
+            <w:r>
+              <w:rPr>
+                <w:sz w:val="18"/>
+              </w:rPr>
+              <w:t xml:space="preserve">2</w:t>
+            </w:r>
+          </w:p>
+        </w:tc>
+        <w:tc>
+          <w:tcPr>
+            <w:tcW w:type="dxa" w:w="850"/>
+          </w:tcPr>
+          <w:p>
+            <w:pPr>
+              <w:keepNext w:val="0"/>
+              <w:spacing w:before="20" w:after="20"/>
+            </w:pPr>
+            <w:r>
+              <w:rPr>
+                <w:sz w:val="18"/>
+              </w:rPr>
+              <w:t xml:space="preserve">26</w:t>
+            </w:r>
+          </w:p>
+        </w:tc>
+        <w:tc>
+          <w:tcPr>
+            <w:tcW w:type="dxa" w:w="1701"/>
+          </w:tcPr>
+          <w:p>
+            <w:pPr>
+              <w:keepNext w:val="0"/>
+              <w:spacing w:before="20" w:after="20"/>
+            </w:pPr>
+            <w:r>
+              <w:rPr>
+                <w:sz w:val="18"/>
+              </w:rPr>
+              <w:t xml:space="preserve">—</w:t>
+            </w:r>
+          </w:p>
+        </w:tc>
+        <w:tc>
+          <w:tcPr>
+            <w:tcW w:type="dxa" w:w="2551"/>
+          </w:tcPr>
+          <w:p>
+            <w:pPr>
+              <w:keepNext w:val="0"/>
+              <w:spacing w:before="20" w:after="20"/>
+            </w:pPr>
+            <w:r>
+              <w:rPr>
+                <w:sz w:val="18"/>
+              </w:rPr>
+              <w:t xml:space="preserve">Sin fatiga sostenida</w:t>
+            </w:r>
+          </w:p>
+        </w:tc>
+      </w:tr>
+    </w:tbl>
     <w:p>
       <w:pPr>
         <w:jc w:val="both"/>
       </w:pPr>
-      <w:r>
-        <w:t xml:space="preserve">Con las reglas biomecánicas, que no se entrenan, el sistema obtuvo una estimación en 13 de las 17 secuencias reales (las demás no tienen señal suficiente de los dos brazos). </w:t>
-      </w:r>
-      <w:r>
-        <w:rPr>
-          <w:b/>
-        </w:rPr>
-        <w:t xml:space="preserve">La familia del estilo (brazos alternos o simultáneos), que determina cómo se cuentan los ciclos, fue correcta en 12 de 13</w:t>
-      </w:r>
-      <w:r>
-        <w:t xml:space="preserve">, y el estilo exacto en 9 de 13; en 2 secuencias frontales de estilos simultáneos el sistema indicó solo la familia. Con datos sintéticos (64 vídeos, independientes de los umbrales) la familia fue correcta en el 81 % de los casos. Los umbrales se fijaron con los vídeos reales del estudio, por lo que la exactitud en vídeo real es optimista; la validación con nadadores nuevos queda como trabajo futuro.</w:t>
+    </w:p>
+    <w:p>
+      <w:pPr>
+        <w:keepNext/>
+        <w:jc w:val="center"/>
+      </w:pPr>
+      <w:r>
+        <w:drawing>
+          <wp:inline xmlns:a="http://schemas.openxmlformats.org/drawingml/2006/main" xmlns:pic="http://schemas.openxmlformats.org/drawingml/2006/picture">
+            <wp:extent cx="5400000" cy="2700000"/>
+            <wp:docPr id="17" name="Picture 17"/>
+            <wp:cNvGraphicFramePr>
+              <a:graphicFrameLocks noChangeAspect="1"/>
+            </wp:cNvGraphicFramePr>
+            <a:graphic>
+              <a:graphicData uri="http://schemas.openxmlformats.org/drawingml/2006/picture">
+                <pic:pic>
+                  <pic:nvPicPr>
+                    <pic:cNvPr id="0" name="real_sesion_P5_crol_gopro.png"/>
+                    <pic:cNvPicPr/>
+                  </pic:nvPicPr>
+                  <pic:blipFill>
+                    <a:blip r:embed="rId30"/>
+                    <a:stretch>
+                      <a:fillRect/>
+                    </a:stretch>
+                  </pic:blipFill>
+                  <pic:spPr>
+                    <a:xfrm>
+                      <a:off x="0" y="0"/>
+                      <a:ext cx="5400000" cy="2700000"/>
+                    </a:xfrm>
+                    <a:prstGeom prst="rect"/>
+                  </pic:spPr>
+                </pic:pic>
+              </a:graphicData>
+            </a:graphic>
+          </wp:inline>
+        </w:drawing>
+      </w:r>
+    </w:p>
+    <w:p>
+      <w:pPr>
+        <w:pStyle w:val="Caption"/>
+        <w:jc w:val="center"/>
+      </w:pPr>
+      <w:r>
+        <w:t xml:space="preserve">Figura </w:t>
+      </w:r>
+      <w:r>
+        <w:fldChar w:fldCharType="begin"/>
+      </w:r>
+      <w:r>
+        <w:instrText xml:space="preserve"> SEQ Figura \* ARABIC </w:instrText>
+      </w:r>
+      <w:r>
+        <w:fldChar w:fldCharType="separate"/>
+      </w:r>
+      <w:r>
+        <w:t xml:space="preserve">15</w:t>
+      </w:r>
+      <w:r>
+        <w:fldChar w:fldCharType="end"/>
+      </w:r>
+      <w:r>
+        <w:t xml:space="preserve">. </w:t>
+      </w:r>
+      <w:r>
+        <w:t xml:space="preserve">Sesión P5 · crol · gopro: puntuación de anomalía por ciclo y umbral de la fase base.</w:t>
+      </w:r>
+    </w:p>
+    <w:p>
+      <w:pPr>
+        <w:jc w:val="both"/>
+      </w:pPr>
+      <w:r>
+        <w:t xml:space="preserve">Las sesiones están formadas por pasadas cortas a ritmo de técnica, separadas por descansos, y no por un esfuerzo continuo capaz de producir fatiga. Que el sistema no genere falsas alarmas en ellas es un resultado relevante, aunque no demuestra por sí solo su capacidad de detectar la fatiga.</w:t>
       </w:r>
     </w:p>
     <w:p>
@@ -21199,6 +21933,40 @@
         <w:keepNext/>
       </w:pPr>
       <w:r>
+        <w:t xml:space="preserve">Estimación del estilo con vídeos reales</w:t>
+      </w:r>
+    </w:p>
+    <w:p>
+      <w:pPr>
+        <w:jc w:val="both"/>
+      </w:pPr>
+      <w:r>
+        <w:t xml:space="preserve">El enfoque supervisado se evaluó primero con los vídeos reales: 42 ventanas de 11 vídeos con señal suficiente. Dejando un vídeo fuera, acertó el 45,5 % de los vídeos (54,5 % al añadir datos sintéticos), frente al 36,4 % de asignar siempre la clase mayoritaria; dejando fuera un participante completo, el 9,1 %; y entrenado solo con datos sintéticos, el 9,1 %. El estilo está confundido con el nadador y los rasgos que distinguen los estilos en la simulación, la alternancia de piernas y brazos, son los que el modelo de pose no reproduce bajo el agua.</w:t>
+      </w:r>
+    </w:p>
+    <w:p>
+      <w:pPr>
+        <w:jc w:val="both"/>
+      </w:pPr>
+      <w:r>
+        <w:t xml:space="preserve">Con las reglas biomecánicas, que no se entrenan, el sistema obtuvo una estimación en 19 de las 25 secuencias reales (las demás no tienen señal suficiente de los dos brazos). </w:t>
+      </w:r>
+      <w:r>
+        <w:rPr>
+          <w:b/>
+        </w:rPr>
+        <w:t xml:space="preserve">La familia del estilo (brazos alternos o simultáneos), que determina cómo se cuentan los ciclos, fue correcta en 15 de 19</w:t>
+      </w:r>
+      <w:r>
+        <w:t xml:space="preserve">, y el estilo exacto en 12 de 19; en 3 secuencias frontales de estilos simultáneos el sistema indicó solo la familia. Con datos sintéticos (64 vídeos, independientes de los umbrales) la familia fue correcta en el 81 % de los casos. Los umbrales se fijaron con los vídeos reales del estudio, por lo que la exactitud en vídeo real es optimista; la validación con nadadores nuevos queda como trabajo futuro.</w:t>
+      </w:r>
+    </w:p>
+    <w:p>
+      <w:pPr>
+        <w:pStyle w:val="Ttulo3"/>
+        <w:keepNext/>
+      </w:pPr>
+      <w:r>
         <w:t xml:space="preserve">Análisis de sensibilidad del detector de fatiga (datos sintéticos)</w:t>
       </w:r>
     </w:p>
@@ -21216,7 +21984,7 @@
         <w:t xml:space="preserve"> y Figura </w:t>
       </w:r>
       <w:r>
-        <w:t xml:space="preserve">13</w:t>
+        <w:t xml:space="preserve">16</w:t>
       </w:r>
       <w:r>
         <w:t xml:space="preserve">).</w:t>
@@ -22193,7 +22961,7 @@
         <w:drawing>
           <wp:inline xmlns:a="http://schemas.openxmlformats.org/drawingml/2006/main" xmlns:pic="http://schemas.openxmlformats.org/drawingml/2006/picture">
             <wp:extent cx="5400000" cy="1669091"/>
-            <wp:docPr id="15" name="Picture 15"/>
+            <wp:docPr id="18" name="Picture 18"/>
             <wp:cNvGraphicFramePr>
               <a:graphicFrameLocks noChangeAspect="1"/>
             </wp:cNvGraphicFramePr>
@@ -22205,7 +22973,7 @@
                     <pic:cNvPicPr/>
                   </pic:nvPicPr>
                   <pic:blipFill>
-                    <a:blip r:embed="rId28"/>
+                    <a:blip r:embed="rId31"/>
                     <a:stretch>
                       <a:fillRect/>
                     </a:stretch>
@@ -22242,7 +23010,7 @@
         <w:fldChar w:fldCharType="separate"/>
       </w:r>
       <w:r>
-        <w:t xml:space="preserve">13</w:t>
+        <w:t xml:space="preserve">16</w:t>
       </w:r>
       <w:r>
         <w:fldChar w:fldCharType="end"/>
@@ -23685,7 +24453,7 @@
         <w:jc w:val="both"/>
       </w:pPr>
       <w:r>
-        <w:t xml:space="preserve">La cobertura del análisis (34 % del tiempo grabado) es el principal cuello de botella y depende sobre todo de la distancia entre la cámara y el nadador. Un encuadre más cerrado multiplica la información útil sin cambiar de modelo, lo que tiene una consecuencia práctica inmediata para el protocolo de grabación del club.</w:t>
+        <w:t xml:space="preserve">La cobertura del análisis (14 % del tiempo grabado) es el principal cuello de botella y depende sobre todo de la distancia entre la cámara y el nadador. Un encuadre más cerrado multiplica la información útil sin cambiar de modelo, lo que tiene una consecuencia práctica inmediata para el protocolo de grabación del club.</w:t>
       </w:r>
     </w:p>
     <w:p>
@@ -23693,6 +24461,14 @@
         <w:jc w:val="both"/>
       </w:pPr>
       <w:r>
+        <w:t xml:space="preserve">La secuencia continua de 34 min es el único dato real en el que la fatiga puede manifestarse. En ella el sistema detecta un cambio técnico sostenido a partir de t = 748,0 s y lo atribuye a variables concretas, lo que constituye la primera evidencia real del funcionamiento del detector. Al no disponer de una referencia fisiológica, este resultado debe interpretarse como fatiga técnica y no como fatiga fisiológica confirmada.</w:t>
+      </w:r>
+    </w:p>
+    <w:p>
+      <w:pPr>
+        <w:jc w:val="both"/>
+      </w:pPr>
+      <w:r>
         <w:t xml:space="preserve">La ausencia de fatiga en las sesiones de pasadas cortas es coherente con su naturaleza, y el análisis de sensibilidad con datos sintéticos, que estima un 10 % de falsas alarmas, y la evaluación del modo en tiempo real (ninguna falsa alarma en diez secuencias) son coherentes con ese resultado.</w:t>
       </w:r>
     </w:p>
@@ -23701,7 +24477,7 @@
         <w:jc w:val="both"/>
       </w:pPr>
       <w:r>
-        <w:t xml:space="preserve">Por último, la estimación del estilo ilustra la distancia entre dominios: un modelo perfecto en datos sintéticos falla en vídeo real porque los rasgos que lo hacen perfecto son los que el modelo de pose no reproduce bajo el agua. Las reglas biomecánicas resuelven lo necesario para el análisis, la familia del estilo (12 de 13 secuencias), aunque su validación con nadadores nuevos está pendiente. La explicabilidad resultó útil también para el desarrollo: comparar los rasgos en ambos dominios permitió localizar la causa del fallo.</w:t>
+        <w:t xml:space="preserve">Por último, la estimación del estilo ilustra la distancia entre dominios: un modelo perfecto en datos sintéticos falla en vídeo real porque los rasgos que lo hacen perfecto son los que el modelo de pose no reproduce bajo el agua. Las reglas biomecánicas resuelven lo necesario para el análisis, la familia del estilo (15 de 19 secuencias), aunque su validación con nadadores nuevos está pendiente. La explicabilidad resultó útil también para el desarrollo: comparar los rasgos en ambos dominios permitió localizar la causa del fallo.</w:t>
       </w:r>
     </w:p>
     <w:p>
@@ -23926,7 +24702,7 @@
         <w:t xml:space="preserve">Escasez de datos reales.</w:t>
       </w:r>
       <w:r>
-        <w:t xml:space="preserve"> El conjunto real suma 17 secuencias de 4 participantes (2,2 min analizables y 95 ciclos); varios estilos tienen un solo participante y la espalda carece de datos suficientes.</w:t>
+        <w:t xml:space="preserve"> El conjunto real suma 25 secuencias de 5 participantes (6,3 min analizables y 165 ciclos); varios estilos tienen un solo participante y la espalda carece de datos suficientes.</w:t>
       </w:r>
     </w:p>
     <w:p>
@@ -24052,7 +24828,7 @@
         <w:t xml:space="preserve">Detección parcial.</w:t>
       </w:r>
       <w:r>
-        <w:t xml:space="preserve"> El nadador es analizable en el 34 % del tiempo grabado.</w:t>
+        <w:t xml:space="preserve"> El nadador es analizable en el 14 % del tiempo grabado.</w:t>
       </w:r>
     </w:p>
     <w:p>
@@ -24521,7 +25297,7 @@
               <w:rPr>
                 <w:sz w:val="18"/>
               </w:rPr>
-              <w:t xml:space="preserve">Validado con datos sintéticos (detección 100 %, falsas alarmas 10 %) y en tiempo real (10/10, sin falsas alarmas); sin referencia fisiológica</w:t>
+              <w:t xml:space="preserve">Validado con datos sintéticos (detección 100 %, falsas alarmas 10 %) y en tiempo real (10/10, sin falsas alarmas); fatiga técnica detectada en la secuencia real de 34 min; sin referencia fisiológica</w:t>
             </w:r>
           </w:p>
         </w:tc>
@@ -24633,7 +25409,7 @@
               <w:rPr>
                 <w:sz w:val="18"/>
               </w:rPr>
-              <w:t xml:space="preserve">Modelo supervisado: 100 % en datos sintéticos, no generaliza en vídeo real. Reglas biomecánicas: familia correcta en 12 de 13 vídeos reales</w:t>
+              <w:t xml:space="preserve">Modelo supervisado: 100 % en datos sintéticos, no generaliza en vídeo real. Reglas biomecánicas: familia correcta en 15 de 19 vídeos reales</w:t>
             </w:r>
           </w:p>
         </w:tc>
@@ -24778,7 +25554,7 @@
         <w:jc w:val="both"/>
       </w:pPr>
       <w:r>
-        <w:t xml:space="preserve">Con datos sintéticos de referencia conocida, el sistema estima la frecuencia de ciclo, la velocidad y la distancia por ciclo con errores medianos inferiores al 5 %, detecta el inicio de la fatiga al comienzo de la transición programada, también en tiempo real, y atribuye la fatiga a las variables alteradas. Con vídeo real, la frecuencia de ciclo se aproxima al conteo manual con un error del 6,5 % al 8,2 %, la vista y la familia del estilo se determinan automáticamente, y el análisis de 17 secuencias de 4 participantes produjo 95 ciclos válidos y perfiles técnicos diferenciados por nadador. Las sesiones de pasadas cortas no presentaron fatiga, como cabía esperar por su duración.</w:t>
+        <w:t xml:space="preserve">Con datos sintéticos de referencia conocida, el sistema estima la frecuencia de ciclo, la velocidad y la distancia por ciclo con errores medianos inferiores al 5 %, detecta el inicio de la fatiga al comienzo de la transición programada, también en tiempo real, y atribuye la fatiga a las variables alteradas. Con vídeo real, la frecuencia de ciclo se aproxima al conteo manual con un error del 6,5 % al 8,2 %, la vista y la familia del estilo se determinan automáticamente, y el análisis de 25 secuencias de 5 participantes produjo 165 ciclos válidos y perfiles técnicos diferenciados por nadador. En la secuencia continua de 34 min, el sistema detectó el inicio de la fatiga técnica en t = 748,0 s y explicó sus causas. Las sesiones de pasadas cortas no presentaron fatiga, como cabía esperar por su duración.</w:t>
       </w:r>
     </w:p>
     <w:p>
@@ -29744,6 +30520,1270 @@
           </w:tcPr>
           <w:p>
             <w:pPr>
+              <w:keepNext/>
+              <w:spacing w:before="20" w:after="20"/>
+            </w:pPr>
+            <w:r>
+              <w:rPr>
+                <w:sz w:val="16"/>
+              </w:rPr>
+              <w:t xml:space="preserve">IMG_7217</w:t>
+            </w:r>
+          </w:p>
+        </w:tc>
+        <w:tc>
+          <w:tcPr>
+            <w:tcW w:type="dxa" w:w="567"/>
+          </w:tcPr>
+          <w:p>
+            <w:pPr>
+              <w:keepNext/>
+              <w:spacing w:before="20" w:after="20"/>
+            </w:pPr>
+            <w:r>
+              <w:rPr>
+                <w:sz w:val="16"/>
+              </w:rPr>
+              <w:t xml:space="preserve">P4</w:t>
+            </w:r>
+          </w:p>
+        </w:tc>
+        <w:tc>
+          <w:tcPr>
+            <w:tcW w:type="dxa" w:w="964"/>
+          </w:tcPr>
+          <w:p>
+            <w:pPr>
+              <w:keepNext/>
+              <w:spacing w:before="20" w:after="20"/>
+            </w:pPr>
+            <w:r>
+              <w:rPr>
+                <w:sz w:val="16"/>
+              </w:rPr>
+              <w:t xml:space="preserve">Braza</w:t>
+            </w:r>
+          </w:p>
+        </w:tc>
+        <w:tc>
+          <w:tcPr>
+            <w:tcW w:type="dxa" w:w="907"/>
+          </w:tcPr>
+          <w:p>
+            <w:pPr>
+              <w:keepNext/>
+              <w:spacing w:before="20" w:after="20"/>
+            </w:pPr>
+            <w:r>
+              <w:rPr>
+                <w:sz w:val="16"/>
+              </w:rPr>
+              <w:t xml:space="preserve">Frontal</w:t>
+            </w:r>
+          </w:p>
+        </w:tc>
+        <w:tc>
+          <w:tcPr>
+            <w:tcW w:type="dxa" w:w="964"/>
+          </w:tcPr>
+          <w:p>
+            <w:pPr>
+              <w:keepNext/>
+              <w:spacing w:before="20" w:after="20"/>
+            </w:pPr>
+            <w:r>
+              <w:rPr>
+                <w:sz w:val="16"/>
+              </w:rPr>
+              <w:t xml:space="preserve">7,3 s</w:t>
+            </w:r>
+          </w:p>
+        </w:tc>
+        <w:tc>
+          <w:tcPr>
+            <w:tcW w:type="dxa" w:w="1020"/>
+          </w:tcPr>
+          <w:p>
+            <w:pPr>
+              <w:keepNext/>
+              <w:spacing w:before="20" w:after="20"/>
+            </w:pPr>
+            <w:r>
+              <w:rPr>
+                <w:sz w:val="16"/>
+              </w:rPr>
+              <w:t xml:space="preserve">5,1 s</w:t>
+            </w:r>
+          </w:p>
+        </w:tc>
+        <w:tc>
+          <w:tcPr>
+            <w:tcW w:type="dxa" w:w="737"/>
+          </w:tcPr>
+          <w:p>
+            <w:pPr>
+              <w:keepNext/>
+              <w:spacing w:before="20" w:after="20"/>
+            </w:pPr>
+            <w:r>
+              <w:rPr>
+                <w:sz w:val="16"/>
+              </w:rPr>
+              <w:t xml:space="preserve">2</w:t>
+            </w:r>
+          </w:p>
+        </w:tc>
+        <w:tc>
+          <w:tcPr>
+            <w:tcW w:type="dxa" w:w="1304"/>
+          </w:tcPr>
+          <w:p>
+            <w:pPr>
+              <w:keepNext/>
+              <w:spacing w:before="20" w:after="20"/>
+            </w:pPr>
+            <w:r>
+              <w:rPr>
+                <w:sz w:val="16"/>
+              </w:rPr>
+              <w:t xml:space="preserve">39,7</w:t>
+            </w:r>
+          </w:p>
+        </w:tc>
+        <w:tc>
+          <w:tcPr>
+            <w:tcW w:type="dxa" w:w="1361"/>
+          </w:tcPr>
+          <w:p>
+            <w:pPr>
+              <w:keepNext/>
+              <w:spacing w:before="20" w:after="20"/>
+            </w:pPr>
+            <w:r>
+              <w:rPr>
+                <w:sz w:val="16"/>
+              </w:rPr>
+              <w:t xml:space="preserve">(simultáneos)</w:t>
+            </w:r>
+          </w:p>
+        </w:tc>
+      </w:tr>
+      <w:tr>
+        <w:trPr>
+          <w:cantSplit/>
+        </w:trPr>
+        <w:tc>
+          <w:tcPr>
+            <w:tcW w:type="dxa" w:w="1247"/>
+          </w:tcPr>
+          <w:p>
+            <w:pPr>
+              <w:keepNext/>
+              <w:spacing w:before="20" w:after="20"/>
+            </w:pPr>
+            <w:r>
+              <w:rPr>
+                <w:sz w:val="16"/>
+              </w:rPr>
+              <w:t xml:space="preserve">ASCR</w:t>
+            </w:r>
+          </w:p>
+        </w:tc>
+        <w:tc>
+          <w:tcPr>
+            <w:tcW w:type="dxa" w:w="567"/>
+          </w:tcPr>
+          <w:p>
+            <w:pPr>
+              <w:keepNext/>
+              <w:spacing w:before="20" w:after="20"/>
+            </w:pPr>
+            <w:r>
+              <w:rPr>
+                <w:sz w:val="16"/>
+              </w:rPr>
+              <w:t xml:space="preserve">P5</w:t>
+            </w:r>
+          </w:p>
+        </w:tc>
+        <w:tc>
+          <w:tcPr>
+            <w:tcW w:type="dxa" w:w="964"/>
+          </w:tcPr>
+          <w:p>
+            <w:pPr>
+              <w:keepNext/>
+              <w:spacing w:before="20" w:after="20"/>
+            </w:pPr>
+            <w:r>
+              <w:rPr>
+                <w:sz w:val="16"/>
+              </w:rPr>
+              <w:t xml:space="preserve">Crol</w:t>
+            </w:r>
+          </w:p>
+        </w:tc>
+        <w:tc>
+          <w:tcPr>
+            <w:tcW w:type="dxa" w:w="907"/>
+          </w:tcPr>
+          <w:p>
+            <w:pPr>
+              <w:keepNext/>
+              <w:spacing w:before="20" w:after="20"/>
+            </w:pPr>
+            <w:r>
+              <w:rPr>
+                <w:sz w:val="16"/>
+              </w:rPr>
+              <w:t xml:space="preserve">Lateral</w:t>
+            </w:r>
+          </w:p>
+        </w:tc>
+        <w:tc>
+          <w:tcPr>
+            <w:tcW w:type="dxa" w:w="964"/>
+          </w:tcPr>
+          <w:p>
+            <w:pPr>
+              <w:keepNext/>
+              <w:spacing w:before="20" w:after="20"/>
+            </w:pPr>
+            <w:r>
+              <w:rPr>
+                <w:sz w:val="16"/>
+              </w:rPr>
+              <w:t xml:space="preserve">28,2 s</w:t>
+            </w:r>
+          </w:p>
+        </w:tc>
+        <w:tc>
+          <w:tcPr>
+            <w:tcW w:type="dxa" w:w="1020"/>
+          </w:tcPr>
+          <w:p>
+            <w:pPr>
+              <w:keepNext/>
+              <w:spacing w:before="20" w:after="20"/>
+            </w:pPr>
+            <w:r>
+              <w:rPr>
+                <w:sz w:val="16"/>
+              </w:rPr>
+              <w:t xml:space="preserve">2,3 s</w:t>
+            </w:r>
+          </w:p>
+        </w:tc>
+        <w:tc>
+          <w:tcPr>
+            <w:tcW w:type="dxa" w:w="737"/>
+          </w:tcPr>
+          <w:p>
+            <w:pPr>
+              <w:keepNext/>
+              <w:spacing w:before="20" w:after="20"/>
+            </w:pPr>
+            <w:r>
+              <w:rPr>
+                <w:sz w:val="16"/>
+              </w:rPr>
+              <w:t xml:space="preserve">0</w:t>
+            </w:r>
+          </w:p>
+        </w:tc>
+        <w:tc>
+          <w:tcPr>
+            <w:tcW w:type="dxa" w:w="1304"/>
+          </w:tcPr>
+          <w:p>
+            <w:pPr>
+              <w:keepNext/>
+              <w:spacing w:before="20" w:after="20"/>
+            </w:pPr>
+            <w:r>
+              <w:rPr>
+                <w:sz w:val="16"/>
+              </w:rPr>
+              <w:t xml:space="preserve">—</w:t>
+            </w:r>
+          </w:p>
+        </w:tc>
+        <w:tc>
+          <w:tcPr>
+            <w:tcW w:type="dxa" w:w="1361"/>
+          </w:tcPr>
+          <w:p>
+            <w:pPr>
+              <w:keepNext/>
+              <w:spacing w:before="20" w:after="20"/>
+            </w:pPr>
+            <w:r>
+              <w:rPr>
+                <w:sz w:val="16"/>
+              </w:rPr>
+              <w:t xml:space="preserve">—</w:t>
+            </w:r>
+          </w:p>
+        </w:tc>
+      </w:tr>
+      <w:tr>
+        <w:trPr>
+          <w:cantSplit/>
+        </w:trPr>
+        <w:tc>
+          <w:tcPr>
+            <w:tcW w:type="dxa" w:w="1247"/>
+          </w:tcPr>
+          <w:p>
+            <w:pPr>
+              <w:keepNext/>
+              <w:spacing w:before="20" w:after="20"/>
+            </w:pPr>
+            <w:r>
+              <w:rPr>
+                <w:sz w:val="16"/>
+              </w:rPr>
+              <w:t xml:space="preserve">GX010718</w:t>
+            </w:r>
+          </w:p>
+        </w:tc>
+        <w:tc>
+          <w:tcPr>
+            <w:tcW w:type="dxa" w:w="567"/>
+          </w:tcPr>
+          <w:p>
+            <w:pPr>
+              <w:keepNext/>
+              <w:spacing w:before="20" w:after="20"/>
+            </w:pPr>
+            <w:r>
+              <w:rPr>
+                <w:sz w:val="16"/>
+              </w:rPr>
+              <w:t xml:space="preserve">P5</w:t>
+            </w:r>
+          </w:p>
+        </w:tc>
+        <w:tc>
+          <w:tcPr>
+            <w:tcW w:type="dxa" w:w="964"/>
+          </w:tcPr>
+          <w:p>
+            <w:pPr>
+              <w:keepNext/>
+              <w:spacing w:before="20" w:after="20"/>
+            </w:pPr>
+            <w:r>
+              <w:rPr>
+                <w:sz w:val="16"/>
+              </w:rPr>
+              <w:t xml:space="preserve">Crol</w:t>
+            </w:r>
+          </w:p>
+        </w:tc>
+        <w:tc>
+          <w:tcPr>
+            <w:tcW w:type="dxa" w:w="907"/>
+          </w:tcPr>
+          <w:p>
+            <w:pPr>
+              <w:keepNext/>
+              <w:spacing w:before="20" w:after="20"/>
+            </w:pPr>
+            <w:r>
+              <w:rPr>
+                <w:sz w:val="16"/>
+              </w:rPr>
+              <w:t xml:space="preserve">Lateral</w:t>
+            </w:r>
+          </w:p>
+        </w:tc>
+        <w:tc>
+          <w:tcPr>
+            <w:tcW w:type="dxa" w:w="964"/>
+          </w:tcPr>
+          <w:p>
+            <w:pPr>
+              <w:keepNext/>
+              <w:spacing w:before="20" w:after="20"/>
+            </w:pPr>
+            <w:r>
+              <w:rPr>
+                <w:sz w:val="16"/>
+              </w:rPr>
+              <w:t xml:space="preserve">20,7 s</w:t>
+            </w:r>
+          </w:p>
+        </w:tc>
+        <w:tc>
+          <w:tcPr>
+            <w:tcW w:type="dxa" w:w="1020"/>
+          </w:tcPr>
+          <w:p>
+            <w:pPr>
+              <w:keepNext/>
+              <w:spacing w:before="20" w:after="20"/>
+            </w:pPr>
+            <w:r>
+              <w:rPr>
+                <w:sz w:val="16"/>
+              </w:rPr>
+              <w:t xml:space="preserve">11,5 s</w:t>
+            </w:r>
+          </w:p>
+        </w:tc>
+        <w:tc>
+          <w:tcPr>
+            <w:tcW w:type="dxa" w:w="737"/>
+          </w:tcPr>
+          <w:p>
+            <w:pPr>
+              <w:keepNext/>
+              <w:spacing w:before="20" w:after="20"/>
+            </w:pPr>
+            <w:r>
+              <w:rPr>
+                <w:sz w:val="16"/>
+              </w:rPr>
+              <w:t xml:space="preserve">5</w:t>
+            </w:r>
+          </w:p>
+        </w:tc>
+        <w:tc>
+          <w:tcPr>
+            <w:tcW w:type="dxa" w:w="1304"/>
+          </w:tcPr>
+          <w:p>
+            <w:pPr>
+              <w:keepNext/>
+              <w:spacing w:before="20" w:after="20"/>
+            </w:pPr>
+            <w:r>
+              <w:rPr>
+                <w:sz w:val="16"/>
+              </w:rPr>
+              <w:t xml:space="preserve">52,0</w:t>
+            </w:r>
+          </w:p>
+        </w:tc>
+        <w:tc>
+          <w:tcPr>
+            <w:tcW w:type="dxa" w:w="1361"/>
+          </w:tcPr>
+          <w:p>
+            <w:pPr>
+              <w:keepNext/>
+              <w:spacing w:before="20" w:after="20"/>
+            </w:pPr>
+            <w:r>
+              <w:rPr>
+                <w:sz w:val="16"/>
+              </w:rPr>
+              <w:t xml:space="preserve">crol</w:t>
+            </w:r>
+          </w:p>
+        </w:tc>
+      </w:tr>
+      <w:tr>
+        <w:trPr>
+          <w:cantSplit/>
+        </w:trPr>
+        <w:tc>
+          <w:tcPr>
+            <w:tcW w:type="dxa" w:w="1247"/>
+          </w:tcPr>
+          <w:p>
+            <w:pPr>
+              <w:keepNext/>
+              <w:spacing w:before="20" w:after="20"/>
+            </w:pPr>
+            <w:r>
+              <w:rPr>
+                <w:sz w:val="16"/>
+              </w:rPr>
+              <w:t xml:space="preserve">GX010719</w:t>
+            </w:r>
+          </w:p>
+        </w:tc>
+        <w:tc>
+          <w:tcPr>
+            <w:tcW w:type="dxa" w:w="567"/>
+          </w:tcPr>
+          <w:p>
+            <w:pPr>
+              <w:keepNext/>
+              <w:spacing w:before="20" w:after="20"/>
+            </w:pPr>
+            <w:r>
+              <w:rPr>
+                <w:sz w:val="16"/>
+              </w:rPr>
+              <w:t xml:space="preserve">P5</w:t>
+            </w:r>
+          </w:p>
+        </w:tc>
+        <w:tc>
+          <w:tcPr>
+            <w:tcW w:type="dxa" w:w="964"/>
+          </w:tcPr>
+          <w:p>
+            <w:pPr>
+              <w:keepNext/>
+              <w:spacing w:before="20" w:after="20"/>
+            </w:pPr>
+            <w:r>
+              <w:rPr>
+                <w:sz w:val="16"/>
+              </w:rPr>
+              <w:t xml:space="preserve">Crol</w:t>
+            </w:r>
+          </w:p>
+        </w:tc>
+        <w:tc>
+          <w:tcPr>
+            <w:tcW w:type="dxa" w:w="907"/>
+          </w:tcPr>
+          <w:p>
+            <w:pPr>
+              <w:keepNext/>
+              <w:spacing w:before="20" w:after="20"/>
+            </w:pPr>
+            <w:r>
+              <w:rPr>
+                <w:sz w:val="16"/>
+              </w:rPr>
+              <w:t xml:space="preserve">Lateral</w:t>
+            </w:r>
+          </w:p>
+        </w:tc>
+        <w:tc>
+          <w:tcPr>
+            <w:tcW w:type="dxa" w:w="964"/>
+          </w:tcPr>
+          <w:p>
+            <w:pPr>
+              <w:keepNext/>
+              <w:spacing w:before="20" w:after="20"/>
+            </w:pPr>
+            <w:r>
+              <w:rPr>
+                <w:sz w:val="16"/>
+              </w:rPr>
+              <w:t xml:space="preserve">16,9 s</w:t>
+            </w:r>
+          </w:p>
+        </w:tc>
+        <w:tc>
+          <w:tcPr>
+            <w:tcW w:type="dxa" w:w="1020"/>
+          </w:tcPr>
+          <w:p>
+            <w:pPr>
+              <w:keepNext/>
+              <w:spacing w:before="20" w:after="20"/>
+            </w:pPr>
+            <w:r>
+              <w:rPr>
+                <w:sz w:val="16"/>
+              </w:rPr>
+              <w:t xml:space="preserve">14,8 s</w:t>
+            </w:r>
+          </w:p>
+        </w:tc>
+        <w:tc>
+          <w:tcPr>
+            <w:tcW w:type="dxa" w:w="737"/>
+          </w:tcPr>
+          <w:p>
+            <w:pPr>
+              <w:keepNext/>
+              <w:spacing w:before="20" w:after="20"/>
+            </w:pPr>
+            <w:r>
+              <w:rPr>
+                <w:sz w:val="16"/>
+              </w:rPr>
+              <w:t xml:space="preserve">11</w:t>
+            </w:r>
+          </w:p>
+        </w:tc>
+        <w:tc>
+          <w:tcPr>
+            <w:tcW w:type="dxa" w:w="1304"/>
+          </w:tcPr>
+          <w:p>
+            <w:pPr>
+              <w:keepNext/>
+              <w:spacing w:before="20" w:after="20"/>
+            </w:pPr>
+            <w:r>
+              <w:rPr>
+                <w:sz w:val="16"/>
+              </w:rPr>
+              <w:t xml:space="preserve">58,4</w:t>
+            </w:r>
+          </w:p>
+        </w:tc>
+        <w:tc>
+          <w:tcPr>
+            <w:tcW w:type="dxa" w:w="1361"/>
+          </w:tcPr>
+          <w:p>
+            <w:pPr>
+              <w:keepNext/>
+              <w:spacing w:before="20" w:after="20"/>
+            </w:pPr>
+            <w:r>
+              <w:rPr>
+                <w:sz w:val="16"/>
+              </w:rPr>
+              <w:t xml:space="preserve">braza</w:t>
+            </w:r>
+          </w:p>
+        </w:tc>
+      </w:tr>
+      <w:tr>
+        <w:trPr>
+          <w:cantSplit/>
+        </w:trPr>
+        <w:tc>
+          <w:tcPr>
+            <w:tcW w:type="dxa" w:w="1247"/>
+          </w:tcPr>
+          <w:p>
+            <w:pPr>
+              <w:keepNext/>
+              <w:spacing w:before="20" w:after="20"/>
+            </w:pPr>
+            <w:r>
+              <w:rPr>
+                <w:sz w:val="16"/>
+              </w:rPr>
+              <w:t xml:space="preserve">GX010731</w:t>
+            </w:r>
+          </w:p>
+        </w:tc>
+        <w:tc>
+          <w:tcPr>
+            <w:tcW w:type="dxa" w:w="567"/>
+          </w:tcPr>
+          <w:p>
+            <w:pPr>
+              <w:keepNext/>
+              <w:spacing w:before="20" w:after="20"/>
+            </w:pPr>
+            <w:r>
+              <w:rPr>
+                <w:sz w:val="16"/>
+              </w:rPr>
+              <w:t xml:space="preserve">P5</w:t>
+            </w:r>
+          </w:p>
+        </w:tc>
+        <w:tc>
+          <w:tcPr>
+            <w:tcW w:type="dxa" w:w="964"/>
+          </w:tcPr>
+          <w:p>
+            <w:pPr>
+              <w:keepNext/>
+              <w:spacing w:before="20" w:after="20"/>
+            </w:pPr>
+            <w:r>
+              <w:rPr>
+                <w:sz w:val="16"/>
+              </w:rPr>
+              <w:t xml:space="preserve">Crol</w:t>
+            </w:r>
+          </w:p>
+        </w:tc>
+        <w:tc>
+          <w:tcPr>
+            <w:tcW w:type="dxa" w:w="907"/>
+          </w:tcPr>
+          <w:p>
+            <w:pPr>
+              <w:keepNext/>
+              <w:spacing w:before="20" w:after="20"/>
+            </w:pPr>
+            <w:r>
+              <w:rPr>
+                <w:sz w:val="16"/>
+              </w:rPr>
+              <w:t xml:space="preserve">Lateral</w:t>
+            </w:r>
+          </w:p>
+        </w:tc>
+        <w:tc>
+          <w:tcPr>
+            <w:tcW w:type="dxa" w:w="964"/>
+          </w:tcPr>
+          <w:p>
+            <w:pPr>
+              <w:keepNext/>
+              <w:spacing w:before="20" w:after="20"/>
+            </w:pPr>
+            <w:r>
+              <w:rPr>
+                <w:sz w:val="16"/>
+              </w:rPr>
+              <w:t xml:space="preserve">2068,2 s</w:t>
+            </w:r>
+          </w:p>
+        </w:tc>
+        <w:tc>
+          <w:tcPr>
+            <w:tcW w:type="dxa" w:w="1020"/>
+          </w:tcPr>
+          <w:p>
+            <w:pPr>
+              <w:keepNext/>
+              <w:spacing w:before="20" w:after="20"/>
+            </w:pPr>
+            <w:r>
+              <w:rPr>
+                <w:sz w:val="16"/>
+              </w:rPr>
+              <w:t xml:space="preserve">130,3 s</w:t>
+            </w:r>
+          </w:p>
+        </w:tc>
+        <w:tc>
+          <w:tcPr>
+            <w:tcW w:type="dxa" w:w="737"/>
+          </w:tcPr>
+          <w:p>
+            <w:pPr>
+              <w:keepNext/>
+              <w:spacing w:before="20" w:after="20"/>
+            </w:pPr>
+            <w:r>
+              <w:rPr>
+                <w:sz w:val="16"/>
+              </w:rPr>
+              <w:t xml:space="preserve">19</w:t>
+            </w:r>
+          </w:p>
+        </w:tc>
+        <w:tc>
+          <w:tcPr>
+            <w:tcW w:type="dxa" w:w="1304"/>
+          </w:tcPr>
+          <w:p>
+            <w:pPr>
+              <w:keepNext/>
+              <w:spacing w:before="20" w:after="20"/>
+            </w:pPr>
+            <w:r>
+              <w:rPr>
+                <w:sz w:val="16"/>
+              </w:rPr>
+              <w:t xml:space="preserve">51,6</w:t>
+            </w:r>
+          </w:p>
+        </w:tc>
+        <w:tc>
+          <w:tcPr>
+            <w:tcW w:type="dxa" w:w="1361"/>
+          </w:tcPr>
+          <w:p>
+            <w:pPr>
+              <w:keepNext/>
+              <w:spacing w:before="20" w:after="20"/>
+            </w:pPr>
+            <w:r>
+              <w:rPr>
+                <w:sz w:val="16"/>
+              </w:rPr>
+              <w:t xml:space="preserve">mariposa</w:t>
+            </w:r>
+          </w:p>
+        </w:tc>
+      </w:tr>
+      <w:tr>
+        <w:trPr>
+          <w:cantSplit/>
+        </w:trPr>
+        <w:tc>
+          <w:tcPr>
+            <w:tcW w:type="dxa" w:w="1247"/>
+          </w:tcPr>
+          <w:p>
+            <w:pPr>
+              <w:keepNext/>
+              <w:spacing w:before="20" w:after="20"/>
+            </w:pPr>
+            <w:r>
+              <w:rPr>
+                <w:sz w:val="16"/>
+              </w:rPr>
+              <w:t xml:space="preserve">GX011613</w:t>
+            </w:r>
+          </w:p>
+        </w:tc>
+        <w:tc>
+          <w:tcPr>
+            <w:tcW w:type="dxa" w:w="567"/>
+          </w:tcPr>
+          <w:p>
+            <w:pPr>
+              <w:keepNext/>
+              <w:spacing w:before="20" w:after="20"/>
+            </w:pPr>
+            <w:r>
+              <w:rPr>
+                <w:sz w:val="16"/>
+              </w:rPr>
+              <w:t xml:space="preserve">P5</w:t>
+            </w:r>
+          </w:p>
+        </w:tc>
+        <w:tc>
+          <w:tcPr>
+            <w:tcW w:type="dxa" w:w="964"/>
+          </w:tcPr>
+          <w:p>
+            <w:pPr>
+              <w:keepNext/>
+              <w:spacing w:before="20" w:after="20"/>
+            </w:pPr>
+            <w:r>
+              <w:rPr>
+                <w:sz w:val="16"/>
+              </w:rPr>
+              <w:t xml:space="preserve">Crol</w:t>
+            </w:r>
+          </w:p>
+        </w:tc>
+        <w:tc>
+          <w:tcPr>
+            <w:tcW w:type="dxa" w:w="907"/>
+          </w:tcPr>
+          <w:p>
+            <w:pPr>
+              <w:keepNext/>
+              <w:spacing w:before="20" w:after="20"/>
+            </w:pPr>
+            <w:r>
+              <w:rPr>
+                <w:sz w:val="16"/>
+              </w:rPr>
+              <w:t xml:space="preserve">Lateral</w:t>
+            </w:r>
+          </w:p>
+        </w:tc>
+        <w:tc>
+          <w:tcPr>
+            <w:tcW w:type="dxa" w:w="964"/>
+          </w:tcPr>
+          <w:p>
+            <w:pPr>
+              <w:keepNext/>
+              <w:spacing w:before="20" w:after="20"/>
+            </w:pPr>
+            <w:r>
+              <w:rPr>
+                <w:sz w:val="16"/>
+              </w:rPr>
+              <w:t xml:space="preserve">28,2 s</w:t>
+            </w:r>
+          </w:p>
+        </w:tc>
+        <w:tc>
+          <w:tcPr>
+            <w:tcW w:type="dxa" w:w="1020"/>
+          </w:tcPr>
+          <w:p>
+            <w:pPr>
+              <w:keepNext/>
+              <w:spacing w:before="20" w:after="20"/>
+            </w:pPr>
+            <w:r>
+              <w:rPr>
+                <w:sz w:val="16"/>
+              </w:rPr>
+              <w:t xml:space="preserve">2,3 s</w:t>
+            </w:r>
+          </w:p>
+        </w:tc>
+        <w:tc>
+          <w:tcPr>
+            <w:tcW w:type="dxa" w:w="737"/>
+          </w:tcPr>
+          <w:p>
+            <w:pPr>
+              <w:keepNext/>
+              <w:spacing w:before="20" w:after="20"/>
+            </w:pPr>
+            <w:r>
+              <w:rPr>
+                <w:sz w:val="16"/>
+              </w:rPr>
+              <w:t xml:space="preserve">0</w:t>
+            </w:r>
+          </w:p>
+        </w:tc>
+        <w:tc>
+          <w:tcPr>
+            <w:tcW w:type="dxa" w:w="1304"/>
+          </w:tcPr>
+          <w:p>
+            <w:pPr>
+              <w:keepNext/>
+              <w:spacing w:before="20" w:after="20"/>
+            </w:pPr>
+            <w:r>
+              <w:rPr>
+                <w:sz w:val="16"/>
+              </w:rPr>
+              <w:t xml:space="preserve">—</w:t>
+            </w:r>
+          </w:p>
+        </w:tc>
+        <w:tc>
+          <w:tcPr>
+            <w:tcW w:type="dxa" w:w="1361"/>
+          </w:tcPr>
+          <w:p>
+            <w:pPr>
+              <w:keepNext/>
+              <w:spacing w:before="20" w:after="20"/>
+            </w:pPr>
+            <w:r>
+              <w:rPr>
+                <w:sz w:val="16"/>
+              </w:rPr>
+              <w:t xml:space="preserve">—</w:t>
+            </w:r>
+          </w:p>
+        </w:tc>
+      </w:tr>
+      <w:tr>
+        <w:trPr>
+          <w:cantSplit/>
+        </w:trPr>
+        <w:tc>
+          <w:tcPr>
+            <w:tcW w:type="dxa" w:w="1247"/>
+          </w:tcPr>
+          <w:p>
+            <w:pPr>
+              <w:keepNext/>
+              <w:spacing w:before="20" w:after="20"/>
+            </w:pPr>
+            <w:r>
+              <w:rPr>
+                <w:sz w:val="16"/>
+              </w:rPr>
+              <w:t xml:space="preserve">GX011615</w:t>
+            </w:r>
+          </w:p>
+        </w:tc>
+        <w:tc>
+          <w:tcPr>
+            <w:tcW w:type="dxa" w:w="567"/>
+          </w:tcPr>
+          <w:p>
+            <w:pPr>
+              <w:keepNext/>
+              <w:spacing w:before="20" w:after="20"/>
+            </w:pPr>
+            <w:r>
+              <w:rPr>
+                <w:sz w:val="16"/>
+              </w:rPr>
+              <w:t xml:space="preserve">P5</w:t>
+            </w:r>
+          </w:p>
+        </w:tc>
+        <w:tc>
+          <w:tcPr>
+            <w:tcW w:type="dxa" w:w="964"/>
+          </w:tcPr>
+          <w:p>
+            <w:pPr>
+              <w:keepNext/>
+              <w:spacing w:before="20" w:after="20"/>
+            </w:pPr>
+            <w:r>
+              <w:rPr>
+                <w:sz w:val="16"/>
+              </w:rPr>
+              <w:t xml:space="preserve">Crol</w:t>
+            </w:r>
+          </w:p>
+        </w:tc>
+        <w:tc>
+          <w:tcPr>
+            <w:tcW w:type="dxa" w:w="907"/>
+          </w:tcPr>
+          <w:p>
+            <w:pPr>
+              <w:keepNext/>
+              <w:spacing w:before="20" w:after="20"/>
+            </w:pPr>
+            <w:r>
+              <w:rPr>
+                <w:sz w:val="16"/>
+              </w:rPr>
+              <w:t xml:space="preserve">Lateral</w:t>
+            </w:r>
+          </w:p>
+        </w:tc>
+        <w:tc>
+          <w:tcPr>
+            <w:tcW w:type="dxa" w:w="964"/>
+          </w:tcPr>
+          <w:p>
+            <w:pPr>
+              <w:keepNext/>
+              <w:spacing w:before="20" w:after="20"/>
+            </w:pPr>
+            <w:r>
+              <w:rPr>
+                <w:sz w:val="16"/>
+              </w:rPr>
+              <w:t xml:space="preserve">33,9 s</w:t>
+            </w:r>
+          </w:p>
+        </w:tc>
+        <w:tc>
+          <w:tcPr>
+            <w:tcW w:type="dxa" w:w="1020"/>
+          </w:tcPr>
+          <w:p>
+            <w:pPr>
+              <w:keepNext/>
+              <w:spacing w:before="20" w:after="20"/>
+            </w:pPr>
+            <w:r>
+              <w:rPr>
+                <w:sz w:val="16"/>
+              </w:rPr>
+              <w:t xml:space="preserve">20,4 s</w:t>
+            </w:r>
+          </w:p>
+        </w:tc>
+        <w:tc>
+          <w:tcPr>
+            <w:tcW w:type="dxa" w:w="737"/>
+          </w:tcPr>
+          <w:p>
+            <w:pPr>
+              <w:keepNext/>
+              <w:spacing w:before="20" w:after="20"/>
+            </w:pPr>
+            <w:r>
+              <w:rPr>
+                <w:sz w:val="16"/>
+              </w:rPr>
+              <w:t xml:space="preserve">11</w:t>
+            </w:r>
+          </w:p>
+        </w:tc>
+        <w:tc>
+          <w:tcPr>
+            <w:tcW w:type="dxa" w:w="1304"/>
+          </w:tcPr>
+          <w:p>
+            <w:pPr>
+              <w:keepNext/>
+              <w:spacing w:before="20" w:after="20"/>
+            </w:pPr>
+            <w:r>
+              <w:rPr>
+                <w:sz w:val="16"/>
+              </w:rPr>
+              <w:t xml:space="preserve">39,7</w:t>
+            </w:r>
+          </w:p>
+        </w:tc>
+        <w:tc>
+          <w:tcPr>
+            <w:tcW w:type="dxa" w:w="1361"/>
+          </w:tcPr>
+          <w:p>
+            <w:pPr>
+              <w:keepNext/>
+              <w:spacing w:before="20" w:after="20"/>
+            </w:pPr>
+            <w:r>
+              <w:rPr>
+                <w:sz w:val="16"/>
+              </w:rPr>
+              <w:t xml:space="preserve">crol</w:t>
+            </w:r>
+          </w:p>
+        </w:tc>
+      </w:tr>
+      <w:tr>
+        <w:trPr>
+          <w:cantSplit/>
+        </w:trPr>
+        <w:tc>
+          <w:tcPr>
+            <w:tcW w:type="dxa" w:w="1247"/>
+          </w:tcPr>
+          <w:p>
+            <w:pPr>
+              <w:keepNext/>
+              <w:spacing w:before="20" w:after="20"/>
+            </w:pPr>
+            <w:r>
+              <w:rPr>
+                <w:sz w:val="16"/>
+              </w:rPr>
+              <w:t xml:space="preserve">IMG_7214</w:t>
+            </w:r>
+          </w:p>
+        </w:tc>
+        <w:tc>
+          <w:tcPr>
+            <w:tcW w:type="dxa" w:w="567"/>
+          </w:tcPr>
+          <w:p>
+            <w:pPr>
+              <w:keepNext/>
+              <w:spacing w:before="20" w:after="20"/>
+            </w:pPr>
+            <w:r>
+              <w:rPr>
+                <w:sz w:val="16"/>
+              </w:rPr>
+              <w:t xml:space="preserve">P5</w:t>
+            </w:r>
+          </w:p>
+        </w:tc>
+        <w:tc>
+          <w:tcPr>
+            <w:tcW w:type="dxa" w:w="964"/>
+          </w:tcPr>
+          <w:p>
+            <w:pPr>
+              <w:keepNext/>
+              <w:spacing w:before="20" w:after="20"/>
+            </w:pPr>
+            <w:r>
+              <w:rPr>
+                <w:sz w:val="16"/>
+              </w:rPr>
+              <w:t xml:space="preserve">Crol</w:t>
+            </w:r>
+          </w:p>
+        </w:tc>
+        <w:tc>
+          <w:tcPr>
+            <w:tcW w:type="dxa" w:w="907"/>
+          </w:tcPr>
+          <w:p>
+            <w:pPr>
+              <w:keepNext/>
+              <w:spacing w:before="20" w:after="20"/>
+            </w:pPr>
+            <w:r>
+              <w:rPr>
+                <w:sz w:val="16"/>
+              </w:rPr>
+              <w:t xml:space="preserve">Frontal</w:t>
+            </w:r>
+          </w:p>
+        </w:tc>
+        <w:tc>
+          <w:tcPr>
+            <w:tcW w:type="dxa" w:w="964"/>
+          </w:tcPr>
+          <w:p>
+            <w:pPr>
+              <w:keepNext/>
+              <w:spacing w:before="20" w:after="20"/>
+            </w:pPr>
+            <w:r>
+              <w:rPr>
+                <w:sz w:val="16"/>
+              </w:rPr>
+              <w:t xml:space="preserve">65,3 s</w:t>
+            </w:r>
+          </w:p>
+        </w:tc>
+        <w:tc>
+          <w:tcPr>
+            <w:tcW w:type="dxa" w:w="1020"/>
+          </w:tcPr>
+          <w:p>
+            <w:pPr>
+              <w:keepNext/>
+              <w:spacing w:before="20" w:after="20"/>
+            </w:pPr>
+            <w:r>
+              <w:rPr>
+                <w:sz w:val="16"/>
+              </w:rPr>
+              <w:t xml:space="preserve">48,3 s</w:t>
+            </w:r>
+          </w:p>
+        </w:tc>
+        <w:tc>
+          <w:tcPr>
+            <w:tcW w:type="dxa" w:w="737"/>
+          </w:tcPr>
+          <w:p>
+            <w:pPr>
+              <w:keepNext/>
+              <w:spacing w:before="20" w:after="20"/>
+            </w:pPr>
+            <w:r>
+              <w:rPr>
+                <w:sz w:val="16"/>
+              </w:rPr>
+              <w:t xml:space="preserve">16</w:t>
+            </w:r>
+          </w:p>
+        </w:tc>
+        <w:tc>
+          <w:tcPr>
+            <w:tcW w:type="dxa" w:w="1304"/>
+          </w:tcPr>
+          <w:p>
+            <w:pPr>
+              <w:keepNext/>
+              <w:spacing w:before="20" w:after="20"/>
+            </w:pPr>
+            <w:r>
+              <w:rPr>
+                <w:sz w:val="16"/>
+              </w:rPr>
+              <w:t xml:space="preserve">47,2</w:t>
+            </w:r>
+          </w:p>
+        </w:tc>
+        <w:tc>
+          <w:tcPr>
+            <w:tcW w:type="dxa" w:w="1361"/>
+          </w:tcPr>
+          <w:p>
+            <w:pPr>
+              <w:keepNext/>
+              <w:spacing w:before="20" w:after="20"/>
+            </w:pPr>
+            <w:r>
+              <w:rPr>
+                <w:sz w:val="16"/>
+              </w:rPr>
+              <w:t xml:space="preserve">(simultáneos)</w:t>
+            </w:r>
+          </w:p>
+        </w:tc>
+      </w:tr>
+      <w:tr>
+        <w:trPr>
+          <w:cantSplit/>
+        </w:trPr>
+        <w:tc>
+          <w:tcPr>
+            <w:tcW w:type="dxa" w:w="1247"/>
+          </w:tcPr>
+          <w:p>
+            <w:pPr>
               <w:keepNext w:val="0"/>
               <w:spacing w:before="20" w:after="20"/>
             </w:pPr>
@@ -29751,7 +31791,7 @@
               <w:rPr>
                 <w:sz w:val="16"/>
               </w:rPr>
-              <w:t xml:space="preserve">IMG_7217</w:t>
+              <w:t xml:space="preserve">IMG_7216</w:t>
             </w:r>
           </w:p>
         </w:tc>
@@ -29768,7 +31808,7 @@
               <w:rPr>
                 <w:sz w:val="16"/>
               </w:rPr>
-              <w:t xml:space="preserve">P4</w:t>
+              <w:t xml:space="preserve">P5</w:t>
             </w:r>
           </w:p>
         </w:tc>
@@ -29785,7 +31825,7 @@
               <w:rPr>
                 <w:sz w:val="16"/>
               </w:rPr>
-              <w:t xml:space="preserve">Braza</w:t>
+              <w:t xml:space="preserve">Crol</w:t>
             </w:r>
           </w:p>
         </w:tc>
@@ -29802,7 +31842,7 @@
               <w:rPr>
                 <w:sz w:val="16"/>
               </w:rPr>
-              <w:t xml:space="preserve">Frontal</w:t>
+              <w:t xml:space="preserve">Lateral</w:t>
             </w:r>
           </w:p>
         </w:tc>
@@ -29819,7 +31859,7 @@
               <w:rPr>
                 <w:sz w:val="16"/>
               </w:rPr>
-              <w:t xml:space="preserve">7,3 s</w:t>
+              <w:t xml:space="preserve">40,3 s</w:t>
             </w:r>
           </w:p>
         </w:tc>
@@ -29836,7 +31876,7 @@
               <w:rPr>
                 <w:sz w:val="16"/>
               </w:rPr>
-              <w:t xml:space="preserve">5,1 s</w:t>
+              <w:t xml:space="preserve">18,8 s</w:t>
             </w:r>
           </w:p>
         </w:tc>
@@ -29853,7 +31893,7 @@
               <w:rPr>
                 <w:sz w:val="16"/>
               </w:rPr>
-              <w:t xml:space="preserve">2</w:t>
+              <w:t xml:space="preserve">8</w:t>
             </w:r>
           </w:p>
         </w:tc>
@@ -29870,7 +31910,7 @@
               <w:rPr>
                 <w:sz w:val="16"/>
               </w:rPr>
-              <w:t xml:space="preserve">39,7</w:t>
+              <w:t xml:space="preserve">41,4</w:t>
             </w:r>
           </w:p>
         </w:tc>
@@ -29887,7 +31927,7 @@
               <w:rPr>
                 <w:sz w:val="16"/>
               </w:rPr>
-              <w:t xml:space="preserve">(simultáneos)</w:t>
+              <w:t xml:space="preserve">crol</w:t>
             </w:r>
           </w:p>
         </w:tc>

</xml_diff>

<commit_message>
Memoria: el resultado de la secuencia larga se presenta como cambio técnico compatible con la fatiga
Co-Authored-By: Claude Opus 5.5 <noreply@anthropic.com>
Claude-Session: https://claude.ai/code/session_01DiSvbFm8ugCvoNLrXeNJkq
</commit_message>
<xml_diff>
--- a/memoria/TFM_StrokeLab_borrador.docx
+++ b/memoria/TFM_StrokeLab_borrador.docx
@@ -613,7 +613,7 @@
         <w:t xml:space="preserve">StrokeLab</w:t>
       </w:r>
       <w:r>
-        <w:t xml:space="preserve">, un sistema de análisis biomecánico explicable que, a partir de vídeo monocular convencional, cuantifica la eficiencia de la técnica de nado, detecta el inicio de la fatiga técnica e identifica las variables que la explican. La arquitectura combina una vertical de visión por computador, que estima la pose humana en dos y tres dimensiones, con una vertical de datos tabulares que segmenta el nado en ciclos de brazada, calcula indicadores cinemáticos por ciclo y modela mediante aprendizaje no supervisado el patrón técnico de referencia de cada nadador. La desviación sostenida respecto a ese patrón define el inicio de la fatiga y su atribución a cada variable se obtiene con valores de Shapley. El sistema determina automáticamente la vista de la cámara y la familia del estilo, y ofrece un modo de análisis en tiempo real. Se aplicó a 25 secuencias reales de 5 participantes en 4 estilos (44,9 min grabados), de las que obtuvo 6,3 min analizables y 165 ciclos válidos. La frecuencia de ciclo estimada presenta un error relativo del 6,5 % al 8,2 % frente al conteo manual en vista lateral y frontal, y la familia del estilo se identifica en 15 de 19 secuencias. En una secuencia continua de 34 min, el sistema detecta el inicio de la fatiga técnica en t = 748,0 s y lo atribuye a variables concretas de la técnica. Con datos sintéticos de referencia conocida, el error mediano es del 4,7 % en la frecuencia de ciclo, del 1,3 % en la velocidad y del 4,3 % en la distancia por ciclo, y el detector de fatiga alcanza una tasa de detección del 100 % con un 10 % de falsas alarmas. La principal limitación es la escasez de datos reales anotados y la ausencia de una referencia fisiológica de la fatiga.</w:t>
+        <w:t xml:space="preserve">, un sistema de análisis biomecánico explicable que, a partir de vídeo monocular convencional, cuantifica la eficiencia de la técnica de nado, detecta el inicio de la fatiga técnica e identifica las variables que la explican. La arquitectura combina una vertical de visión por computador, que estima la pose humana en dos y tres dimensiones, con una vertical de datos tabulares que segmenta el nado en ciclos de brazada, calcula indicadores cinemáticos por ciclo y modela mediante aprendizaje no supervisado el patrón técnico de referencia de cada nadador. La desviación sostenida respecto a ese patrón define el inicio de la fatiga y su atribución a cada variable se obtiene con valores de Shapley. El sistema determina automáticamente la vista de la cámara y la familia del estilo, y ofrece un modo de análisis en tiempo real. Se aplicó a 25 secuencias reales de 5 participantes en 4 estilos (44,9 min grabados), de las que obtuvo 6,3 min analizables y 165 ciclos válidos. La frecuencia de ciclo estimada presenta un error relativo del 6,5 % al 8,2 % frente al conteo manual en vista lateral y frontal, y la familia del estilo se identifica en 15 de 19 secuencias. En una secuencia de entrenamiento de 34 min, el sistema detecta un cambio técnico sostenido compatible con la fatiga a partir de t = 748,0 s (aumento de la frecuencia de ciclo), aunque con pocos ciclos válidos y sin referencia fisiológica. Con datos sintéticos de referencia conocida, el error mediano es del 4,7 % en la frecuencia de ciclo, del 1,3 % en la velocidad y del 4,3 % en la distancia por ciclo, y el detector de fatiga alcanza una tasa de detección del 100 % con un 10 % de falsas alarmas. La principal limitación es la escasez de datos reales anotados y la ausencia de una referencia fisiológica de la fatiga.</w:t>
       </w:r>
     </w:p>
     <w:p>
@@ -667,7 +667,7 @@
         <w:t xml:space="preserve">StrokeLab</w:t>
       </w:r>
       <w:r>
-        <w:t xml:space="preserve">, an explainable biomechanical analysis system that, from conventional monocular video, quantifies swimming technique efficiency, detects the onset of technical fatigue and identifies the variables that explain it. The architecture combines a computer vision vertical, which estimates two- and three-dimensional human pose, with a tabular vertical that segments swimming into stroke cycles, computes per-cycle kinematic indicators and models each swimmer’s reference technique through unsupervised learning. A sustained deviation from that reference defines fatigue onset, and its attribution to each variable is obtained with Shapley values. The system determines the camera view and the stroke family automatically and offers a real-time analysis mode. It was applied to 25 real sequences of 5 participants in 4 strokes (44.9 min recorded), yielding 6.3 min of analysable video and 165 valid cycles. The estimated stroke rate shows a relative error of 6.5 % to 8.2 % against manual counts in side and front views, and the stroke family is identified in 15 of 19 sequences. On a continuous 34-min sequence, the system detects the onset of technical fatigue at t = 748.0 s and attributes it to specific technique variables. On synthetic data with known ground truth, the median error is 4.7 % for stroke rate, 1.3 % for velocity and 4.3 % for distance per stroke, and the fatigue detector reaches a 100 % detection rate with 10 % false alarms. The main limitation is the scarcity of annotated real data and the lack of a physiological fatigue reference.</w:t>
+        <w:t xml:space="preserve">, an explainable biomechanical analysis system that, from conventional monocular video, quantifies swimming technique efficiency, detects the onset of technical fatigue and identifies the variables that explain it. The architecture combines a computer vision vertical, which estimates two- and three-dimensional human pose, with a tabular vertical that segments swimming into stroke cycles, computes per-cycle kinematic indicators and models each swimmer’s reference technique through unsupervised learning. A sustained deviation from that reference defines fatigue onset, and its attribution to each variable is obtained with Shapley values. The system determines the camera view and the stroke family automatically and offers a real-time analysis mode. It was applied to 25 real sequences of 5 participants in 4 strokes (44.9 min recorded), yielding 6.3 min of analysable video and 165 valid cycles. The estimated stroke rate shows a relative error of 6.5 % to 8.2 % against manual counts in side and front views, and the stroke family is identified in 15 of 19 sequences. On a 34-min training sequence, the system detects a sustained technical change compatible with fatigue from t = 748.0 s (higher stroke rate), although with few valid cycles and no physiological reference. On synthetic data with known ground truth, the median error is 4.7 % for stroke rate, 1.3 % for velocity and 4.3 % for distance per stroke, and the fatigue detector reaches a 100 % detection rate with 10 % false alarms. The main limitation is the scarcity of annotated real data and the lack of a physiological fatigue reference.</w:t>
       </w:r>
     </w:p>
     <w:p>
@@ -20815,7 +20815,7 @@
         <w:rPr>
           <w:b/>
         </w:rPr>
-        <w:t xml:space="preserve">El sistema detecta el inicio de la fatiga técnica en el ciclo 7 (t = 748,0 s, 12,5 min)</w:t>
+        <w:t xml:space="preserve">El sistema detecta un cambio técnico sostenido, compatible con la fatiga, a partir del ciclo 7 (t = 748,0 s, 12,5 min)</w:t>
       </w:r>
       <w:r>
         <w:t xml:space="preserve">: a partir de ese ciclo la puntuación de anomalía respecto a la fase base del propio nadador supera el umbral de forma sostenida (Figura </w:t>
@@ -25297,7 +25297,7 @@
               <w:rPr>
                 <w:sz w:val="18"/>
               </w:rPr>
-              <w:t xml:space="preserve">Validado con datos sintéticos (detección 100 %, falsas alarmas 10 %) y en tiempo real (10/10, sin falsas alarmas); fatiga técnica detectada en la secuencia real de 34 min; sin referencia fisiológica</w:t>
+              <w:t xml:space="preserve">Validado con datos sintéticos (detección 100 %, falsas alarmas 10 %) y en tiempo real (10/10, sin falsas alarmas); cambio técnico sostenido detectado en la secuencia real de 34 min; sin referencia fisiológica</w:t>
             </w:r>
           </w:p>
         </w:tc>
@@ -25554,7 +25554,7 @@
         <w:jc w:val="both"/>
       </w:pPr>
       <w:r>
-        <w:t xml:space="preserve">Con datos sintéticos de referencia conocida, el sistema estima la frecuencia de ciclo, la velocidad y la distancia por ciclo con errores medianos inferiores al 5 %, detecta el inicio de la fatiga al comienzo de la transición programada, también en tiempo real, y atribuye la fatiga a las variables alteradas. Con vídeo real, la frecuencia de ciclo se aproxima al conteo manual con un error del 6,5 % al 8,2 %, la vista y la familia del estilo se determinan automáticamente, y el análisis de 25 secuencias de 5 participantes produjo 165 ciclos válidos y perfiles técnicos diferenciados por nadador. En la secuencia continua de 34 min, el sistema detectó el inicio de la fatiga técnica en t = 748,0 s y explicó sus causas. Las sesiones de pasadas cortas no presentaron fatiga, como cabía esperar por su duración.</w:t>
+        <w:t xml:space="preserve">Con datos sintéticos de referencia conocida, el sistema estima la frecuencia de ciclo, la velocidad y la distancia por ciclo con errores medianos inferiores al 5 %, detecta el inicio de la fatiga al comienzo de la transición programada, también en tiempo real, y atribuye la fatiga a las variables alteradas. Con vídeo real, la frecuencia de ciclo se aproxima al conteo manual con un error del 6,5 % al 8,2 %, la vista y la familia del estilo se determinan automáticamente, y el análisis de 25 secuencias de 5 participantes produjo 165 ciclos válidos y perfiles técnicos diferenciados por nadador. En la secuencia de 34 min, el sistema detectó un cambio técnico sostenido compatible con la fatiga a partir de t = 748,0 s y explicó sus causas, con la cautela de los pocos ciclos válidos. Las sesiones de pasadas cortas no presentaron fatiga, como cabía esperar por su duración.</w:t>
       </w:r>
     </w:p>
     <w:p>

</xml_diff>